<commit_message>
Add bilingual Markdown and Word output
</commit_message>
<xml_diff>
--- a/skill/daily-trade-radar/assets/radar-template.docx
+++ b/skill/daily-trade-radar/assets/radar-template.docx
@@ -4,48 +4,130 @@
   <w:body>
     <w:p>
       <w:pPr>
-        <w:spacing w:after="60"/>
-        <w:jc w:val="left"/>
-      </w:pPr>
-      <w:r>
-        <w:rPr>
-          <w:rFonts w:ascii="Calibri" w:hAnsi="Calibri" w:eastAsia="Microsoft YaHei"/>
-          <w:b w:val="0"/>
-          <w:color w:val="0B2545"/>
-          <w:sz w:val="52"/>
-        </w:rPr>
-        <w:t>今日外贸雷达</w:t>
-      </w:r>
-    </w:p>
-    <w:p>
-      <w:pPr>
-        <w:spacing w:after="160"/>
-      </w:pPr>
-      <w:r>
-        <w:rPr>
-          <w:rFonts w:ascii="Calibri" w:hAnsi="Calibri" w:eastAsia="Microsoft YaHei"/>
-          <w:color w:val="555555"/>
-          <w:sz w:val="20"/>
-        </w:rPr>
-        <w:t>2026-07-16｜基于 2026-07-13 首日基线去重；中文、官方来源、行动建议版</w:t>
-      </w:r>
-    </w:p>
-    <w:p>
-      <w:pPr>
-        <w:pStyle w:val="BodyText"/>
+        <w:spacing w:before="160" w:after="80"/>
       </w:pPr>
       <w:r>
         <w:rPr>
           <w:rFonts w:ascii="Calibri" w:hAnsi="Calibri" w:eastAsia="Microsoft YaHei"/>
           <w:b/>
+          <w:color w:val="1F4D78"/>
+          <w:sz w:val="48"/>
         </w:rPr>
-        <w:t>今日判断：</w:t>
+        <w:t>每日外贸雷达</w:t>
+      </w:r>
+    </w:p>
+    <w:p>
+      <w:pPr>
+        <w:spacing w:after="240"/>
+      </w:pPr>
+      <w:r>
+        <w:rPr>
+          <w:rFonts w:ascii="Calibri" w:hAnsi="Calibri" w:eastAsia="Microsoft YaHei"/>
+          <w:color w:val="596069"/>
+          <w:sz w:val="24"/>
+        </w:rPr>
+        <w:t>外贸政策与跨境平台行动简报</w:t>
+      </w:r>
+    </w:p>
+    <w:p>
+      <w:pPr>
+        <w:spacing w:after="40"/>
+      </w:pPr>
+      <w:r>
+        <w:rPr>
+          <w:rFonts w:ascii="Calibri" w:hAnsi="Calibri" w:eastAsia="Microsoft YaHei"/>
+          <w:b/>
+          <w:sz w:val="21"/>
+        </w:rPr>
+        <w:t xml:space="preserve">报告日期: </w:t>
       </w:r>
       <w:r>
         <w:rPr>
           <w:rFonts w:ascii="Calibri" w:hAnsi="Calibri" w:eastAsia="Microsoft YaHei"/>
+          <w:sz w:val="21"/>
         </w:rPr>
-        <w:t>没有新增需要账号登录才能确认的事项；本版保留两条临近执行的基线提醒，并新增/更新 5 条官方可核验的合规节点。优先处理“会立刻拦截出货或改写 listing”的事项。</w:t>
+        <w:t>2026-07-21</w:t>
+      </w:r>
+    </w:p>
+    <w:p>
+      <w:pPr>
+        <w:spacing w:after="40"/>
+      </w:pPr>
+      <w:r>
+        <w:rPr>
+          <w:rFonts w:ascii="Calibri" w:hAnsi="Calibri" w:eastAsia="Microsoft YaHei"/>
+          <w:b/>
+          <w:sz w:val="21"/>
+        </w:rPr>
+        <w:t xml:space="preserve">时区: </w:t>
+      </w:r>
+      <w:r>
+        <w:rPr>
+          <w:rFonts w:ascii="Calibri" w:hAnsi="Calibri" w:eastAsia="Microsoft YaHei"/>
+          <w:sz w:val="21"/>
+        </w:rPr>
+        <w:t>Asia/Singapore</w:t>
+      </w:r>
+    </w:p>
+    <w:p>
+      <w:pPr>
+        <w:spacing w:after="40"/>
+      </w:pPr>
+      <w:r>
+        <w:rPr>
+          <w:rFonts w:ascii="Calibri" w:hAnsi="Calibri" w:eastAsia="Microsoft YaHei"/>
+          <w:b/>
+          <w:sz w:val="21"/>
+        </w:rPr>
+        <w:t xml:space="preserve">检索截止: </w:t>
+      </w:r>
+      <w:r>
+        <w:rPr>
+          <w:rFonts w:ascii="Calibri" w:hAnsi="Calibri" w:eastAsia="Microsoft YaHei"/>
+          <w:sz w:val="21"/>
+        </w:rPr>
+        <w:t>2026-07-21T17:00:00+08:00</w:t>
+      </w:r>
+    </w:p>
+    <w:p>
+      <w:pPr>
+        <w:spacing w:after="40"/>
+      </w:pPr>
+      <w:r>
+        <w:rPr>
+          <w:rFonts w:ascii="Calibri" w:hAnsi="Calibri" w:eastAsia="Microsoft YaHei"/>
+          <w:b/>
+          <w:sz w:val="21"/>
+        </w:rPr>
+        <w:t xml:space="preserve">覆盖范围: </w:t>
+      </w:r>
+      <w:r>
+        <w:rPr>
+          <w:rFonts w:ascii="Calibri" w:hAnsi="Calibri" w:eastAsia="Microsoft YaHei"/>
+          <w:sz w:val="21"/>
+        </w:rPr>
+        <w:t>EU、Amazon</w:t>
+      </w:r>
+    </w:p>
+    <w:p>
+      <w:pPr>
+        <w:spacing w:before="140" w:after="160"/>
+        <w:pBdr>
+          <w:bottom w:val="single" w:sz="10" w:color="2E74B5"/>
+        </w:pBdr>
+      </w:pPr>
+    </w:p>
+    <w:p>
+      <w:pPr>
+        <w:pStyle w:val="Heading1"/>
+      </w:pPr>
+      <w:r>
+        <w:t>今日判断</w:t>
+      </w:r>
+    </w:p>
+    <w:p>
+      <w:r>
+        <w:t>发现经过核验的今日新增事项，请优先执行下列高风险和紧迫行动。</w:t>
       </w:r>
     </w:p>
     <w:p>
@@ -53,36 +135,39 @@
         <w:pStyle w:val="Heading1"/>
       </w:pPr>
       <w:r>
-        <w:t>一页总览</w:t>
+        <w:t>一页雷达</w:t>
       </w:r>
     </w:p>
     <w:tbl>
       <w:tblPr>
         <w:tblStyle w:val="TableGrid"/>
         <w:tblW w:type="dxa" w:w="9360"/>
+        <w:jc w:val="left"/>
+        <w:tblLayout w:type="fixed"/>
         <w:tblLook w:firstColumn="1" w:firstRow="1" w:lastColumn="0" w:lastRow="0" w:noHBand="0" w:noVBand="1" w:val="04A0"/>
         <w:tblInd w:w="120" w:type="dxa"/>
-        <w:tblLayout w:type="fixed"/>
       </w:tblPr>
       <w:tblGrid>
-        <w:gridCol w:w="760"/>
-        <w:gridCol w:w="2020"/>
-        <w:gridCol w:w="2560"/>
-        <w:gridCol w:w="2920"/>
-        <w:gridCol w:w="1100"/>
+        <w:gridCol w:w="900"/>
+        <w:gridCol w:w="1350"/>
+        <w:gridCol w:w="2700"/>
+        <w:gridCol w:w="4410"/>
       </w:tblGrid>
       <w:tr>
+        <w:trPr>
+          <w:tblHeader w:val="true"/>
+        </w:trPr>
         <w:tc>
           <w:tcPr>
-            <w:tcW w:type="dxa" w:w="760"/>
-            <w:shd w:fill="E8EEF5"/>
+            <w:tcW w:type="dxa" w:w="900"/>
+            <w:shd w:fill="2E74B5"/>
+            <w:vAlign w:val="center"/>
             <w:tcMar>
               <w:top w:w="80" w:type="dxa"/>
               <w:start w:w="120" w:type="dxa"/>
               <w:bottom w:w="80" w:type="dxa"/>
               <w:end w:w="120" w:type="dxa"/>
             </w:tcMar>
-            <w:vAlign w:val="center"/>
           </w:tcPr>
           <w:p>
             <w:pPr>
@@ -92,8 +177,8 @@
               <w:rPr>
                 <w:rFonts w:ascii="Calibri" w:hAnsi="Calibri" w:eastAsia="Microsoft YaHei"/>
                 <w:b/>
-                <w:color w:val="1F3A5F"/>
-                <w:sz w:val="18"/>
+                <w:color w:val="FFFFFF"/>
+                <w:sz w:val="19"/>
               </w:rPr>
               <w:t>级别</w:t>
             </w:r>
@@ -101,15 +186,15 @@
         </w:tc>
         <w:tc>
           <w:tcPr>
-            <w:tcW w:type="dxa" w:w="2020"/>
-            <w:shd w:fill="E8EEF5"/>
+            <w:tcW w:type="dxa" w:w="1350"/>
+            <w:shd w:fill="2E74B5"/>
+            <w:vAlign w:val="center"/>
             <w:tcMar>
               <w:top w:w="80" w:type="dxa"/>
               <w:start w:w="120" w:type="dxa"/>
               <w:bottom w:w="80" w:type="dxa"/>
               <w:end w:w="120" w:type="dxa"/>
             </w:tcMar>
-            <w:vAlign w:val="center"/>
           </w:tcPr>
           <w:p>
             <w:pPr>
@@ -119,24 +204,24 @@
               <w:rPr>
                 <w:rFonts w:ascii="Calibri" w:hAnsi="Calibri" w:eastAsia="Microsoft YaHei"/>
                 <w:b/>
-                <w:color w:val="1F3A5F"/>
-                <w:sz w:val="18"/>
+                <w:color w:val="FFFFFF"/>
+                <w:sz w:val="19"/>
               </w:rPr>
-              <w:t>事件</w:t>
+              <w:t>状态</w:t>
             </w:r>
           </w:p>
         </w:tc>
         <w:tc>
           <w:tcPr>
-            <w:tcW w:type="dxa" w:w="2560"/>
-            <w:shd w:fill="E8EEF5"/>
+            <w:tcW w:type="dxa" w:w="2700"/>
+            <w:shd w:fill="2E74B5"/>
+            <w:vAlign w:val="center"/>
             <w:tcMar>
               <w:top w:w="80" w:type="dxa"/>
               <w:start w:w="120" w:type="dxa"/>
               <w:bottom w:w="80" w:type="dxa"/>
               <w:end w:w="120" w:type="dxa"/>
             </w:tcMar>
-            <w:vAlign w:val="center"/>
           </w:tcPr>
           <w:p>
             <w:pPr>
@@ -146,24 +231,24 @@
               <w:rPr>
                 <w:rFonts w:ascii="Calibri" w:hAnsi="Calibri" w:eastAsia="Microsoft YaHei"/>
                 <w:b/>
-                <w:color w:val="1F3A5F"/>
-                <w:sz w:val="18"/>
+                <w:color w:val="FFFFFF"/>
+                <w:sz w:val="19"/>
               </w:rPr>
-              <w:t>影响</w:t>
+              <w:t>事件</w:t>
             </w:r>
           </w:p>
         </w:tc>
         <w:tc>
           <w:tcPr>
-            <w:tcW w:type="dxa" w:w="2920"/>
-            <w:shd w:fill="E8EEF5"/>
+            <w:tcW w:type="dxa" w:w="4410"/>
+            <w:shd w:fill="2E74B5"/>
+            <w:vAlign w:val="center"/>
             <w:tcMar>
               <w:top w:w="80" w:type="dxa"/>
               <w:start w:w="120" w:type="dxa"/>
               <w:bottom w:w="80" w:type="dxa"/>
               <w:end w:w="120" w:type="dxa"/>
             </w:tcMar>
-            <w:vAlign w:val="center"/>
           </w:tcPr>
           <w:p>
             <w:pPr>
@@ -173,37 +258,10 @@
               <w:rPr>
                 <w:rFonts w:ascii="Calibri" w:hAnsi="Calibri" w:eastAsia="Microsoft YaHei"/>
                 <w:b/>
-                <w:color w:val="1F3A5F"/>
-                <w:sz w:val="18"/>
+                <w:color w:val="FFFFFF"/>
+                <w:sz w:val="19"/>
               </w:rPr>
-              <w:t>今天动作</w:t>
-            </w:r>
-          </w:p>
-        </w:tc>
-        <w:tc>
-          <w:tcPr>
-            <w:tcW w:type="dxa" w:w="1100"/>
-            <w:shd w:fill="E8EEF5"/>
-            <w:tcMar>
-              <w:top w:w="80" w:type="dxa"/>
-              <w:start w:w="120" w:type="dxa"/>
-              <w:bottom w:w="80" w:type="dxa"/>
-              <w:end w:w="120" w:type="dxa"/>
-            </w:tcMar>
-            <w:vAlign w:val="center"/>
-          </w:tcPr>
-          <w:p>
-            <w:pPr>
-              <w:jc w:val="center"/>
-            </w:pPr>
-            <w:r>
-              <w:rPr>
-                <w:rFonts w:ascii="Calibri" w:hAnsi="Calibri" w:eastAsia="Microsoft YaHei"/>
-                <w:b/>
-                <w:color w:val="1F3A5F"/>
-                <w:sz w:val="18"/>
-              </w:rPr>
-              <w:t>来源</w:t>
+              <w:t>关键影响</w:t>
             </w:r>
           </w:p>
         </w:tc>
@@ -211,105 +269,15 @@
       <w:tr>
         <w:tc>
           <w:tcPr>
-            <w:tcW w:type="dxa" w:w="760"/>
+            <w:tcW w:type="dxa" w:w="900"/>
+            <w:vAlign w:val="center"/>
+            <w:shd w:fill="FDE8E7"/>
             <w:tcMar>
               <w:top w:w="80" w:type="dxa"/>
               <w:start w:w="120" w:type="dxa"/>
               <w:bottom w:w="80" w:type="dxa"/>
               <w:end w:w="120" w:type="dxa"/>
             </w:tcMar>
-            <w:vAlign w:val="center"/>
-          </w:tcPr>
-          <w:p>
-            <w:pPr>
-              <w:jc w:val="center"/>
-            </w:pPr>
-            <w:r>
-              <w:rPr>
-                <w:rFonts w:ascii="Calibri" w:hAnsi="Calibri" w:eastAsia="Microsoft YaHei"/>
-                <w:b/>
-                <w:sz w:val="17"/>
-              </w:rPr>
-              <w:t>高</w:t>
-            </w:r>
-          </w:p>
-        </w:tc>
-        <w:tc>
-          <w:tcPr>
-            <w:tcW w:type="dxa" w:w="2020"/>
-            <w:tcMar>
-              <w:top w:w="80" w:type="dxa"/>
-              <w:start w:w="120" w:type="dxa"/>
-              <w:bottom w:w="80" w:type="dxa"/>
-              <w:end w:w="120" w:type="dxa"/>
-            </w:tcMar>
-            <w:vAlign w:val="center"/>
-          </w:tcPr>
-          <w:p>
-            <w:r>
-              <w:rPr>
-                <w:rFonts w:ascii="Calibri" w:hAnsi="Calibri" w:eastAsia="Microsoft YaHei"/>
-                <w:b w:val="0"/>
-                <w:sz w:val="17"/>
-              </w:rPr>
-              <w:t>氦气出口临时禁止仍为硬性红线</w:t>
-            </w:r>
-          </w:p>
-        </w:tc>
-        <w:tc>
-          <w:tcPr>
-            <w:tcW w:type="dxa" w:w="2560"/>
-            <w:tcMar>
-              <w:top w:w="80" w:type="dxa"/>
-              <w:start w:w="120" w:type="dxa"/>
-              <w:bottom w:w="80" w:type="dxa"/>
-              <w:end w:w="120" w:type="dxa"/>
-            </w:tcMar>
-            <w:vAlign w:val="center"/>
-          </w:tcPr>
-          <w:p>
-            <w:r>
-              <w:rPr>
-                <w:rFonts w:ascii="Calibri" w:hAnsi="Calibri" w:eastAsia="Microsoft YaHei"/>
-                <w:b w:val="0"/>
-                <w:sz w:val="17"/>
-              </w:rPr>
-              <w:t>涉及海关商品编号 2804290010 的氦气出口订单、样品、转口安排均需暂停复核。</w:t>
-            </w:r>
-          </w:p>
-        </w:tc>
-        <w:tc>
-          <w:tcPr>
-            <w:tcW w:type="dxa" w:w="2920"/>
-            <w:tcMar>
-              <w:top w:w="80" w:type="dxa"/>
-              <w:start w:w="120" w:type="dxa"/>
-              <w:bottom w:w="80" w:type="dxa"/>
-              <w:end w:w="120" w:type="dxa"/>
-            </w:tcMar>
-            <w:vAlign w:val="center"/>
-          </w:tcPr>
-          <w:p>
-            <w:r>
-              <w:rPr>
-                <w:rFonts w:ascii="Calibri" w:hAnsi="Calibri" w:eastAsia="Microsoft YaHei"/>
-                <w:b w:val="0"/>
-                <w:sz w:val="16"/>
-              </w:rPr>
-              <w:t>今天继续拦截含氦气的询盘和已排船订单；销售、单证、报关三处同步加“禁止出口”提示。</w:t>
-            </w:r>
-          </w:p>
-        </w:tc>
-        <w:tc>
-          <w:tcPr>
-            <w:tcW w:type="dxa" w:w="1100"/>
-            <w:tcMar>
-              <w:top w:w="80" w:type="dxa"/>
-              <w:start w:w="120" w:type="dxa"/>
-              <w:bottom w:w="80" w:type="dxa"/>
-              <w:end w:w="120" w:type="dxa"/>
-            </w:tcMar>
-            <w:vAlign w:val="center"/>
           </w:tcPr>
           <w:p>
             <w:pPr>
@@ -319,34 +287,7 @@
               <w:rPr>
                 <w:rFonts w:ascii="Calibri" w:hAnsi="Calibri" w:eastAsia="Microsoft YaHei"/>
                 <w:b w:val="0"/>
-                <w:sz w:val="17"/>
-              </w:rPr>
-              <w:t>商务部、海关总署公告2026年第29号</w:t>
-            </w:r>
-          </w:p>
-        </w:tc>
-      </w:tr>
-      <w:tr>
-        <w:tc>
-          <w:tcPr>
-            <w:tcW w:type="dxa" w:w="760"/>
-            <w:tcMar>
-              <w:top w:w="80" w:type="dxa"/>
-              <w:start w:w="120" w:type="dxa"/>
-              <w:bottom w:w="80" w:type="dxa"/>
-              <w:end w:w="120" w:type="dxa"/>
-            </w:tcMar>
-            <w:vAlign w:val="center"/>
-          </w:tcPr>
-          <w:p>
-            <w:pPr>
-              <w:jc w:val="center"/>
-            </w:pPr>
-            <w:r>
-              <w:rPr>
-                <w:rFonts w:ascii="Calibri" w:hAnsi="Calibri" w:eastAsia="Microsoft YaHei"/>
-                <w:b/>
-                <w:sz w:val="17"/>
+                <w:sz w:val="18"/>
               </w:rPr>
               <w:t>高</w:t>
             </w:r>
@@ -354,80 +295,14 @@
         </w:tc>
         <w:tc>
           <w:tcPr>
-            <w:tcW w:type="dxa" w:w="2020"/>
+            <w:tcW w:type="dxa" w:w="1350"/>
+            <w:vAlign w:val="center"/>
             <w:tcMar>
               <w:top w:w="80" w:type="dxa"/>
               <w:start w:w="120" w:type="dxa"/>
               <w:bottom w:w="80" w:type="dxa"/>
               <w:end w:w="120" w:type="dxa"/>
             </w:tcMar>
-            <w:vAlign w:val="center"/>
-          </w:tcPr>
-          <w:p>
-            <w:r>
-              <w:rPr>
-                <w:rFonts w:ascii="Calibri" w:hAnsi="Calibri" w:eastAsia="Microsoft YaHei"/>
-                <w:b w:val="0"/>
-                <w:sz w:val="17"/>
-              </w:rPr>
-              <w:t>Amazon 非媒体类标题 75 字符规则进入倒计时</w:t>
-            </w:r>
-          </w:p>
-        </w:tc>
-        <w:tc>
-          <w:tcPr>
-            <w:tcW w:type="dxa" w:w="2560"/>
-            <w:tcMar>
-              <w:top w:w="80" w:type="dxa"/>
-              <w:start w:w="120" w:type="dxa"/>
-              <w:bottom w:w="80" w:type="dxa"/>
-              <w:end w:w="120" w:type="dxa"/>
-            </w:tcMar>
-            <w:vAlign w:val="center"/>
-          </w:tcPr>
-          <w:p>
-            <w:r>
-              <w:rPr>
-                <w:rFonts w:ascii="Calibri" w:hAnsi="Calibri" w:eastAsia="Microsoft YaHei"/>
-                <w:b w:val="0"/>
-                <w:sz w:val="17"/>
-              </w:rPr>
-              <w:t>2026-07-27 起，非媒体类商品标题须不超过 75 个字符，超长标题将逐步被 AI 推荐内容替换。</w:t>
-            </w:r>
-          </w:p>
-        </w:tc>
-        <w:tc>
-          <w:tcPr>
-            <w:tcW w:type="dxa" w:w="2920"/>
-            <w:tcMar>
-              <w:top w:w="80" w:type="dxa"/>
-              <w:start w:w="120" w:type="dxa"/>
-              <w:bottom w:w="80" w:type="dxa"/>
-              <w:end w:w="120" w:type="dxa"/>
-            </w:tcMar>
-            <w:vAlign w:val="center"/>
-          </w:tcPr>
-          <w:p>
-            <w:r>
-              <w:rPr>
-                <w:rFonts w:ascii="Calibri" w:hAnsi="Calibri" w:eastAsia="Microsoft YaHei"/>
-                <w:b w:val="0"/>
-                <w:sz w:val="16"/>
-              </w:rPr>
-              <w:t>今天导出 Amazon 在售 SKU，先处理主力 ASIN：标题压缩到 75 字符以内，卖点转入 Item Highlights。</w:t>
-            </w:r>
-          </w:p>
-        </w:tc>
-        <w:tc>
-          <w:tcPr>
-            <w:tcW w:type="dxa" w:w="1100"/>
-            <w:tcMar>
-              <w:top w:w="80" w:type="dxa"/>
-              <w:start w:w="120" w:type="dxa"/>
-              <w:bottom w:w="80" w:type="dxa"/>
-              <w:end w:w="120" w:type="dxa"/>
-            </w:tcMar>
-            <w:vAlign w:val="center"/>
           </w:tcPr>
           <w:p>
             <w:pPr>
@@ -437,9 +312,59 @@
               <w:rPr>
                 <w:rFonts w:ascii="Calibri" w:hAnsi="Calibri" w:eastAsia="Microsoft YaHei"/>
                 <w:b w:val="0"/>
-                <w:sz w:val="17"/>
+                <w:sz w:val="18"/>
               </w:rPr>
-              <w:t>Amazon Seller Forums 公告</w:t>
+              <w:t>今日新增</w:t>
+            </w:r>
+          </w:p>
+        </w:tc>
+        <w:tc>
+          <w:tcPr>
+            <w:tcW w:type="dxa" w:w="2700"/>
+            <w:vAlign w:val="center"/>
+            <w:tcMar>
+              <w:top w:w="80" w:type="dxa"/>
+              <w:start w:w="120" w:type="dxa"/>
+              <w:bottom w:w="80" w:type="dxa"/>
+              <w:end w:w="120" w:type="dxa"/>
+            </w:tcMar>
+          </w:tcPr>
+          <w:p>
+            <w:pPr>
+              <w:jc w:val="left"/>
+            </w:pPr>
+            <w:r>
+              <w:rPr>
+                <w:rFonts w:ascii="Calibri" w:hAnsi="Calibri" w:eastAsia="Microsoft YaHei"/>
+                <w:b/>
+                <w:sz w:val="18"/>
+              </w:rPr>
+              <w:t>示例欧盟产品规则更新</w:t>
+            </w:r>
+          </w:p>
+        </w:tc>
+        <w:tc>
+          <w:tcPr>
+            <w:tcW w:type="dxa" w:w="4410"/>
+            <w:vAlign w:val="center"/>
+            <w:tcMar>
+              <w:top w:w="80" w:type="dxa"/>
+              <w:start w:w="120" w:type="dxa"/>
+              <w:bottom w:w="80" w:type="dxa"/>
+              <w:end w:w="120" w:type="dxa"/>
+            </w:tcMar>
+          </w:tcPr>
+          <w:p>
+            <w:pPr>
+              <w:jc w:val="left"/>
+            </w:pPr>
+            <w:r>
+              <w:rPr>
+                <w:rFonts w:ascii="Calibri" w:hAnsi="Calibri" w:eastAsia="Microsoft YaHei"/>
+                <w:b w:val="0"/>
+                <w:sz w:val="18"/>
+              </w:rPr>
+              <w:t>缺少资料的商品可能延迟清关。</w:t>
             </w:r>
           </w:p>
         </w:tc>
@@ -447,105 +372,15 @@
       <w:tr>
         <w:tc>
           <w:tcPr>
-            <w:tcW w:type="dxa" w:w="760"/>
+            <w:tcW w:type="dxa" w:w="900"/>
+            <w:vAlign w:val="center"/>
+            <w:shd w:fill="FFF1CC"/>
             <w:tcMar>
               <w:top w:w="80" w:type="dxa"/>
               <w:start w:w="120" w:type="dxa"/>
               <w:bottom w:w="80" w:type="dxa"/>
               <w:end w:w="120" w:type="dxa"/>
             </w:tcMar>
-            <w:vAlign w:val="center"/>
-          </w:tcPr>
-          <w:p>
-            <w:pPr>
-              <w:jc w:val="center"/>
-            </w:pPr>
-            <w:r>
-              <w:rPr>
-                <w:rFonts w:ascii="Calibri" w:hAnsi="Calibri" w:eastAsia="Microsoft YaHei"/>
-                <w:b/>
-                <w:sz w:val="17"/>
-              </w:rPr>
-              <w:t>高</w:t>
-            </w:r>
-          </w:p>
-        </w:tc>
-        <w:tc>
-          <w:tcPr>
-            <w:tcW w:type="dxa" w:w="2020"/>
-            <w:tcMar>
-              <w:top w:w="80" w:type="dxa"/>
-              <w:start w:w="120" w:type="dxa"/>
-              <w:bottom w:w="80" w:type="dxa"/>
-              <w:end w:w="120" w:type="dxa"/>
-            </w:tcMar>
-            <w:vAlign w:val="center"/>
-          </w:tcPr>
-          <w:p>
-            <w:r>
-              <w:rPr>
-                <w:rFonts w:ascii="Calibri" w:hAnsi="Calibri" w:eastAsia="Microsoft YaHei"/>
-                <w:b w:val="0"/>
-                <w:sz w:val="17"/>
-              </w:rPr>
-              <w:t>欧盟 CBAM 2026 正式期已运行，Q2 证书价格已发布</w:t>
-            </w:r>
-          </w:p>
-        </w:tc>
-        <w:tc>
-          <w:tcPr>
-            <w:tcW w:type="dxa" w:w="2560"/>
-            <w:tcMar>
-              <w:top w:w="80" w:type="dxa"/>
-              <w:start w:w="120" w:type="dxa"/>
-              <w:bottom w:w="80" w:type="dxa"/>
-              <w:end w:w="120" w:type="dxa"/>
-            </w:tcMar>
-            <w:vAlign w:val="center"/>
-          </w:tcPr>
-          <w:p>
-            <w:r>
-              <w:rPr>
-                <w:rFonts w:ascii="Calibri" w:hAnsi="Calibri" w:eastAsia="Microsoft YaHei"/>
-                <w:b w:val="0"/>
-                <w:sz w:val="17"/>
-              </w:rPr>
-              <w:t>钢铁、铝、水泥、化肥、电力、氢等 CBAM 货物，欧盟进口商需成为授权申报人并购买/交回证书。</w:t>
-            </w:r>
-          </w:p>
-        </w:tc>
-        <w:tc>
-          <w:tcPr>
-            <w:tcW w:type="dxa" w:w="2920"/>
-            <w:tcMar>
-              <w:top w:w="80" w:type="dxa"/>
-              <w:start w:w="120" w:type="dxa"/>
-              <w:bottom w:w="80" w:type="dxa"/>
-              <w:end w:w="120" w:type="dxa"/>
-            </w:tcMar>
-            <w:vAlign w:val="center"/>
-          </w:tcPr>
-          <w:p>
-            <w:r>
-              <w:rPr>
-                <w:rFonts w:ascii="Calibri" w:hAnsi="Calibri" w:eastAsia="Microsoft YaHei"/>
-                <w:b w:val="0"/>
-                <w:sz w:val="16"/>
-              </w:rPr>
-              <w:t>对欧报价单新增“CBAM 数据包”字段：CN code、吨数、嵌入排放、生产路线、第三国已付碳价证明。</w:t>
-            </w:r>
-          </w:p>
-        </w:tc>
-        <w:tc>
-          <w:tcPr>
-            <w:tcW w:type="dxa" w:w="1100"/>
-            <w:tcMar>
-              <w:top w:w="80" w:type="dxa"/>
-              <w:start w:w="120" w:type="dxa"/>
-              <w:bottom w:w="80" w:type="dxa"/>
-              <w:end w:w="120" w:type="dxa"/>
-            </w:tcMar>
-            <w:vAlign w:val="center"/>
           </w:tcPr>
           <w:p>
             <w:pPr>
@@ -555,34 +390,7 @@
               <w:rPr>
                 <w:rFonts w:ascii="Calibri" w:hAnsi="Calibri" w:eastAsia="Microsoft YaHei"/>
                 <w:b w:val="0"/>
-                <w:sz w:val="17"/>
-              </w:rPr>
-              <w:t>European Commission CBAM 页面</w:t>
-            </w:r>
-          </w:p>
-        </w:tc>
-      </w:tr>
-      <w:tr>
-        <w:tc>
-          <w:tcPr>
-            <w:tcW w:type="dxa" w:w="760"/>
-            <w:tcMar>
-              <w:top w:w="80" w:type="dxa"/>
-              <w:start w:w="120" w:type="dxa"/>
-              <w:bottom w:w="80" w:type="dxa"/>
-              <w:end w:w="120" w:type="dxa"/>
-            </w:tcMar>
-            <w:vAlign w:val="center"/>
-          </w:tcPr>
-          <w:p>
-            <w:pPr>
-              <w:jc w:val="center"/>
-            </w:pPr>
-            <w:r>
-              <w:rPr>
-                <w:rFonts w:ascii="Calibri" w:hAnsi="Calibri" w:eastAsia="Microsoft YaHei"/>
-                <w:b/>
-                <w:sz w:val="17"/>
+                <w:sz w:val="18"/>
               </w:rPr>
               <w:t>中</w:t>
             </w:r>
@@ -590,80 +398,14 @@
         </w:tc>
         <w:tc>
           <w:tcPr>
-            <w:tcW w:type="dxa" w:w="2020"/>
+            <w:tcW w:type="dxa" w:w="1350"/>
+            <w:vAlign w:val="center"/>
             <w:tcMar>
               <w:top w:w="80" w:type="dxa"/>
               <w:start w:w="120" w:type="dxa"/>
               <w:bottom w:w="80" w:type="dxa"/>
               <w:end w:w="120" w:type="dxa"/>
             </w:tcMar>
-            <w:vAlign w:val="center"/>
-          </w:tcPr>
-          <w:p>
-            <w:r>
-              <w:rPr>
-                <w:rFonts w:ascii="Calibri" w:hAnsi="Calibri" w:eastAsia="Microsoft YaHei"/>
-                <w:b w:val="0"/>
-                <w:sz w:val="17"/>
-              </w:rPr>
-              <w:t>欧盟 EUDR 适用日期已明确后移</w:t>
-            </w:r>
-          </w:p>
-        </w:tc>
-        <w:tc>
-          <w:tcPr>
-            <w:tcW w:type="dxa" w:w="2560"/>
-            <w:tcMar>
-              <w:top w:w="80" w:type="dxa"/>
-              <w:start w:w="120" w:type="dxa"/>
-              <w:bottom w:w="80" w:type="dxa"/>
-              <w:end w:w="120" w:type="dxa"/>
-            </w:tcMar>
-            <w:vAlign w:val="center"/>
-          </w:tcPr>
-          <w:p>
-            <w:r>
-              <w:rPr>
-                <w:rFonts w:ascii="Calibri" w:hAnsi="Calibri" w:eastAsia="Microsoft YaHei"/>
-                <w:b w:val="0"/>
-                <w:sz w:val="17"/>
-              </w:rPr>
-              <w:t>大中型经营者 2026-12-30 适用；微型和小型经营者 2027-06-30 适用，木材旧规覆盖的小微企业例外。</w:t>
-            </w:r>
-          </w:p>
-        </w:tc>
-        <w:tc>
-          <w:tcPr>
-            <w:tcW w:type="dxa" w:w="2920"/>
-            <w:tcMar>
-              <w:top w:w="80" w:type="dxa"/>
-              <w:start w:w="120" w:type="dxa"/>
-              <w:bottom w:w="80" w:type="dxa"/>
-              <w:end w:w="120" w:type="dxa"/>
-            </w:tcMar>
-            <w:vAlign w:val="center"/>
-          </w:tcPr>
-          <w:p>
-            <w:r>
-              <w:rPr>
-                <w:rFonts w:ascii="Calibri" w:hAnsi="Calibri" w:eastAsia="Microsoft YaHei"/>
-                <w:b w:val="0"/>
-                <w:sz w:val="16"/>
-              </w:rPr>
-              <w:t>木材、咖啡、可可、橡胶、牛/皮革、大豆、棕榈油相关产品，先建立地块/供应商/批次三件套。</w:t>
-            </w:r>
-          </w:p>
-        </w:tc>
-        <w:tc>
-          <w:tcPr>
-            <w:tcW w:type="dxa" w:w="1100"/>
-            <w:tcMar>
-              <w:top w:w="80" w:type="dxa"/>
-              <w:start w:w="120" w:type="dxa"/>
-              <w:bottom w:w="80" w:type="dxa"/>
-              <w:end w:w="120" w:type="dxa"/>
-            </w:tcMar>
-            <w:vAlign w:val="center"/>
           </w:tcPr>
           <w:p>
             <w:pPr>
@@ -673,363 +415,59 @@
               <w:rPr>
                 <w:rFonts w:ascii="Calibri" w:hAnsi="Calibri" w:eastAsia="Microsoft YaHei"/>
                 <w:b w:val="0"/>
-                <w:sz w:val="17"/>
+                <w:sz w:val="18"/>
               </w:rPr>
-              <w:t>European Commission EUDR 页面</w:t>
+              <w:t>持续关注</w:t>
             </w:r>
           </w:p>
         </w:tc>
-      </w:tr>
-      <w:tr>
         <w:tc>
           <w:tcPr>
-            <w:tcW w:type="dxa" w:w="760"/>
+            <w:tcW w:type="dxa" w:w="2700"/>
+            <w:vAlign w:val="center"/>
             <w:tcMar>
               <w:top w:w="80" w:type="dxa"/>
               <w:start w:w="120" w:type="dxa"/>
               <w:bottom w:w="80" w:type="dxa"/>
               <w:end w:w="120" w:type="dxa"/>
             </w:tcMar>
-            <w:vAlign w:val="center"/>
           </w:tcPr>
           <w:p>
             <w:pPr>
-              <w:jc w:val="center"/>
+              <w:jc w:val="left"/>
             </w:pPr>
             <w:r>
               <w:rPr>
                 <w:rFonts w:ascii="Calibri" w:hAnsi="Calibri" w:eastAsia="Microsoft YaHei"/>
                 <w:b/>
-                <w:sz w:val="17"/>
+                <w:sz w:val="18"/>
               </w:rPr>
-              <w:t>中</w:t>
+              <w:t>示例平台标题规则</w:t>
             </w:r>
           </w:p>
         </w:tc>
         <w:tc>
           <w:tcPr>
-            <w:tcW w:type="dxa" w:w="2020"/>
+            <w:tcW w:type="dxa" w:w="4410"/>
+            <w:vAlign w:val="center"/>
             <w:tcMar>
               <w:top w:w="80" w:type="dxa"/>
               <w:start w:w="120" w:type="dxa"/>
               <w:bottom w:w="80" w:type="dxa"/>
               <w:end w:w="120" w:type="dxa"/>
             </w:tcMar>
-            <w:vAlign w:val="center"/>
-          </w:tcPr>
-          <w:p>
-            <w:r>
-              <w:rPr>
-                <w:rFonts w:ascii="Calibri" w:hAnsi="Calibri" w:eastAsia="Microsoft YaHei"/>
-                <w:b w:val="0"/>
-                <w:sz w:val="17"/>
-              </w:rPr>
-              <w:t>美国 FDA 食品追溯规则执法窗口延后</w:t>
-            </w:r>
-          </w:p>
-        </w:tc>
-        <w:tc>
-          <w:tcPr>
-            <w:tcW w:type="dxa" w:w="2560"/>
-            <w:tcMar>
-              <w:top w:w="80" w:type="dxa"/>
-              <w:start w:w="120" w:type="dxa"/>
-              <w:bottom w:w="80" w:type="dxa"/>
-              <w:end w:w="120" w:type="dxa"/>
-            </w:tcMar>
-            <w:vAlign w:val="center"/>
-          </w:tcPr>
-          <w:p>
-            <w:r>
-              <w:rPr>
-                <w:rFonts w:ascii="Calibri" w:hAnsi="Calibri" w:eastAsia="Microsoft YaHei"/>
-                <w:b w:val="0"/>
-                <w:sz w:val="17"/>
-              </w:rPr>
-              <w:t>FDA 页面显示原合规日期为 2026-01-20，并说明拟延至 2028-07-20 且国会要求此前不执行。</w:t>
-            </w:r>
-          </w:p>
-        </w:tc>
-        <w:tc>
-          <w:tcPr>
-            <w:tcW w:type="dxa" w:w="2920"/>
-            <w:tcMar>
-              <w:top w:w="80" w:type="dxa"/>
-              <w:start w:w="120" w:type="dxa"/>
-              <w:bottom w:w="80" w:type="dxa"/>
-              <w:end w:w="120" w:type="dxa"/>
-            </w:tcMar>
-            <w:vAlign w:val="center"/>
-          </w:tcPr>
-          <w:p>
-            <w:r>
-              <w:rPr>
-                <w:rFonts w:ascii="Calibri" w:hAnsi="Calibri" w:eastAsia="Microsoft YaHei"/>
-                <w:b w:val="0"/>
-                <w:sz w:val="16"/>
-              </w:rPr>
-              <w:t>出口美国的生鲜、海产、软奶酪等 FTL 食品不要停项目；把 KDE/CTE 字段嵌入 ERP 和供应商出货模板。</w:t>
-            </w:r>
-          </w:p>
-        </w:tc>
-        <w:tc>
-          <w:tcPr>
-            <w:tcW w:type="dxa" w:w="1100"/>
-            <w:tcMar>
-              <w:top w:w="80" w:type="dxa"/>
-              <w:start w:w="120" w:type="dxa"/>
-              <w:bottom w:w="80" w:type="dxa"/>
-              <w:end w:w="120" w:type="dxa"/>
-            </w:tcMar>
-            <w:vAlign w:val="center"/>
           </w:tcPr>
           <w:p>
             <w:pPr>
-              <w:jc w:val="center"/>
+              <w:jc w:val="left"/>
             </w:pPr>
             <w:r>
               <w:rPr>
                 <w:rFonts w:ascii="Calibri" w:hAnsi="Calibri" w:eastAsia="Microsoft YaHei"/>
                 <w:b w:val="0"/>
-                <w:sz w:val="17"/>
+                <w:sz w:val="18"/>
               </w:rPr>
-              <w:t>FDA FSMA Food Traceability Rule</w:t>
-            </w:r>
-          </w:p>
-        </w:tc>
-      </w:tr>
-      <w:tr>
-        <w:tc>
-          <w:tcPr>
-            <w:tcW w:type="dxa" w:w="760"/>
-            <w:tcMar>
-              <w:top w:w="80" w:type="dxa"/>
-              <w:start w:w="120" w:type="dxa"/>
-              <w:bottom w:w="80" w:type="dxa"/>
-              <w:end w:w="120" w:type="dxa"/>
-            </w:tcMar>
-            <w:vAlign w:val="center"/>
-          </w:tcPr>
-          <w:p>
-            <w:pPr>
-              <w:jc w:val="center"/>
-            </w:pPr>
-            <w:r>
-              <w:rPr>
-                <w:rFonts w:ascii="Calibri" w:hAnsi="Calibri" w:eastAsia="Microsoft YaHei"/>
-                <w:b/>
-                <w:sz w:val="17"/>
-              </w:rPr>
-              <w:t>中</w:t>
-            </w:r>
-          </w:p>
-        </w:tc>
-        <w:tc>
-          <w:tcPr>
-            <w:tcW w:type="dxa" w:w="2020"/>
-            <w:tcMar>
-              <w:top w:w="80" w:type="dxa"/>
-              <w:start w:w="120" w:type="dxa"/>
-              <w:bottom w:w="80" w:type="dxa"/>
-              <w:end w:w="120" w:type="dxa"/>
-            </w:tcMar>
-            <w:vAlign w:val="center"/>
-          </w:tcPr>
-          <w:p>
-            <w:r>
-              <w:rPr>
-                <w:rFonts w:ascii="Calibri" w:hAnsi="Calibri" w:eastAsia="Microsoft YaHei"/>
-                <w:b w:val="0"/>
-                <w:sz w:val="17"/>
-              </w:rPr>
-              <w:t>欧盟电池法规尽调与电池护照节点逼近</w:t>
-            </w:r>
-          </w:p>
-        </w:tc>
-        <w:tc>
-          <w:tcPr>
-            <w:tcW w:type="dxa" w:w="2560"/>
-            <w:tcMar>
-              <w:top w:w="80" w:type="dxa"/>
-              <w:start w:w="120" w:type="dxa"/>
-              <w:bottom w:w="80" w:type="dxa"/>
-              <w:end w:w="120" w:type="dxa"/>
-            </w:tcMar>
-            <w:vAlign w:val="center"/>
-          </w:tcPr>
-          <w:p>
-            <w:r>
-              <w:rPr>
-                <w:rFonts w:ascii="Calibri" w:hAnsi="Calibri" w:eastAsia="Microsoft YaHei"/>
-                <w:b w:val="0"/>
-                <w:sz w:val="17"/>
-              </w:rPr>
-              <w:t>电池原料尽调义务自 2025-08-18 起适用；LMT、电动汽车和&gt;2kWh工业电池 2027-02-18 起需电池护照。</w:t>
-            </w:r>
-          </w:p>
-        </w:tc>
-        <w:tc>
-          <w:tcPr>
-            <w:tcW w:type="dxa" w:w="2920"/>
-            <w:tcMar>
-              <w:top w:w="80" w:type="dxa"/>
-              <w:start w:w="120" w:type="dxa"/>
-              <w:bottom w:w="80" w:type="dxa"/>
-              <w:end w:w="120" w:type="dxa"/>
-            </w:tcMar>
-            <w:vAlign w:val="center"/>
-          </w:tcPr>
-          <w:p>
-            <w:r>
-              <w:rPr>
-                <w:rFonts w:ascii="Calibri" w:hAnsi="Calibri" w:eastAsia="Microsoft YaHei"/>
-                <w:b w:val="0"/>
-                <w:sz w:val="16"/>
-              </w:rPr>
-              <w:t>电动工具、储能、两轮车、带电产品供应商今天开始补钴/锂/镍/天然石墨来源和第三方验证资料。</w:t>
-            </w:r>
-          </w:p>
-        </w:tc>
-        <w:tc>
-          <w:tcPr>
-            <w:tcW w:type="dxa" w:w="1100"/>
-            <w:tcMar>
-              <w:top w:w="80" w:type="dxa"/>
-              <w:start w:w="120" w:type="dxa"/>
-              <w:bottom w:w="80" w:type="dxa"/>
-              <w:end w:w="120" w:type="dxa"/>
-            </w:tcMar>
-            <w:vAlign w:val="center"/>
-          </w:tcPr>
-          <w:p>
-            <w:pPr>
-              <w:jc w:val="center"/>
-            </w:pPr>
-            <w:r>
-              <w:rPr>
-                <w:rFonts w:ascii="Calibri" w:hAnsi="Calibri" w:eastAsia="Microsoft YaHei"/>
-                <w:b w:val="0"/>
-                <w:sz w:val="17"/>
-              </w:rPr>
-              <w:t>EUR-Lex Regulation (EU) 2023/1542</w:t>
-            </w:r>
-          </w:p>
-        </w:tc>
-      </w:tr>
-      <w:tr>
-        <w:tc>
-          <w:tcPr>
-            <w:tcW w:type="dxa" w:w="760"/>
-            <w:tcMar>
-              <w:top w:w="80" w:type="dxa"/>
-              <w:start w:w="120" w:type="dxa"/>
-              <w:bottom w:w="80" w:type="dxa"/>
-              <w:end w:w="120" w:type="dxa"/>
-            </w:tcMar>
-            <w:vAlign w:val="center"/>
-          </w:tcPr>
-          <w:p>
-            <w:pPr>
-              <w:jc w:val="center"/>
-            </w:pPr>
-            <w:r>
-              <w:rPr>
-                <w:rFonts w:ascii="Calibri" w:hAnsi="Calibri" w:eastAsia="Microsoft YaHei"/>
-                <w:b/>
-                <w:sz w:val="17"/>
-              </w:rPr>
-              <w:t>中</w:t>
-            </w:r>
-          </w:p>
-        </w:tc>
-        <w:tc>
-          <w:tcPr>
-            <w:tcW w:type="dxa" w:w="2020"/>
-            <w:tcMar>
-              <w:top w:w="80" w:type="dxa"/>
-              <w:start w:w="120" w:type="dxa"/>
-              <w:bottom w:w="80" w:type="dxa"/>
-              <w:end w:w="120" w:type="dxa"/>
-            </w:tcMar>
-            <w:vAlign w:val="center"/>
-          </w:tcPr>
-          <w:p>
-            <w:r>
-              <w:rPr>
-                <w:rFonts w:ascii="Calibri" w:hAnsi="Calibri" w:eastAsia="Microsoft YaHei"/>
-                <w:b w:val="0"/>
-                <w:sz w:val="17"/>
-              </w:rPr>
-              <w:t>欧盟一般产品安全仍是跨境电商基础门槛</w:t>
-            </w:r>
-          </w:p>
-        </w:tc>
-        <w:tc>
-          <w:tcPr>
-            <w:tcW w:type="dxa" w:w="2560"/>
-            <w:tcMar>
-              <w:top w:w="80" w:type="dxa"/>
-              <w:start w:w="120" w:type="dxa"/>
-              <w:bottom w:w="80" w:type="dxa"/>
-              <w:end w:w="120" w:type="dxa"/>
-            </w:tcMar>
-            <w:vAlign w:val="center"/>
-          </w:tcPr>
-          <w:p>
-            <w:r>
-              <w:rPr>
-                <w:rFonts w:ascii="Calibri" w:hAnsi="Calibri" w:eastAsia="Microsoft YaHei"/>
-                <w:b w:val="0"/>
-                <w:sz w:val="17"/>
-              </w:rPr>
-              <w:t>GPSR 已适用于欧盟消费品，在线销售需展示制造商/欧盟联系人、产品识别和警示信息。</w:t>
-            </w:r>
-          </w:p>
-        </w:tc>
-        <w:tc>
-          <w:tcPr>
-            <w:tcW w:type="dxa" w:w="2920"/>
-            <w:tcMar>
-              <w:top w:w="80" w:type="dxa"/>
-              <w:start w:w="120" w:type="dxa"/>
-              <w:bottom w:w="80" w:type="dxa"/>
-              <w:end w:w="120" w:type="dxa"/>
-            </w:tcMar>
-            <w:vAlign w:val="center"/>
-          </w:tcPr>
-          <w:p>
-            <w:r>
-              <w:rPr>
-                <w:rFonts w:ascii="Calibri" w:hAnsi="Calibri" w:eastAsia="Microsoft YaHei"/>
-                <w:b w:val="0"/>
-                <w:sz w:val="16"/>
-              </w:rPr>
-              <w:t>复查欧盟站 listing：主图/详情页/包装/说明书四处信息一致；无欧盟责任主体的 SKU 暂不推流。</w:t>
-            </w:r>
-          </w:p>
-        </w:tc>
-        <w:tc>
-          <w:tcPr>
-            <w:tcW w:type="dxa" w:w="1100"/>
-            <w:tcMar>
-              <w:top w:w="80" w:type="dxa"/>
-              <w:start w:w="120" w:type="dxa"/>
-              <w:bottom w:w="80" w:type="dxa"/>
-              <w:end w:w="120" w:type="dxa"/>
-            </w:tcMar>
-            <w:vAlign w:val="center"/>
-          </w:tcPr>
-          <w:p>
-            <w:pPr>
-              <w:jc w:val="center"/>
-            </w:pPr>
-            <w:r>
-              <w:rPr>
-                <w:rFonts w:ascii="Calibri" w:hAnsi="Calibri" w:eastAsia="Microsoft YaHei"/>
-                <w:b w:val="0"/>
-                <w:sz w:val="17"/>
-              </w:rPr>
-              <w:t>EUR-Lex Regulation (EU) 2023/988</w:t>
+              <w:t>商品标题需要复核。</w:t>
             </w:r>
           </w:p>
         </w:tc>
@@ -1040,55 +478,37 @@
         <w:pStyle w:val="Heading1"/>
       </w:pPr>
       <w:r>
-        <w:t>优先处理顺序</w:t>
+        <w:t>优先行动</w:t>
       </w:r>
     </w:p>
     <w:p>
       <w:pPr>
         <w:pStyle w:val="ListNumber"/>
-        <w:ind w:left="540" w:hanging="271"/>
       </w:pPr>
       <w:r>
         <w:rPr>
           <w:rFonts w:ascii="Calibri" w:hAnsi="Calibri" w:eastAsia="Microsoft YaHei"/>
+          <w:b/>
         </w:rPr>
-        <w:t>今天下班前：拦截氦气相关询盘、订单、报关资料，避免误接单或误申报。</w:t>
+        <w:t xml:space="preserve">示例欧盟产品规则更新: </w:t>
+      </w:r>
+      <w:r>
+        <w:t>合规团队在 2026-07-24 前核对主力 SKU 并保存完整资料清单。</w:t>
       </w:r>
     </w:p>
     <w:p>
       <w:pPr>
         <w:pStyle w:val="ListNumber"/>
-        <w:ind w:left="540" w:hanging="271"/>
       </w:pPr>
       <w:r>
         <w:rPr>
           <w:rFonts w:ascii="Calibri" w:hAnsi="Calibri" w:eastAsia="Microsoft YaHei"/>
+          <w:b/>
         </w:rPr>
-        <w:t>7月22日前：完成 Amazon 主力 ASIN 标题压缩和 Item Highlights 补写，留出 5 天观察系统推荐。</w:t>
+        <w:t xml:space="preserve">示例平台标题规则: </w:t>
       </w:r>
-    </w:p>
-    <w:p>
-      <w:pPr>
-        <w:pStyle w:val="ListNumber"/>
-        <w:ind w:left="540" w:hanging="271"/>
-      </w:pPr>
       <w:r>
-        <w:rPr>
-          <w:rFonts w:ascii="Calibri" w:hAnsi="Calibri" w:eastAsia="Microsoft YaHei"/>
-        </w:rPr>
-        <w:t>本周内：给欧盟 CBAM 客户补“排放数据包”模板，先覆盖钢铁、铝、紧固件、型材、化肥相关 SKU。</w:t>
-      </w:r>
-    </w:p>
-    <w:p>
-      <w:pPr>
-        <w:pStyle w:val="ListNumber"/>
-        <w:ind w:left="540" w:hanging="271"/>
-      </w:pPr>
-      <w:r>
-        <w:rPr>
-          <w:rFonts w:ascii="Calibri" w:hAnsi="Calibri" w:eastAsia="Microsoft YaHei"/>
-        </w:rPr>
-        <w:t>本月内：把 EUDR、FDA 追溯、电池法规按品类建清单，不急着一次合规完，但要先锁定责任人和资料缺口。</w:t>
+        <w:t>平台运营在本周内导出主力商品并完成标题检查。</w:t>
       </w:r>
     </w:p>
     <w:p>
@@ -1100,21 +520,8 @@
       </w:r>
     </w:p>
     <w:p>
-      <w:pPr>
-        <w:pStyle w:val="BodyText"/>
-      </w:pPr>
       <w:r>
-        <w:rPr>
-          <w:rFonts w:ascii="Calibri" w:hAnsi="Calibri" w:eastAsia="Microsoft YaHei"/>
-          <w:b/>
-        </w:rPr>
-        <w:t>与 2026-07-13 基线重复的事项：</w:t>
-      </w:r>
-      <w:r>
-        <w:rPr>
-          <w:rFonts w:ascii="Calibri" w:hAnsi="Calibri" w:eastAsia="Microsoft YaHei"/>
-        </w:rPr>
-        <w:t>氦气临时禁止出口、Amazon 标题 75 字符规则已在首日记录，本版不作为新增事件计数，但因影响高且日期临近，继续列入“高优先级行动”。</w:t>
+        <w:t>与上一期比较后移除 0 条无实质变化的重复事项；人工复核后保留 0 条实质更新事项；另有 0 条仍待复核。</w:t>
       </w:r>
     </w:p>
     <w:p>
@@ -1122,211 +529,280 @@
         <w:pStyle w:val="Heading1"/>
       </w:pPr>
       <w:r>
-        <w:t>官方来源</w:t>
+        <w:t>事件详情与官方来源</w:t>
       </w:r>
     </w:p>
     <w:p>
       <w:pPr>
-        <w:pStyle w:val="BodyText"/>
+        <w:pStyle w:val="Heading2"/>
       </w:pPr>
+      <w:r>
+        <w:t>S1 | 示例欧盟产品规则更新</w:t>
+      </w:r>
+    </w:p>
+    <w:p>
       <w:r>
         <w:rPr>
           <w:rFonts w:ascii="Calibri" w:hAnsi="Calibri" w:eastAsia="Microsoft YaHei"/>
-          <w:color w:val="555555"/>
-          <w:sz w:val="18"/>
+          <w:b/>
         </w:rPr>
-        <w:t xml:space="preserve">S1：商务部、海关总署公告2026年第29号 </w:t>
+        <w:t xml:space="preserve">司法辖区: </w:t>
       </w:r>
-      <w:hyperlink r:id="rId9">
-        <w:r>
-          <w:rPr>
-            <w:color w:val="0563C1"/>
-            <w:u w:val="single"/>
-          </w:rPr>
-          <w:t>打开来源</w:t>
-        </w:r>
-      </w:hyperlink>
+      <w:r>
+        <w:t>EU</w:t>
+      </w:r>
     </w:p>
     <w:p>
-      <w:pPr>
-        <w:pStyle w:val="BodyText"/>
-      </w:pPr>
       <w:r>
         <w:rPr>
           <w:rFonts w:ascii="Calibri" w:hAnsi="Calibri" w:eastAsia="Microsoft YaHei"/>
-          <w:color w:val="555555"/>
-          <w:sz w:val="18"/>
+          <w:b/>
         </w:rPr>
-        <w:t xml:space="preserve">S2：Amazon Seller Forums 公告 </w:t>
+        <w:t xml:space="preserve">主管机构: </w:t>
       </w:r>
-      <w:hyperlink r:id="rId10">
-        <w:r>
-          <w:rPr>
-            <w:color w:val="0563C1"/>
-            <w:u w:val="single"/>
-          </w:rPr>
-          <w:t>打开来源</w:t>
-        </w:r>
-      </w:hyperlink>
+      <w:r>
+        <w:t>Example EU Authority</w:t>
+      </w:r>
     </w:p>
     <w:p>
-      <w:pPr>
-        <w:pStyle w:val="BodyText"/>
-      </w:pPr>
       <w:r>
         <w:rPr>
           <w:rFonts w:ascii="Calibri" w:hAnsi="Calibri" w:eastAsia="Microsoft YaHei"/>
-          <w:color w:val="555555"/>
-          <w:sz w:val="18"/>
+          <w:b/>
         </w:rPr>
-        <w:t xml:space="preserve">S3：European Commission CBAM 页面 </w:t>
+        <w:t xml:space="preserve">发布日期: </w:t>
+      </w:r>
+      <w:r>
+        <w:t>2026-07-21</w:t>
+      </w:r>
+    </w:p>
+    <w:p>
+      <w:r>
+        <w:rPr>
+          <w:rFonts w:ascii="Calibri" w:hAnsi="Calibri" w:eastAsia="Microsoft YaHei"/>
+          <w:b/>
+        </w:rPr>
+        <w:t xml:space="preserve">生效日期: </w:t>
+      </w:r>
+      <w:r>
+        <w:t>2026-07-28</w:t>
+      </w:r>
+    </w:p>
+    <w:p>
+      <w:r>
+        <w:rPr>
+          <w:rFonts w:ascii="Calibri" w:hAnsi="Calibri" w:eastAsia="Microsoft YaHei"/>
+          <w:b/>
+        </w:rPr>
+        <w:t xml:space="preserve">摘要: </w:t>
+      </w:r>
+      <w:r>
+        <w:t>示例规则要求出口商补充产品合规资料。</w:t>
+      </w:r>
+    </w:p>
+    <w:p>
+      <w:r>
+        <w:rPr>
+          <w:rFonts w:ascii="Calibri" w:hAnsi="Calibri" w:eastAsia="Microsoft YaHei"/>
+          <w:b/>
+        </w:rPr>
+        <w:t xml:space="preserve">行动: </w:t>
+      </w:r>
+      <w:r>
+        <w:t>合规团队在 2026-07-24 前核对主力 SKU 并保存完整资料清单。</w:t>
+      </w:r>
+    </w:p>
+    <w:p>
+      <w:r>
+        <w:rPr>
+          <w:rFonts w:ascii="Calibri" w:hAnsi="Calibri" w:eastAsia="Microsoft YaHei"/>
+          <w:b/>
+        </w:rPr>
+        <w:t>官方来源：</w:t>
       </w:r>
       <w:hyperlink r:id="rId11">
         <w:r>
           <w:rPr>
-            <w:color w:val="0563C1"/>
+            <w:color w:val="2E74B5"/>
             <w:u w:val="single"/>
           </w:rPr>
-          <w:t>打开来源</w:t>
+          <w:t>Example EU official rule</w:t>
         </w:r>
       </w:hyperlink>
+      <w:r>
+        <w:t>，检索于 2026-07-21。</w:t>
+      </w:r>
     </w:p>
     <w:p>
       <w:pPr>
-        <w:pStyle w:val="BodyText"/>
+        <w:pStyle w:val="Heading2"/>
       </w:pPr>
+      <w:r>
+        <w:t>S2 | 示例平台标题规则</w:t>
+      </w:r>
+    </w:p>
+    <w:p>
       <w:r>
         <w:rPr>
           <w:rFonts w:ascii="Calibri" w:hAnsi="Calibri" w:eastAsia="Microsoft YaHei"/>
-          <w:color w:val="555555"/>
-          <w:sz w:val="18"/>
+          <w:b/>
         </w:rPr>
-        <w:t xml:space="preserve">S4：European Commission EUDR 页面 </w:t>
+        <w:t xml:space="preserve">司法辖区: </w:t>
+      </w:r>
+      <w:r>
+        <w:t>Global</w:t>
+      </w:r>
+    </w:p>
+    <w:p>
+      <w:r>
+        <w:rPr>
+          <w:rFonts w:ascii="Calibri" w:hAnsi="Calibri" w:eastAsia="Microsoft YaHei"/>
+          <w:b/>
+        </w:rPr>
+        <w:t xml:space="preserve">主管机构: </w:t>
+      </w:r>
+      <w:r>
+        <w:t>Example Marketplace</w:t>
+      </w:r>
+    </w:p>
+    <w:p>
+      <w:r>
+        <w:rPr>
+          <w:rFonts w:ascii="Calibri" w:hAnsi="Calibri" w:eastAsia="Microsoft YaHei"/>
+          <w:b/>
+        </w:rPr>
+        <w:t xml:space="preserve">发布日期: </w:t>
+      </w:r>
+      <w:r>
+        <w:t>2026-07-01</w:t>
+      </w:r>
+    </w:p>
+    <w:p>
+      <w:r>
+        <w:rPr>
+          <w:rFonts w:ascii="Calibri" w:hAnsi="Calibri" w:eastAsia="Microsoft YaHei"/>
+          <w:b/>
+        </w:rPr>
+        <w:t xml:space="preserve">生效日期: </w:t>
+      </w:r>
+      <w:r>
+        <w:t>2026-08-01</w:t>
+      </w:r>
+    </w:p>
+    <w:p>
+      <w:r>
+        <w:rPr>
+          <w:rFonts w:ascii="Calibri" w:hAnsi="Calibri" w:eastAsia="Microsoft YaHei"/>
+          <w:b/>
+        </w:rPr>
+        <w:t xml:space="preserve">截止日期: </w:t>
+      </w:r>
+      <w:r>
+        <w:t>2026-08-01</w:t>
+      </w:r>
+    </w:p>
+    <w:p>
+      <w:r>
+        <w:rPr>
+          <w:rFonts w:ascii="Calibri" w:hAnsi="Calibri" w:eastAsia="Microsoft YaHei"/>
+          <w:b/>
+        </w:rPr>
+        <w:t xml:space="preserve">摘要: </w:t>
+      </w:r>
+      <w:r>
+        <w:t>示例平台将调整商品标题规则。</w:t>
+      </w:r>
+    </w:p>
+    <w:p>
+      <w:r>
+        <w:rPr>
+          <w:rFonts w:ascii="Calibri" w:hAnsi="Calibri" w:eastAsia="Microsoft YaHei"/>
+          <w:b/>
+        </w:rPr>
+        <w:t xml:space="preserve">行动: </w:t>
+      </w:r>
+      <w:r>
+        <w:t>平台运营在本周内导出主力商品并完成标题检查。</w:t>
+      </w:r>
+    </w:p>
+    <w:p>
+      <w:r>
+        <w:rPr>
+          <w:rFonts w:ascii="Calibri" w:hAnsi="Calibri" w:eastAsia="Microsoft YaHei"/>
+          <w:b/>
+        </w:rPr>
+        <w:t>官方来源：</w:t>
       </w:r>
       <w:hyperlink r:id="rId12">
         <w:r>
           <w:rPr>
-            <w:color w:val="0563C1"/>
+            <w:color w:val="2E74B5"/>
             <w:u w:val="single"/>
           </w:rPr>
-          <w:t>打开来源</w:t>
+          <w:t>Example official announcement</w:t>
         </w:r>
       </w:hyperlink>
-    </w:p>
-    <w:p>
-      <w:pPr>
-        <w:pStyle w:val="BodyText"/>
-      </w:pPr>
       <w:r>
-        <w:rPr>
-          <w:rFonts w:ascii="Calibri" w:hAnsi="Calibri" w:eastAsia="Microsoft YaHei"/>
-          <w:color w:val="555555"/>
-          <w:sz w:val="18"/>
-        </w:rPr>
-        <w:t xml:space="preserve">S5：FDA FSMA Food Traceability Rule </w:t>
+        <w:t>，检索于 2026-07-21。</w:t>
       </w:r>
-      <w:hyperlink r:id="rId13">
-        <w:r>
-          <w:rPr>
-            <w:color w:val="0563C1"/>
-            <w:u w:val="single"/>
-          </w:rPr>
-          <w:t>打开来源</w:t>
-        </w:r>
-      </w:hyperlink>
-    </w:p>
-    <w:p>
-      <w:pPr>
-        <w:pStyle w:val="BodyText"/>
-      </w:pPr>
-      <w:r>
-        <w:rPr>
-          <w:rFonts w:ascii="Calibri" w:hAnsi="Calibri" w:eastAsia="Microsoft YaHei"/>
-          <w:color w:val="555555"/>
-          <w:sz w:val="18"/>
-        </w:rPr>
-        <w:t xml:space="preserve">S6：EUR-Lex Regulation (EU) 2023/1542 </w:t>
-      </w:r>
-      <w:hyperlink r:id="rId14">
-        <w:r>
-          <w:rPr>
-            <w:color w:val="0563C1"/>
-            <w:u w:val="single"/>
-          </w:rPr>
-          <w:t>打开来源</w:t>
-        </w:r>
-      </w:hyperlink>
-    </w:p>
-    <w:p>
-      <w:pPr>
-        <w:pStyle w:val="BodyText"/>
-      </w:pPr>
-      <w:r>
-        <w:rPr>
-          <w:rFonts w:ascii="Calibri" w:hAnsi="Calibri" w:eastAsia="Microsoft YaHei"/>
-          <w:color w:val="555555"/>
-          <w:sz w:val="18"/>
-        </w:rPr>
-        <w:t xml:space="preserve">S7：EUR-Lex Regulation (EU) 2023/988 </w:t>
-      </w:r>
-      <w:hyperlink r:id="rId15">
-        <w:r>
-          <w:rPr>
-            <w:color w:val="0563C1"/>
-            <w:u w:val="single"/>
-          </w:rPr>
-          <w:t>打开来源</w:t>
-        </w:r>
-      </w:hyperlink>
     </w:p>
     <w:p>
       <w:pPr>
         <w:pStyle w:val="Heading1"/>
       </w:pPr>
       <w:r>
-        <w:t>明日观察</w:t>
+        <w:t>待核实观察</w:t>
+      </w:r>
+    </w:p>
+    <w:p>
+      <w:r>
+        <w:t>无。</w:t>
+      </w:r>
+    </w:p>
+    <w:p>
+      <w:pPr>
+        <w:pStyle w:val="Heading1"/>
+      </w:pPr>
+      <w:r>
+        <w:t>覆盖缺口</w:t>
       </w:r>
     </w:p>
     <w:p>
       <w:pPr>
         <w:pStyle w:val="ListBullet"/>
-        <w:ind w:left="540" w:hanging="271"/>
+      </w:pPr>
+      <w:r>
+        <w:t>示例数据仅用于离线测试，不代表真实政策信息</w:t>
+      </w:r>
+    </w:p>
+    <w:p>
+      <w:pPr>
+        <w:keepLines/>
+        <w:spacing w:before="240"/>
       </w:pPr>
       <w:r>
         <w:rPr>
           <w:rFonts w:ascii="Calibri" w:hAnsi="Calibri" w:eastAsia="Microsoft YaHei"/>
+          <w:b/>
+          <w:color w:val="596069"/>
+          <w:sz w:val="18"/>
         </w:rPr>
-        <w:t>商务部/海关总署是否继续发布出口管制或临时禁限类公告。</w:t>
+        <w:t>重要提示：</w:t>
       </w:r>
-    </w:p>
-    <w:p>
-      <w:pPr>
-        <w:pStyle w:val="ListBullet"/>
-        <w:ind w:left="540" w:hanging="271"/>
-      </w:pPr>
       <w:r>
         <w:rPr>
           <w:rFonts w:ascii="Calibri" w:hAnsi="Calibri" w:eastAsia="Microsoft YaHei"/>
+          <w:color w:val="596069"/>
+          <w:sz w:val="18"/>
         </w:rPr>
-        <w:t>Amazon 是否补充标题规则的类目例外、AI 改写节奏或 FBA 旺季费用官方说明。</w:t>
-      </w:r>
-    </w:p>
-    <w:p>
-      <w:pPr>
-        <w:pStyle w:val="ListBullet"/>
-        <w:ind w:left="540" w:hanging="271"/>
-      </w:pPr>
-      <w:r>
-        <w:rPr>
-          <w:rFonts w:ascii="Calibri" w:hAnsi="Calibri" w:eastAsia="Microsoft YaHei"/>
-        </w:rPr>
-        <w:t>欧盟 CBAM、EUDR、GPSR 是否有新的 FAQ 或执行细则更新。</w:t>
+        <w:t>本报告用于业务研究辅助，不构成法律、税务、海关或制裁专业意见。</w:t>
       </w:r>
     </w:p>
     <w:sectPr>
-      <w:footerReference w:type="default" r:id="rId16"/>
+      <w:headerReference w:type="default" r:id="rId9"/>
+      <w:footerReference w:type="default" r:id="rId10"/>
       <w:pgSz w:w="12240" w:h="15840"/>
-      <w:pgMar w:top="1440" w:right="1440" w:bottom="1440" w:left="1440" w:header="708" w:footer="708" w:gutter="0"/>
+      <w:pgMar w:top="1080" w:right="1440" w:bottom="1080" w:left="1440" w:header="504" w:footer="504" w:gutter="0"/>
       <w:cols w:space="720"/>
       <w:docGrid w:linePitch="360"/>
     </w:sectPr>
@@ -1339,18 +815,47 @@
   <w:p>
     <w:pPr>
       <w:pStyle w:val="Footer"/>
-      <w:jc w:val="right"/>
+      <w:jc w:val="center"/>
     </w:pPr>
     <w:r>
-      <w:rPr>
-        <w:rFonts w:ascii="Calibri" w:hAnsi="Calibri" w:eastAsia="Microsoft YaHei"/>
-        <w:color w:val="555555"/>
-        <w:sz w:val="18"/>
-      </w:rPr>
-      <w:t>今日外贸雷达｜2026-07-16</w:t>
+      <w:t xml:space="preserve">Page </w:t>
+    </w:r>
+    <w:r>
+      <w:fldChar w:fldCharType="begin"/>
+    </w:r>
+    <w:r>
+      <w:instrText xml:space="preserve"> PAGE </w:instrText>
+    </w:r>
+    <w:r>
+      <w:fldChar w:fldCharType="separate"/>
+    </w:r>
+    <w:r>
+      <w:t>1</w:t>
+    </w:r>
+    <w:r>
+      <w:fldChar w:fldCharType="end"/>
     </w:r>
   </w:p>
 </w:ftr>
+</file>
+
+<file path=word/header1.xml><?xml version="1.0" encoding="utf-8"?>
+<w:hdr xmlns:m="http://schemas.openxmlformats.org/officeDocument/2006/math" xmlns:mc="http://schemas.openxmlformats.org/markup-compatibility/2006" xmlns:mo="http://schemas.microsoft.com/office/mac/office/2008/main" xmlns:mv="urn:schemas-microsoft-com:mac:vml" xmlns:o="urn:schemas-microsoft-com:office:office" xmlns:r="http://schemas.openxmlformats.org/officeDocument/2006/relationships" xmlns:v="urn:schemas-microsoft-com:vml" xmlns:w10="urn:schemas-microsoft-com:office:word" xmlns:w14="http://schemas.microsoft.com/office/word/2010/wordml" xmlns:w="http://schemas.openxmlformats.org/wordprocessingml/2006/main" xmlns:wne="http://schemas.microsoft.com/office/word/2006/wordml" xmlns:wp14="http://schemas.microsoft.com/office/word/2010/wordprocessingDrawing" xmlns:wp="http://schemas.openxmlformats.org/drawingml/2006/wordprocessingDrawing" xmlns:wpc="http://schemas.microsoft.com/office/word/2010/wordprocessingCanvas" xmlns:wpg="http://schemas.microsoft.com/office/word/2010/wordprocessingGroup" xmlns:wpi="http://schemas.microsoft.com/office/word/2010/wordprocessingInk" xmlns:wps="http://schemas.microsoft.com/office/word/2010/wordprocessingShape" mc:Ignorable="w14 wp14">
+  <w:p>
+    <w:pPr>
+      <w:pStyle w:val="Header"/>
+      <w:jc w:val="right"/>
+    </w:pPr>
+    <w:r>
+      <w:rPr>
+        <w:rFonts w:ascii="Calibri" w:hAnsi="Calibri" w:eastAsia="Microsoft YaHei"/>
+        <w:color w:val="596069"/>
+        <w:sz w:val="17"/>
+      </w:rPr>
+      <w:t>每日外贸雷达</w:t>
+    </w:r>
+  </w:p>
+</w:hdr>
 </file>
 
 <file path=word/numbering.xml><?xml version="1.0" encoding="utf-8"?>
@@ -1715,9 +1220,8 @@
   <w:style w:type="paragraph" w:default="1" w:styleId="Normal">
     <w:name w:val="Normal"/>
     <w:qFormat/>
-    <w:rsid w:val="00FC693F"/>
-    <w:pPr>
-      <w:spacing w:after="120" w:line="300" w:lineRule="auto"/>
+    <w:pPr>
+      <w:spacing w:before="0" w:after="120" w:line="300" w:lineRule="auto"/>
     </w:pPr>
     <w:rPr>
       <w:rFonts w:ascii="Calibri" w:hAnsi="Calibri" w:eastAsia="Microsoft YaHei"/>
@@ -1730,7 +1234,6 @@
     <w:link w:val="HeaderChar"/>
     <w:uiPriority w:val="99"/>
     <w:unhideWhenUsed/>
-    <w:rsid w:val="00E618BF"/>
     <w:pPr>
       <w:tabs>
         <w:tab w:val="center" w:pos="4680"/>
@@ -1744,7 +1247,6 @@
     <w:basedOn w:val="DefaultParagraphFont"/>
     <w:link w:val="Header"/>
     <w:uiPriority w:val="99"/>
-    <w:rsid w:val="00E618BF"/>
   </w:style>
   <w:style w:type="paragraph" w:styleId="Footer">
     <w:name w:val="footer"/>
@@ -1752,7 +1254,6 @@
     <w:link w:val="FooterChar"/>
     <w:uiPriority w:val="99"/>
     <w:unhideWhenUsed/>
-    <w:rsid w:val="00E618BF"/>
     <w:pPr>
       <w:tabs>
         <w:tab w:val="center" w:pos="4680"/>
@@ -1766,7 +1267,6 @@
     <w:basedOn w:val="DefaultParagraphFont"/>
     <w:link w:val="Footer"/>
     <w:uiPriority w:val="99"/>
-    <w:rsid w:val="00E618BF"/>
   </w:style>
   <w:style w:type="paragraph" w:styleId="Heading1">
     <w:name w:val="heading 1"/>
@@ -1775,11 +1275,10 @@
     <w:link w:val="Heading1Char"/>
     <w:uiPriority w:val="9"/>
     <w:qFormat/>
-    <w:rsid w:val="00FC693F"/>
     <w:pPr>
       <w:keepNext/>
       <w:keepLines/>
-      <w:spacing w:before="360" w:after="200" w:line="300" w:lineRule="auto"/>
+      <w:spacing w:before="360" w:after="200"/>
       <w:outlineLvl w:val="0"/>
     </w:pPr>
     <w:rPr>
@@ -1799,11 +1298,10 @@
     <w:uiPriority w:val="9"/>
     <w:unhideWhenUsed/>
     <w:qFormat/>
-    <w:rsid w:val="00FC693F"/>
     <w:pPr>
       <w:keepNext/>
       <w:keepLines/>
-      <w:spacing w:before="280" w:after="140" w:line="300" w:lineRule="auto"/>
+      <w:spacing w:before="280" w:after="140"/>
       <w:outlineLvl w:val="1"/>
     </w:pPr>
     <w:rPr>
@@ -1823,11 +1321,10 @@
     <w:uiPriority w:val="9"/>
     <w:unhideWhenUsed/>
     <w:qFormat/>
-    <w:rsid w:val="00FC693F"/>
     <w:pPr>
       <w:keepNext/>
       <w:keepLines/>
-      <w:spacing w:before="200" w:after="100" w:line="300" w:lineRule="auto"/>
+      <w:spacing w:before="200" w:after="100"/>
       <w:outlineLvl w:val="2"/>
     </w:pPr>
     <w:rPr>
@@ -1847,7 +1344,6 @@
     <w:semiHidden/>
     <w:unhideWhenUsed/>
     <w:qFormat/>
-    <w:rsid w:val="00FC693F"/>
     <w:pPr>
       <w:keepNext/>
       <w:keepLines/>
@@ -1872,7 +1368,6 @@
     <w:semiHidden/>
     <w:unhideWhenUsed/>
     <w:qFormat/>
-    <w:rsid w:val="00FC693F"/>
     <w:pPr>
       <w:keepNext/>
       <w:keepLines/>
@@ -1893,7 +1388,6 @@
     <w:semiHidden/>
     <w:unhideWhenUsed/>
     <w:qFormat/>
-    <w:rsid w:val="00FC693F"/>
     <w:pPr>
       <w:keepNext/>
       <w:keepLines/>
@@ -1916,7 +1410,6 @@
     <w:semiHidden/>
     <w:unhideWhenUsed/>
     <w:qFormat/>
-    <w:rsid w:val="00FC693F"/>
     <w:pPr>
       <w:keepNext/>
       <w:keepLines/>
@@ -1939,7 +1432,6 @@
     <w:semiHidden/>
     <w:unhideWhenUsed/>
     <w:qFormat/>
-    <w:rsid w:val="00FC693F"/>
     <w:pPr>
       <w:keepNext/>
       <w:keepLines/>
@@ -1962,7 +1454,6 @@
     <w:semiHidden/>
     <w:unhideWhenUsed/>
     <w:qFormat/>
-    <w:rsid w:val="00FC693F"/>
     <w:pPr>
       <w:keepNext/>
       <w:keepLines/>
@@ -2009,7 +1500,6 @@
     <w:name w:val="No Spacing"/>
     <w:uiPriority w:val="1"/>
     <w:qFormat/>
-    <w:rsid w:val="00FC693F"/>
     <w:pPr>
       <w:spacing w:after="0" w:line="240" w:lineRule="auto"/>
     </w:pPr>
@@ -2019,7 +1509,6 @@
     <w:basedOn w:val="DefaultParagraphFont"/>
     <w:link w:val="Heading1"/>
     <w:uiPriority w:val="9"/>
-    <w:rsid w:val="00FC693F"/>
     <w:rPr>
       <w:rFonts w:asciiTheme="majorHAnsi" w:eastAsiaTheme="majorEastAsia" w:hAnsiTheme="majorHAnsi" w:cstheme="majorBidi"/>
       <w:b/>
@@ -2034,7 +1523,6 @@
     <w:basedOn w:val="DefaultParagraphFont"/>
     <w:link w:val="Heading2"/>
     <w:uiPriority w:val="9"/>
-    <w:rsid w:val="00FC693F"/>
     <w:rPr>
       <w:rFonts w:asciiTheme="majorHAnsi" w:eastAsiaTheme="majorEastAsia" w:hAnsiTheme="majorHAnsi" w:cstheme="majorBidi"/>
       <w:b/>
@@ -2049,7 +1537,6 @@
     <w:basedOn w:val="DefaultParagraphFont"/>
     <w:link w:val="Heading3"/>
     <w:uiPriority w:val="9"/>
-    <w:rsid w:val="00FC693F"/>
     <w:rPr>
       <w:rFonts w:asciiTheme="majorHAnsi" w:eastAsiaTheme="majorEastAsia" w:hAnsiTheme="majorHAnsi" w:cstheme="majorBidi"/>
       <w:b/>
@@ -2064,7 +1551,6 @@
     <w:link w:val="TitleChar"/>
     <w:uiPriority w:val="10"/>
     <w:qFormat/>
-    <w:rsid w:val="00FC693F"/>
     <w:pPr>
       <w:pBdr>
         <w:bottom w:val="single" w:sz="8" w:space="4" w:color="4F81BD" w:themeColor="accent1"/>
@@ -2086,7 +1572,6 @@
     <w:basedOn w:val="DefaultParagraphFont"/>
     <w:link w:val="Title"/>
     <w:uiPriority w:val="10"/>
-    <w:rsid w:val="00FC693F"/>
     <w:rPr>
       <w:rFonts w:asciiTheme="majorHAnsi" w:eastAsiaTheme="majorEastAsia" w:hAnsiTheme="majorHAnsi" w:cstheme="majorBidi"/>
       <w:color w:val="17365D" w:themeColor="text2" w:themeShade="BF"/>
@@ -2103,7 +1588,6 @@
     <w:link w:val="SubtitleChar"/>
     <w:uiPriority w:val="11"/>
     <w:qFormat/>
-    <w:rsid w:val="00FC693F"/>
     <w:pPr>
       <w:numPr>
         <w:ilvl w:val="1"/>
@@ -2124,7 +1608,6 @@
     <w:basedOn w:val="DefaultParagraphFont"/>
     <w:link w:val="Subtitle"/>
     <w:uiPriority w:val="11"/>
-    <w:rsid w:val="00FC693F"/>
     <w:rPr>
       <w:rFonts w:asciiTheme="majorHAnsi" w:eastAsiaTheme="majorEastAsia" w:hAnsiTheme="majorHAnsi" w:cstheme="majorBidi"/>
       <w:i/>
@@ -2140,7 +1623,6 @@
     <w:basedOn w:val="Normal"/>
     <w:uiPriority w:val="34"/>
     <w:qFormat/>
-    <w:rsid w:val="00FC693F"/>
     <w:pPr>
       <w:ind w:left="720"/>
       <w:contextualSpacing/>
@@ -2152,7 +1634,6 @@
     <w:link w:val="BodyTextChar"/>
     <w:uiPriority w:val="99"/>
     <w:unhideWhenUsed/>
-    <w:rsid w:val="00AA1D8D"/>
     <w:pPr>
       <w:spacing w:after="120"/>
     </w:pPr>
@@ -2162,7 +1643,6 @@
     <w:basedOn w:val="DefaultParagraphFont"/>
     <w:link w:val="BodyText"/>
     <w:uiPriority w:val="99"/>
-    <w:rsid w:val="00AA1D8D"/>
   </w:style>
   <w:style w:type="paragraph" w:styleId="BodyText2">
     <w:name w:val="Body Text 2"/>
@@ -2170,7 +1650,6 @@
     <w:link w:val="BodyText2Char"/>
     <w:uiPriority w:val="99"/>
     <w:unhideWhenUsed/>
-    <w:rsid w:val="00AA1D8D"/>
     <w:pPr>
       <w:spacing w:after="120" w:line="480" w:lineRule="auto"/>
     </w:pPr>
@@ -2180,7 +1659,6 @@
     <w:basedOn w:val="DefaultParagraphFont"/>
     <w:link w:val="BodyText2"/>
     <w:uiPriority w:val="99"/>
-    <w:rsid w:val="00AA1D8D"/>
   </w:style>
   <w:style w:type="paragraph" w:styleId="BodyText3">
     <w:name w:val="Body Text 3"/>
@@ -2188,7 +1666,6 @@
     <w:link w:val="BodyText3Char"/>
     <w:uiPriority w:val="99"/>
     <w:unhideWhenUsed/>
-    <w:rsid w:val="00AA1D8D"/>
     <w:pPr>
       <w:spacing w:after="120"/>
     </w:pPr>
@@ -2202,7 +1679,6 @@
     <w:basedOn w:val="DefaultParagraphFont"/>
     <w:link w:val="BodyText3"/>
     <w:uiPriority w:val="99"/>
-    <w:rsid w:val="00AA1D8D"/>
     <w:rPr>
       <w:sz w:val="16"/>
       <w:szCs w:val="16"/>
@@ -2213,7 +1689,6 @@
     <w:basedOn w:val="Normal"/>
     <w:uiPriority w:val="99"/>
     <w:unhideWhenUsed/>
-    <w:rsid w:val="00AA1D8D"/>
     <w:pPr>
       <w:ind w:left="360" w:hanging="360"/>
       <w:contextualSpacing/>
@@ -2224,7 +1699,6 @@
     <w:basedOn w:val="Normal"/>
     <w:uiPriority w:val="99"/>
     <w:unhideWhenUsed/>
-    <w:rsid w:val="00326F90"/>
     <w:pPr>
       <w:ind w:left="720" w:hanging="360"/>
       <w:contextualSpacing/>
@@ -2235,7 +1709,6 @@
     <w:basedOn w:val="Normal"/>
     <w:uiPriority w:val="99"/>
     <w:unhideWhenUsed/>
-    <w:rsid w:val="00326F90"/>
     <w:pPr>
       <w:ind w:left="1080" w:hanging="360"/>
       <w:contextualSpacing/>
@@ -2246,20 +1719,24 @@
     <w:basedOn w:val="Normal"/>
     <w:uiPriority w:val="99"/>
     <w:unhideWhenUsed/>
-    <w:rsid w:val="00326F90"/>
     <w:pPr>
       <w:numPr>
         <w:numId w:val="1"/>
       </w:numPr>
+      <w:spacing w:after="80" w:line="300" w:lineRule="auto"/>
+      <w:ind w:left="540" w:hanging="271"/>
       <w:contextualSpacing/>
     </w:pPr>
+    <w:rPr>
+      <w:rFonts w:ascii="Calibri" w:hAnsi="Calibri" w:eastAsia="Microsoft YaHei"/>
+      <w:sz w:val="22"/>
+    </w:rPr>
   </w:style>
   <w:style w:type="paragraph" w:styleId="ListBullet2">
     <w:name w:val="List Bullet 2"/>
     <w:basedOn w:val="Normal"/>
     <w:uiPriority w:val="99"/>
     <w:unhideWhenUsed/>
-    <w:rsid w:val="00326F90"/>
     <w:pPr>
       <w:numPr>
         <w:numId w:val="2"/>
@@ -2272,7 +1749,6 @@
     <w:basedOn w:val="Normal"/>
     <w:uiPriority w:val="99"/>
     <w:unhideWhenUsed/>
-    <w:rsid w:val="00326F90"/>
     <w:pPr>
       <w:numPr>
         <w:numId w:val="3"/>
@@ -2285,20 +1761,24 @@
     <w:basedOn w:val="Normal"/>
     <w:uiPriority w:val="99"/>
     <w:unhideWhenUsed/>
-    <w:rsid w:val="00326F90"/>
     <w:pPr>
       <w:numPr>
         <w:numId w:val="5"/>
       </w:numPr>
+      <w:spacing w:after="80" w:line="300" w:lineRule="auto"/>
+      <w:ind w:left="540" w:hanging="271"/>
       <w:contextualSpacing/>
     </w:pPr>
+    <w:rPr>
+      <w:rFonts w:ascii="Calibri" w:hAnsi="Calibri" w:eastAsia="Microsoft YaHei"/>
+      <w:sz w:val="22"/>
+    </w:rPr>
   </w:style>
   <w:style w:type="paragraph" w:styleId="ListNumber2">
     <w:name w:val="List Number 2"/>
     <w:basedOn w:val="Normal"/>
     <w:uiPriority w:val="99"/>
     <w:unhideWhenUsed/>
-    <w:rsid w:val="0029639D"/>
     <w:pPr>
       <w:numPr>
         <w:numId w:val="6"/>
@@ -2311,7 +1791,6 @@
     <w:basedOn w:val="Normal"/>
     <w:uiPriority w:val="99"/>
     <w:unhideWhenUsed/>
-    <w:rsid w:val="0029639D"/>
     <w:pPr>
       <w:numPr>
         <w:numId w:val="7"/>
@@ -2324,7 +1803,6 @@
     <w:basedOn w:val="Normal"/>
     <w:uiPriority w:val="99"/>
     <w:unhideWhenUsed/>
-    <w:rsid w:val="0029639D"/>
     <w:pPr>
       <w:spacing w:after="120"/>
       <w:ind w:left="360"/>
@@ -2336,7 +1814,6 @@
     <w:basedOn w:val="Normal"/>
     <w:uiPriority w:val="99"/>
     <w:unhideWhenUsed/>
-    <w:rsid w:val="0029639D"/>
     <w:pPr>
       <w:spacing w:after="120"/>
       <w:ind w:left="720"/>
@@ -2348,7 +1825,6 @@
     <w:basedOn w:val="Normal"/>
     <w:uiPriority w:val="99"/>
     <w:unhideWhenUsed/>
-    <w:rsid w:val="0029639D"/>
     <w:pPr>
       <w:spacing w:after="120"/>
       <w:ind w:left="1080"/>
@@ -2360,7 +1836,6 @@
     <w:link w:val="MacroTextChar"/>
     <w:uiPriority w:val="99"/>
     <w:unhideWhenUsed/>
-    <w:rsid w:val="0029639D"/>
     <w:pPr>
       <w:tabs>
         <w:tab w:val="left" w:pos="576"/>
@@ -2383,7 +1858,6 @@
     <w:basedOn w:val="DefaultParagraphFont"/>
     <w:link w:val="MacroText"/>
     <w:uiPriority w:val="99"/>
-    <w:rsid w:val="0029639D"/>
     <w:rPr>
       <w:rFonts w:ascii="Courier" w:hAnsi="Courier"/>
       <w:sz w:val="20"/>
@@ -2397,7 +1871,6 @@
     <w:link w:val="QuoteChar"/>
     <w:uiPriority w:val="29"/>
     <w:qFormat/>
-    <w:rsid w:val="00FC693F"/>
     <w:rPr>
       <w:i/>
       <w:iCs/>
@@ -2409,7 +1882,6 @@
     <w:basedOn w:val="DefaultParagraphFont"/>
     <w:link w:val="Quote"/>
     <w:uiPriority w:val="29"/>
-    <w:rsid w:val="00FC693F"/>
     <w:rPr>
       <w:i/>
       <w:iCs/>
@@ -2422,7 +1894,6 @@
     <w:link w:val="Heading4"/>
     <w:uiPriority w:val="9"/>
     <w:semiHidden/>
-    <w:rsid w:val="00FC693F"/>
     <w:rPr>
       <w:rFonts w:asciiTheme="majorHAnsi" w:eastAsiaTheme="majorEastAsia" w:hAnsiTheme="majorHAnsi" w:cstheme="majorBidi"/>
       <w:b/>
@@ -2438,7 +1909,6 @@
     <w:link w:val="Heading5"/>
     <w:uiPriority w:val="9"/>
     <w:semiHidden/>
-    <w:rsid w:val="00FC693F"/>
     <w:rPr>
       <w:rFonts w:asciiTheme="majorHAnsi" w:eastAsiaTheme="majorEastAsia" w:hAnsiTheme="majorHAnsi" w:cstheme="majorBidi"/>
       <w:color w:val="243F60" w:themeColor="accent1" w:themeShade="7F"/>
@@ -2450,7 +1920,6 @@
     <w:link w:val="Heading6"/>
     <w:uiPriority w:val="9"/>
     <w:semiHidden/>
-    <w:rsid w:val="00FC693F"/>
     <w:rPr>
       <w:rFonts w:asciiTheme="majorHAnsi" w:eastAsiaTheme="majorEastAsia" w:hAnsiTheme="majorHAnsi" w:cstheme="majorBidi"/>
       <w:i/>
@@ -2464,7 +1933,6 @@
     <w:link w:val="Heading7"/>
     <w:uiPriority w:val="9"/>
     <w:semiHidden/>
-    <w:rsid w:val="00FC693F"/>
     <w:rPr>
       <w:rFonts w:asciiTheme="majorHAnsi" w:eastAsiaTheme="majorEastAsia" w:hAnsiTheme="majorHAnsi" w:cstheme="majorBidi"/>
       <w:i/>
@@ -2478,7 +1946,6 @@
     <w:link w:val="Heading8"/>
     <w:uiPriority w:val="9"/>
     <w:semiHidden/>
-    <w:rsid w:val="00FC693F"/>
     <w:rPr>
       <w:rFonts w:asciiTheme="majorHAnsi" w:eastAsiaTheme="majorEastAsia" w:hAnsiTheme="majorHAnsi" w:cstheme="majorBidi"/>
       <w:color w:val="4F81BD" w:themeColor="accent1"/>
@@ -2492,7 +1959,6 @@
     <w:link w:val="Heading9"/>
     <w:uiPriority w:val="9"/>
     <w:semiHidden/>
-    <w:rsid w:val="00FC693F"/>
     <w:rPr>
       <w:rFonts w:asciiTheme="majorHAnsi" w:eastAsiaTheme="majorEastAsia" w:hAnsiTheme="majorHAnsi" w:cstheme="majorBidi"/>
       <w:i/>
@@ -2510,7 +1976,6 @@
     <w:semiHidden/>
     <w:unhideWhenUsed/>
     <w:qFormat/>
-    <w:rsid w:val="00FC693F"/>
     <w:pPr>
       <w:spacing w:line="240" w:lineRule="auto"/>
     </w:pPr>
@@ -2527,7 +1992,6 @@
     <w:basedOn w:val="DefaultParagraphFont"/>
     <w:uiPriority w:val="22"/>
     <w:qFormat/>
-    <w:rsid w:val="00FC693F"/>
     <w:rPr>
       <w:b/>
       <w:bCs/>
@@ -2538,7 +2002,6 @@
     <w:basedOn w:val="DefaultParagraphFont"/>
     <w:uiPriority w:val="20"/>
     <w:qFormat/>
-    <w:rsid w:val="00FC693F"/>
     <w:rPr>
       <w:i/>
       <w:iCs/>
@@ -2551,7 +2014,6 @@
     <w:link w:val="IntenseQuoteChar"/>
     <w:uiPriority w:val="30"/>
     <w:qFormat/>
-    <w:rsid w:val="00FC693F"/>
     <w:pPr>
       <w:pBdr>
         <w:bottom w:val="single" w:sz="4" w:space="4" w:color="4F81BD" w:themeColor="accent1"/>
@@ -2572,7 +2034,6 @@
     <w:basedOn w:val="DefaultParagraphFont"/>
     <w:link w:val="IntenseQuote"/>
     <w:uiPriority w:val="30"/>
-    <w:rsid w:val="00FC693F"/>
     <w:rPr>
       <w:b/>
       <w:bCs/>
@@ -2586,7 +2047,6 @@
     <w:basedOn w:val="DefaultParagraphFont"/>
     <w:uiPriority w:val="19"/>
     <w:qFormat/>
-    <w:rsid w:val="00FC693F"/>
     <w:rPr>
       <w:i/>
       <w:iCs/>
@@ -2598,7 +2058,6 @@
     <w:basedOn w:val="DefaultParagraphFont"/>
     <w:uiPriority w:val="21"/>
     <w:qFormat/>
-    <w:rsid w:val="00FC693F"/>
     <w:rPr>
       <w:b/>
       <w:bCs/>
@@ -2612,7 +2071,6 @@
     <w:basedOn w:val="DefaultParagraphFont"/>
     <w:uiPriority w:val="31"/>
     <w:qFormat/>
-    <w:rsid w:val="00FC693F"/>
     <w:rPr>
       <w:smallCaps/>
       <w:color w:val="C0504D" w:themeColor="accent2"/>
@@ -2624,7 +2082,6 @@
     <w:basedOn w:val="DefaultParagraphFont"/>
     <w:uiPriority w:val="32"/>
     <w:qFormat/>
-    <w:rsid w:val="00FC693F"/>
     <w:rPr>
       <w:b/>
       <w:bCs/>
@@ -2639,7 +2096,6 @@
     <w:basedOn w:val="DefaultParagraphFont"/>
     <w:uiPriority w:val="33"/>
     <w:qFormat/>
-    <w:rsid w:val="00FC693F"/>
     <w:rPr>
       <w:b/>
       <w:bCs/>
@@ -2655,7 +2111,6 @@
     <w:semiHidden/>
     <w:unhideWhenUsed/>
     <w:qFormat/>
-    <w:rsid w:val="00FC693F"/>
     <w:pPr>
       <w:outlineLvl w:val="9"/>
     </w:pPr>
@@ -2664,7 +2119,6 @@
     <w:name w:val="Table Grid"/>
     <w:basedOn w:val="TableNormal"/>
     <w:uiPriority w:val="59"/>
-    <w:rsid w:val="00FC693F"/>
     <w:pPr>
       <w:spacing w:after="0" w:line="240" w:lineRule="auto"/>
     </w:pPr>
@@ -2690,7 +2144,6 @@
     <w:name w:val="Light Shading"/>
     <w:basedOn w:val="TableNormal"/>
     <w:uiPriority w:val="60"/>
-    <w:rsid w:val="00FC693F"/>
     <w:pPr>
       <w:spacing w:after="0" w:line="240" w:lineRule="auto"/>
     </w:pPr>
@@ -2793,7 +2246,6 @@
     <w:name w:val="Light Shading Accent 1"/>
     <w:basedOn w:val="TableNormal"/>
     <w:uiPriority w:val="60"/>
-    <w:rsid w:val="00FC693F"/>
     <w:pPr>
       <w:spacing w:after="0" w:line="240" w:lineRule="auto"/>
     </w:pPr>
@@ -2896,7 +2348,6 @@
     <w:name w:val="Light Shading Accent 2"/>
     <w:basedOn w:val="TableNormal"/>
     <w:uiPriority w:val="60"/>
-    <w:rsid w:val="00FC693F"/>
     <w:pPr>
       <w:spacing w:after="0" w:line="240" w:lineRule="auto"/>
     </w:pPr>
@@ -2999,7 +2450,6 @@
     <w:name w:val="Light Shading Accent 3"/>
     <w:basedOn w:val="TableNormal"/>
     <w:uiPriority w:val="60"/>
-    <w:rsid w:val="00FC693F"/>
     <w:pPr>
       <w:spacing w:after="0" w:line="240" w:lineRule="auto"/>
     </w:pPr>
@@ -3102,7 +2552,6 @@
     <w:name w:val="Light Shading Accent 4"/>
     <w:basedOn w:val="TableNormal"/>
     <w:uiPriority w:val="60"/>
-    <w:rsid w:val="00FC693F"/>
     <w:pPr>
       <w:spacing w:after="0" w:line="240" w:lineRule="auto"/>
     </w:pPr>
@@ -3205,7 +2654,6 @@
     <w:name w:val="Light Shading Accent 5"/>
     <w:basedOn w:val="TableNormal"/>
     <w:uiPriority w:val="60"/>
-    <w:rsid w:val="00FC693F"/>
     <w:pPr>
       <w:spacing w:after="0" w:line="240" w:lineRule="auto"/>
     </w:pPr>
@@ -3308,7 +2756,6 @@
     <w:name w:val="Light Shading Accent 6"/>
     <w:basedOn w:val="TableNormal"/>
     <w:uiPriority w:val="60"/>
-    <w:rsid w:val="00FC693F"/>
     <w:pPr>
       <w:spacing w:after="0" w:line="240" w:lineRule="auto"/>
     </w:pPr>
@@ -3411,7 +2858,6 @@
     <w:name w:val="Light List"/>
     <w:basedOn w:val="TableNormal"/>
     <w:uiPriority w:val="61"/>
-    <w:rsid w:val="00FC693F"/>
     <w:pPr>
       <w:spacing w:after="0" w:line="240" w:lineRule="auto"/>
     </w:pPr>
@@ -3503,7 +2949,6 @@
     <w:name w:val="Light List Accent 1"/>
     <w:basedOn w:val="TableNormal"/>
     <w:uiPriority w:val="61"/>
-    <w:rsid w:val="00FC693F"/>
     <w:pPr>
       <w:spacing w:after="0" w:line="240" w:lineRule="auto"/>
     </w:pPr>
@@ -3595,7 +3040,6 @@
     <w:name w:val="Light List Accent 2"/>
     <w:basedOn w:val="TableNormal"/>
     <w:uiPriority w:val="61"/>
-    <w:rsid w:val="00CB0664"/>
     <w:pPr>
       <w:spacing w:after="0" w:line="240" w:lineRule="auto"/>
     </w:pPr>
@@ -3687,7 +3131,6 @@
     <w:name w:val="Light List Accent 3"/>
     <w:basedOn w:val="TableNormal"/>
     <w:uiPriority w:val="61"/>
-    <w:rsid w:val="00CB0664"/>
     <w:pPr>
       <w:spacing w:after="0" w:line="240" w:lineRule="auto"/>
     </w:pPr>
@@ -3779,7 +3222,6 @@
     <w:name w:val="Light List Accent 4"/>
     <w:basedOn w:val="TableNormal"/>
     <w:uiPriority w:val="61"/>
-    <w:rsid w:val="00CB0664"/>
     <w:pPr>
       <w:spacing w:after="0" w:line="240" w:lineRule="auto"/>
     </w:pPr>
@@ -3871,7 +3313,6 @@
     <w:name w:val="Light List Accent 5"/>
     <w:basedOn w:val="TableNormal"/>
     <w:uiPriority w:val="61"/>
-    <w:rsid w:val="00CB0664"/>
     <w:pPr>
       <w:spacing w:after="0" w:line="240" w:lineRule="auto"/>
     </w:pPr>
@@ -3963,7 +3404,6 @@
     <w:name w:val="Light List Accent 6"/>
     <w:basedOn w:val="TableNormal"/>
     <w:uiPriority w:val="61"/>
-    <w:rsid w:val="00CB0664"/>
     <w:pPr>
       <w:spacing w:after="0" w:line="240" w:lineRule="auto"/>
     </w:pPr>
@@ -4055,7 +3495,6 @@
     <w:name w:val="Light Grid"/>
     <w:basedOn w:val="TableNormal"/>
     <w:uiPriority w:val="62"/>
-    <w:rsid w:val="00CB0664"/>
     <w:pPr>
       <w:spacing w:after="0" w:line="240" w:lineRule="auto"/>
     </w:pPr>
@@ -4185,7 +3624,6 @@
     <w:name w:val="Light Grid Accent 1"/>
     <w:basedOn w:val="TableNormal"/>
     <w:uiPriority w:val="62"/>
-    <w:rsid w:val="00CB0664"/>
     <w:pPr>
       <w:spacing w:after="0" w:line="240" w:lineRule="auto"/>
     </w:pPr>
@@ -4315,7 +3753,6 @@
     <w:name w:val="Light Grid Accent 2"/>
     <w:basedOn w:val="TableNormal"/>
     <w:uiPriority w:val="62"/>
-    <w:rsid w:val="00CB0664"/>
     <w:pPr>
       <w:spacing w:after="0" w:line="240" w:lineRule="auto"/>
     </w:pPr>
@@ -4445,7 +3882,6 @@
     <w:name w:val="Light Grid Accent 3"/>
     <w:basedOn w:val="TableNormal"/>
     <w:uiPriority w:val="62"/>
-    <w:rsid w:val="00CB0664"/>
     <w:pPr>
       <w:spacing w:after="0" w:line="240" w:lineRule="auto"/>
     </w:pPr>
@@ -4575,7 +4011,6 @@
     <w:name w:val="Light Grid Accent 4"/>
     <w:basedOn w:val="TableNormal"/>
     <w:uiPriority w:val="62"/>
-    <w:rsid w:val="00CB0664"/>
     <w:pPr>
       <w:spacing w:after="0" w:line="240" w:lineRule="auto"/>
     </w:pPr>
@@ -4705,7 +4140,6 @@
     <w:name w:val="Light Grid Accent 5"/>
     <w:basedOn w:val="TableNormal"/>
     <w:uiPriority w:val="62"/>
-    <w:rsid w:val="00CB0664"/>
     <w:pPr>
       <w:spacing w:after="0" w:line="240" w:lineRule="auto"/>
     </w:pPr>
@@ -4835,7 +4269,6 @@
     <w:name w:val="Light Grid Accent 6"/>
     <w:basedOn w:val="TableNormal"/>
     <w:uiPriority w:val="62"/>
-    <w:rsid w:val="00CB0664"/>
     <w:pPr>
       <w:spacing w:after="0" w:line="240" w:lineRule="auto"/>
     </w:pPr>
@@ -4965,7 +4398,6 @@
     <w:name w:val="Medium Shading 1"/>
     <w:basedOn w:val="TableNormal"/>
     <w:uiPriority w:val="63"/>
-    <w:rsid w:val="00CB0664"/>
     <w:pPr>
       <w:spacing w:after="0" w:line="240" w:lineRule="auto"/>
     </w:pPr>
@@ -5071,7 +4503,6 @@
     <w:name w:val="Medium Shading 1 Accent 1"/>
     <w:basedOn w:val="TableNormal"/>
     <w:uiPriority w:val="63"/>
-    <w:rsid w:val="00CB0664"/>
     <w:pPr>
       <w:spacing w:after="0" w:line="240" w:lineRule="auto"/>
     </w:pPr>
@@ -5177,7 +4608,6 @@
     <w:name w:val="Medium Shading 1 Accent 2"/>
     <w:basedOn w:val="TableNormal"/>
     <w:uiPriority w:val="63"/>
-    <w:rsid w:val="00CB0664"/>
     <w:pPr>
       <w:spacing w:after="0" w:line="240" w:lineRule="auto"/>
     </w:pPr>
@@ -5283,7 +4713,6 @@
     <w:name w:val="Medium Shading 1 Accent 3"/>
     <w:basedOn w:val="TableNormal"/>
     <w:uiPriority w:val="63"/>
-    <w:rsid w:val="00CB0664"/>
     <w:pPr>
       <w:spacing w:after="0" w:line="240" w:lineRule="auto"/>
     </w:pPr>
@@ -5389,7 +4818,6 @@
     <w:name w:val="Medium Shading 1 Accent 4"/>
     <w:basedOn w:val="TableNormal"/>
     <w:uiPriority w:val="63"/>
-    <w:rsid w:val="00CB0664"/>
     <w:pPr>
       <w:spacing w:after="0" w:line="240" w:lineRule="auto"/>
     </w:pPr>
@@ -5495,7 +4923,6 @@
     <w:name w:val="Medium Shading 1 Accent 5"/>
     <w:basedOn w:val="TableNormal"/>
     <w:uiPriority w:val="63"/>
-    <w:rsid w:val="00CB0664"/>
     <w:pPr>
       <w:spacing w:after="0" w:line="240" w:lineRule="auto"/>
     </w:pPr>
@@ -5601,7 +5028,6 @@
     <w:name w:val="Medium Shading 1 Accent 6"/>
     <w:basedOn w:val="TableNormal"/>
     <w:uiPriority w:val="63"/>
-    <w:rsid w:val="00CB0664"/>
     <w:pPr>
       <w:spacing w:after="0" w:line="240" w:lineRule="auto"/>
     </w:pPr>
@@ -5707,7 +5133,6 @@
     <w:name w:val="Medium Shading 2"/>
     <w:basedOn w:val="TableNormal"/>
     <w:uiPriority w:val="64"/>
-    <w:rsid w:val="00CB0664"/>
     <w:pPr>
       <w:spacing w:after="0" w:line="240" w:lineRule="auto"/>
     </w:pPr>
@@ -5856,7 +5281,6 @@
     <w:name w:val="Medium Shading 2 Accent 1"/>
     <w:basedOn w:val="TableNormal"/>
     <w:uiPriority w:val="64"/>
-    <w:rsid w:val="00CB0664"/>
     <w:pPr>
       <w:spacing w:after="0" w:line="240" w:lineRule="auto"/>
     </w:pPr>
@@ -6005,7 +5429,6 @@
     <w:name w:val="Medium Shading 2 Accent 2"/>
     <w:basedOn w:val="TableNormal"/>
     <w:uiPriority w:val="64"/>
-    <w:rsid w:val="00CB0664"/>
     <w:pPr>
       <w:spacing w:after="0" w:line="240" w:lineRule="auto"/>
     </w:pPr>
@@ -6154,7 +5577,6 @@
     <w:name w:val="Medium Shading 2 Accent 3"/>
     <w:basedOn w:val="TableNormal"/>
     <w:uiPriority w:val="64"/>
-    <w:rsid w:val="00CB0664"/>
     <w:pPr>
       <w:spacing w:after="0" w:line="240" w:lineRule="auto"/>
     </w:pPr>
@@ -6303,7 +5725,6 @@
     <w:name w:val="Medium Shading 2 Accent 4"/>
     <w:basedOn w:val="TableNormal"/>
     <w:uiPriority w:val="64"/>
-    <w:rsid w:val="00CB0664"/>
     <w:pPr>
       <w:spacing w:after="0" w:line="240" w:lineRule="auto"/>
     </w:pPr>
@@ -6452,7 +5873,6 @@
     <w:name w:val="Medium Shading 2 Accent 5"/>
     <w:basedOn w:val="TableNormal"/>
     <w:uiPriority w:val="64"/>
-    <w:rsid w:val="00CB0664"/>
     <w:pPr>
       <w:spacing w:after="0" w:line="240" w:lineRule="auto"/>
     </w:pPr>
@@ -6601,7 +6021,6 @@
     <w:name w:val="Medium Shading 2 Accent 6"/>
     <w:basedOn w:val="TableNormal"/>
     <w:uiPriority w:val="64"/>
-    <w:rsid w:val="00CB0664"/>
     <w:pPr>
       <w:spacing w:after="0" w:line="240" w:lineRule="auto"/>
     </w:pPr>
@@ -6750,7 +6169,6 @@
     <w:name w:val="Medium List 1"/>
     <w:basedOn w:val="TableNormal"/>
     <w:uiPriority w:val="65"/>
-    <w:rsid w:val="00CB0664"/>
     <w:pPr>
       <w:spacing w:after="0" w:line="240" w:lineRule="auto"/>
     </w:pPr>
@@ -6834,7 +6252,6 @@
     <w:name w:val="Medium List 1 Accent 1"/>
     <w:basedOn w:val="TableNormal"/>
     <w:uiPriority w:val="65"/>
-    <w:rsid w:val="00CB0664"/>
     <w:pPr>
       <w:spacing w:after="0" w:line="240" w:lineRule="auto"/>
     </w:pPr>
@@ -6918,7 +6335,6 @@
     <w:name w:val="Medium List 1 Accent 2"/>
     <w:basedOn w:val="TableNormal"/>
     <w:uiPriority w:val="65"/>
-    <w:rsid w:val="00CB0664"/>
     <w:pPr>
       <w:spacing w:after="0" w:line="240" w:lineRule="auto"/>
     </w:pPr>
@@ -7002,7 +6418,6 @@
     <w:name w:val="Medium List 1 Accent 3"/>
     <w:basedOn w:val="TableNormal"/>
     <w:uiPriority w:val="65"/>
-    <w:rsid w:val="00CB0664"/>
     <w:pPr>
       <w:spacing w:after="0" w:line="240" w:lineRule="auto"/>
     </w:pPr>
@@ -7086,7 +6501,6 @@
     <w:name w:val="Medium List 1 Accent 4"/>
     <w:basedOn w:val="TableNormal"/>
     <w:uiPriority w:val="65"/>
-    <w:rsid w:val="00CB0664"/>
     <w:pPr>
       <w:spacing w:after="0" w:line="240" w:lineRule="auto"/>
     </w:pPr>
@@ -7170,7 +6584,6 @@
     <w:name w:val="Medium List 1 Accent 5"/>
     <w:basedOn w:val="TableNormal"/>
     <w:uiPriority w:val="65"/>
-    <w:rsid w:val="00CB0664"/>
     <w:pPr>
       <w:spacing w:after="0" w:line="240" w:lineRule="auto"/>
     </w:pPr>
@@ -7254,7 +6667,6 @@
     <w:name w:val="Medium List 1 Accent 6"/>
     <w:basedOn w:val="TableNormal"/>
     <w:uiPriority w:val="65"/>
-    <w:rsid w:val="00CB0664"/>
     <w:pPr>
       <w:spacing w:after="0" w:line="240" w:lineRule="auto"/>
     </w:pPr>
@@ -7338,7 +6750,6 @@
     <w:name w:val="Medium List 2"/>
     <w:basedOn w:val="TableNormal"/>
     <w:uiPriority w:val="66"/>
-    <w:rsid w:val="00CB0664"/>
     <w:pPr>
       <w:spacing w:after="0" w:line="240" w:lineRule="auto"/>
     </w:pPr>
@@ -7466,7 +6877,6 @@
     <w:name w:val="Medium List 2 Accent 1"/>
     <w:basedOn w:val="TableNormal"/>
     <w:uiPriority w:val="66"/>
-    <w:rsid w:val="00CB0664"/>
     <w:pPr>
       <w:spacing w:after="0" w:line="240" w:lineRule="auto"/>
     </w:pPr>
@@ -7594,7 +7004,6 @@
     <w:name w:val="Medium List 2 Accent 2"/>
     <w:basedOn w:val="TableNormal"/>
     <w:uiPriority w:val="66"/>
-    <w:rsid w:val="00CB0664"/>
     <w:pPr>
       <w:spacing w:after="0" w:line="240" w:lineRule="auto"/>
     </w:pPr>
@@ -7722,7 +7131,6 @@
     <w:name w:val="Medium List 2 Accent 3"/>
     <w:basedOn w:val="TableNormal"/>
     <w:uiPriority w:val="66"/>
-    <w:rsid w:val="00CB0664"/>
     <w:pPr>
       <w:spacing w:after="0" w:line="240" w:lineRule="auto"/>
     </w:pPr>
@@ -7850,7 +7258,6 @@
     <w:name w:val="Medium List 2 Accent 4"/>
     <w:basedOn w:val="TableNormal"/>
     <w:uiPriority w:val="66"/>
-    <w:rsid w:val="00CB0664"/>
     <w:pPr>
       <w:spacing w:after="0" w:line="240" w:lineRule="auto"/>
     </w:pPr>
@@ -7978,7 +7385,6 @@
     <w:name w:val="Medium List 2 Accent 5"/>
     <w:basedOn w:val="TableNormal"/>
     <w:uiPriority w:val="66"/>
-    <w:rsid w:val="00CB0664"/>
     <w:pPr>
       <w:spacing w:after="0" w:line="240" w:lineRule="auto"/>
     </w:pPr>
@@ -8106,7 +7512,6 @@
     <w:name w:val="Medium List 2 Accent 6"/>
     <w:basedOn w:val="TableNormal"/>
     <w:uiPriority w:val="66"/>
-    <w:rsid w:val="00CB0664"/>
     <w:pPr>
       <w:spacing w:after="0" w:line="240" w:lineRule="auto"/>
     </w:pPr>
@@ -8234,7 +7639,6 @@
     <w:name w:val="Medium Grid 1"/>
     <w:basedOn w:val="TableNormal"/>
     <w:uiPriority w:val="67"/>
-    <w:rsid w:val="00CB0664"/>
     <w:pPr>
       <w:spacing w:after="0" w:line="240" w:lineRule="auto"/>
     </w:pPr>
@@ -8307,7 +7711,6 @@
     <w:name w:val="Medium Grid 1 Accent 1"/>
     <w:basedOn w:val="TableNormal"/>
     <w:uiPriority w:val="67"/>
-    <w:rsid w:val="00CB0664"/>
     <w:pPr>
       <w:spacing w:after="0" w:line="240" w:lineRule="auto"/>
     </w:pPr>
@@ -8380,7 +7783,6 @@
     <w:name w:val="Medium Grid 1 Accent 2"/>
     <w:basedOn w:val="TableNormal"/>
     <w:uiPriority w:val="67"/>
-    <w:rsid w:val="00CB0664"/>
     <w:pPr>
       <w:spacing w:after="0" w:line="240" w:lineRule="auto"/>
     </w:pPr>
@@ -8453,7 +7855,6 @@
     <w:name w:val="Medium Grid 1 Accent 3"/>
     <w:basedOn w:val="TableNormal"/>
     <w:uiPriority w:val="67"/>
-    <w:rsid w:val="00CB0664"/>
     <w:pPr>
       <w:spacing w:after="0" w:line="240" w:lineRule="auto"/>
     </w:pPr>
@@ -8526,7 +7927,6 @@
     <w:name w:val="Medium Grid 1 Accent 4"/>
     <w:basedOn w:val="TableNormal"/>
     <w:uiPriority w:val="67"/>
-    <w:rsid w:val="00CB0664"/>
     <w:pPr>
       <w:spacing w:after="0" w:line="240" w:lineRule="auto"/>
     </w:pPr>
@@ -8599,7 +7999,6 @@
     <w:name w:val="Medium Grid 1 Accent 5"/>
     <w:basedOn w:val="TableNormal"/>
     <w:uiPriority w:val="67"/>
-    <w:rsid w:val="00CB0664"/>
     <w:pPr>
       <w:spacing w:after="0" w:line="240" w:lineRule="auto"/>
     </w:pPr>
@@ -8672,7 +8071,6 @@
     <w:name w:val="Medium Grid 1 Accent 6"/>
     <w:basedOn w:val="TableNormal"/>
     <w:uiPriority w:val="67"/>
-    <w:rsid w:val="00CB0664"/>
     <w:pPr>
       <w:spacing w:after="0" w:line="240" w:lineRule="auto"/>
     </w:pPr>
@@ -8745,7 +8143,6 @@
     <w:name w:val="Medium Grid 2"/>
     <w:basedOn w:val="TableNormal"/>
     <w:uiPriority w:val="68"/>
-    <w:rsid w:val="00CB0664"/>
     <w:pPr>
       <w:spacing w:after="0" w:line="240" w:lineRule="auto"/>
     </w:pPr>
@@ -8870,7 +8267,6 @@
     <w:name w:val="Medium Grid 2 Accent 1"/>
     <w:basedOn w:val="TableNormal"/>
     <w:uiPriority w:val="68"/>
-    <w:rsid w:val="00CB0664"/>
     <w:pPr>
       <w:spacing w:after="0" w:line="240" w:lineRule="auto"/>
     </w:pPr>
@@ -8995,7 +8391,6 @@
     <w:name w:val="Medium Grid 2 Accent 2"/>
     <w:basedOn w:val="TableNormal"/>
     <w:uiPriority w:val="68"/>
-    <w:rsid w:val="00CB0664"/>
     <w:pPr>
       <w:spacing w:after="0" w:line="240" w:lineRule="auto"/>
     </w:pPr>
@@ -9120,7 +8515,6 @@
     <w:name w:val="Medium Grid 2 Accent 3"/>
     <w:basedOn w:val="TableNormal"/>
     <w:uiPriority w:val="68"/>
-    <w:rsid w:val="00CB0664"/>
     <w:pPr>
       <w:spacing w:after="0" w:line="240" w:lineRule="auto"/>
     </w:pPr>
@@ -9245,7 +8639,6 @@
     <w:name w:val="Medium Grid 2 Accent 4"/>
     <w:basedOn w:val="TableNormal"/>
     <w:uiPriority w:val="68"/>
-    <w:rsid w:val="00CB0664"/>
     <w:pPr>
       <w:spacing w:after="0" w:line="240" w:lineRule="auto"/>
     </w:pPr>
@@ -9370,7 +8763,6 @@
     <w:name w:val="Medium Grid 2 Accent 5"/>
     <w:basedOn w:val="TableNormal"/>
     <w:uiPriority w:val="68"/>
-    <w:rsid w:val="00CB0664"/>
     <w:pPr>
       <w:spacing w:after="0" w:line="240" w:lineRule="auto"/>
     </w:pPr>
@@ -9495,7 +8887,6 @@
     <w:name w:val="Medium Grid 2 Accent 6"/>
     <w:basedOn w:val="TableNormal"/>
     <w:uiPriority w:val="68"/>
-    <w:rsid w:val="00CB0664"/>
     <w:pPr>
       <w:spacing w:after="0" w:line="240" w:lineRule="auto"/>
     </w:pPr>
@@ -9620,7 +9011,6 @@
     <w:name w:val="Medium Grid 3"/>
     <w:basedOn w:val="TableNormal"/>
     <w:uiPriority w:val="69"/>
-    <w:rsid w:val="00CB0664"/>
     <w:pPr>
       <w:spacing w:after="0" w:line="240" w:lineRule="auto"/>
     </w:pPr>
@@ -9761,7 +9151,6 @@
     <w:name w:val="Medium Grid 3 Accent 1"/>
     <w:basedOn w:val="TableNormal"/>
     <w:uiPriority w:val="69"/>
-    <w:rsid w:val="00CB0664"/>
     <w:pPr>
       <w:spacing w:after="0" w:line="240" w:lineRule="auto"/>
     </w:pPr>
@@ -9902,7 +9291,6 @@
     <w:name w:val="Medium Grid 3 Accent 2"/>
     <w:basedOn w:val="TableNormal"/>
     <w:uiPriority w:val="69"/>
-    <w:rsid w:val="00CB0664"/>
     <w:pPr>
       <w:spacing w:after="0" w:line="240" w:lineRule="auto"/>
     </w:pPr>
@@ -10043,7 +9431,6 @@
     <w:name w:val="Medium Grid 3 Accent 3"/>
     <w:basedOn w:val="TableNormal"/>
     <w:uiPriority w:val="69"/>
-    <w:rsid w:val="00CB0664"/>
     <w:pPr>
       <w:spacing w:after="0" w:line="240" w:lineRule="auto"/>
     </w:pPr>
@@ -10184,7 +9571,6 @@
     <w:name w:val="Medium Grid 3 Accent 4"/>
     <w:basedOn w:val="TableNormal"/>
     <w:uiPriority w:val="69"/>
-    <w:rsid w:val="00CB0664"/>
     <w:pPr>
       <w:spacing w:after="0" w:line="240" w:lineRule="auto"/>
     </w:pPr>
@@ -10325,7 +9711,6 @@
     <w:name w:val="Medium Grid 3 Accent 5"/>
     <w:basedOn w:val="TableNormal"/>
     <w:uiPriority w:val="69"/>
-    <w:rsid w:val="00CB0664"/>
     <w:pPr>
       <w:spacing w:after="0" w:line="240" w:lineRule="auto"/>
     </w:pPr>
@@ -10466,7 +9851,6 @@
     <w:name w:val="Medium Grid 3 Accent 6"/>
     <w:basedOn w:val="TableNormal"/>
     <w:uiPriority w:val="69"/>
-    <w:rsid w:val="00CB0664"/>
     <w:pPr>
       <w:spacing w:after="0" w:line="240" w:lineRule="auto"/>
     </w:pPr>
@@ -10607,7 +9991,6 @@
     <w:name w:val="Dark List"/>
     <w:basedOn w:val="TableNormal"/>
     <w:uiPriority w:val="70"/>
-    <w:rsid w:val="00CB0664"/>
     <w:pPr>
       <w:spacing w:after="0" w:line="240" w:lineRule="auto"/>
     </w:pPr>
@@ -10721,7 +10104,6 @@
     <w:name w:val="Dark List Accent 1"/>
     <w:basedOn w:val="TableNormal"/>
     <w:uiPriority w:val="70"/>
-    <w:rsid w:val="00CB0664"/>
     <w:pPr>
       <w:spacing w:after="0" w:line="240" w:lineRule="auto"/>
     </w:pPr>
@@ -10835,7 +10217,6 @@
     <w:name w:val="Dark List Accent 2"/>
     <w:basedOn w:val="TableNormal"/>
     <w:uiPriority w:val="70"/>
-    <w:rsid w:val="00CB0664"/>
     <w:pPr>
       <w:spacing w:after="0" w:line="240" w:lineRule="auto"/>
     </w:pPr>
@@ -10949,7 +10330,6 @@
     <w:name w:val="Dark List Accent 3"/>
     <w:basedOn w:val="TableNormal"/>
     <w:uiPriority w:val="70"/>
-    <w:rsid w:val="00CB0664"/>
     <w:pPr>
       <w:spacing w:after="0" w:line="240" w:lineRule="auto"/>
     </w:pPr>
@@ -11063,7 +10443,6 @@
     <w:name w:val="Dark List Accent 4"/>
     <w:basedOn w:val="TableNormal"/>
     <w:uiPriority w:val="70"/>
-    <w:rsid w:val="00CB0664"/>
     <w:pPr>
       <w:spacing w:after="0" w:line="240" w:lineRule="auto"/>
     </w:pPr>
@@ -11177,7 +10556,6 @@
     <w:name w:val="Dark List Accent 5"/>
     <w:basedOn w:val="TableNormal"/>
     <w:uiPriority w:val="70"/>
-    <w:rsid w:val="00CB0664"/>
     <w:pPr>
       <w:spacing w:after="0" w:line="240" w:lineRule="auto"/>
     </w:pPr>
@@ -11291,7 +10669,6 @@
     <w:name w:val="Dark List Accent 6"/>
     <w:basedOn w:val="TableNormal"/>
     <w:uiPriority w:val="70"/>
-    <w:rsid w:val="00CB0664"/>
     <w:pPr>
       <w:spacing w:after="0" w:line="240" w:lineRule="auto"/>
     </w:pPr>
@@ -11405,7 +10782,6 @@
     <w:name w:val="Colorful Shading"/>
     <w:basedOn w:val="TableNormal"/>
     <w:uiPriority w:val="71"/>
-    <w:rsid w:val="00CB0664"/>
     <w:pPr>
       <w:spacing w:after="0" w:line="240" w:lineRule="auto"/>
     </w:pPr>
@@ -11527,7 +10903,6 @@
     <w:name w:val="Colorful Shading Accent 1"/>
     <w:basedOn w:val="TableNormal"/>
     <w:uiPriority w:val="71"/>
-    <w:rsid w:val="00CB0664"/>
     <w:pPr>
       <w:spacing w:after="0" w:line="240" w:lineRule="auto"/>
     </w:pPr>
@@ -11649,7 +11024,6 @@
     <w:name w:val="Colorful Shading Accent 2"/>
     <w:basedOn w:val="TableNormal"/>
     <w:uiPriority w:val="71"/>
-    <w:rsid w:val="00CB0664"/>
     <w:pPr>
       <w:spacing w:after="0" w:line="240" w:lineRule="auto"/>
     </w:pPr>
@@ -11771,7 +11145,6 @@
     <w:name w:val="Colorful Shading Accent 3"/>
     <w:basedOn w:val="TableNormal"/>
     <w:uiPriority w:val="71"/>
-    <w:rsid w:val="00CB0664"/>
     <w:pPr>
       <w:spacing w:after="0" w:line="240" w:lineRule="auto"/>
     </w:pPr>
@@ -11883,7 +11256,6 @@
     <w:name w:val="Colorful Shading Accent 4"/>
     <w:basedOn w:val="TableNormal"/>
     <w:uiPriority w:val="71"/>
-    <w:rsid w:val="00CB0664"/>
     <w:pPr>
       <w:spacing w:after="0" w:line="240" w:lineRule="auto"/>
     </w:pPr>
@@ -12005,7 +11377,6 @@
     <w:name w:val="Colorful Shading Accent 5"/>
     <w:basedOn w:val="TableNormal"/>
     <w:uiPriority w:val="71"/>
-    <w:rsid w:val="00CB0664"/>
     <w:pPr>
       <w:spacing w:after="0" w:line="240" w:lineRule="auto"/>
     </w:pPr>
@@ -12127,7 +11498,6 @@
     <w:name w:val="Colorful Shading Accent 6"/>
     <w:basedOn w:val="TableNormal"/>
     <w:uiPriority w:val="71"/>
-    <w:rsid w:val="00CB0664"/>
     <w:pPr>
       <w:spacing w:after="0" w:line="240" w:lineRule="auto"/>
     </w:pPr>
@@ -12249,7 +11619,6 @@
     <w:name w:val="Colorful List"/>
     <w:basedOn w:val="TableNormal"/>
     <w:uiPriority w:val="72"/>
-    <w:rsid w:val="00CB0664"/>
     <w:pPr>
       <w:spacing w:after="0" w:line="240" w:lineRule="auto"/>
     </w:pPr>
@@ -12335,7 +11704,6 @@
     <w:name w:val="Colorful List Accent 1"/>
     <w:basedOn w:val="TableNormal"/>
     <w:uiPriority w:val="72"/>
-    <w:rsid w:val="00CB0664"/>
     <w:pPr>
       <w:spacing w:after="0" w:line="240" w:lineRule="auto"/>
     </w:pPr>
@@ -12421,7 +11789,6 @@
     <w:name w:val="Colorful List Accent 2"/>
     <w:basedOn w:val="TableNormal"/>
     <w:uiPriority w:val="72"/>
-    <w:rsid w:val="00CB0664"/>
     <w:pPr>
       <w:spacing w:after="0" w:line="240" w:lineRule="auto"/>
     </w:pPr>
@@ -12507,7 +11874,6 @@
     <w:name w:val="Colorful List Accent 3"/>
     <w:basedOn w:val="TableNormal"/>
     <w:uiPriority w:val="72"/>
-    <w:rsid w:val="00CB0664"/>
     <w:pPr>
       <w:spacing w:after="0" w:line="240" w:lineRule="auto"/>
     </w:pPr>
@@ -12593,7 +11959,6 @@
     <w:name w:val="Colorful List Accent 4"/>
     <w:basedOn w:val="TableNormal"/>
     <w:uiPriority w:val="72"/>
-    <w:rsid w:val="00CB0664"/>
     <w:pPr>
       <w:spacing w:after="0" w:line="240" w:lineRule="auto"/>
     </w:pPr>
@@ -12679,7 +12044,6 @@
     <w:name w:val="Colorful List Accent 5"/>
     <w:basedOn w:val="TableNormal"/>
     <w:uiPriority w:val="72"/>
-    <w:rsid w:val="00CB0664"/>
     <w:pPr>
       <w:spacing w:after="0" w:line="240" w:lineRule="auto"/>
     </w:pPr>
@@ -12765,7 +12129,6 @@
     <w:name w:val="Colorful List Accent 6"/>
     <w:basedOn w:val="TableNormal"/>
     <w:uiPriority w:val="72"/>
-    <w:rsid w:val="00CB0664"/>
     <w:pPr>
       <w:spacing w:after="0" w:line="240" w:lineRule="auto"/>
     </w:pPr>
@@ -12851,7 +12214,6 @@
     <w:name w:val="Colorful Grid"/>
     <w:basedOn w:val="TableNormal"/>
     <w:uiPriority w:val="73"/>
-    <w:rsid w:val="00CB0664"/>
     <w:pPr>
       <w:spacing w:after="0" w:line="240" w:lineRule="auto"/>
     </w:pPr>
@@ -12931,7 +12293,6 @@
     <w:name w:val="Colorful Grid Accent 1"/>
     <w:basedOn w:val="TableNormal"/>
     <w:uiPriority w:val="73"/>
-    <w:rsid w:val="00CB0664"/>
     <w:pPr>
       <w:spacing w:after="0" w:line="240" w:lineRule="auto"/>
     </w:pPr>
@@ -13011,7 +12372,6 @@
     <w:name w:val="Colorful Grid Accent 2"/>
     <w:basedOn w:val="TableNormal"/>
     <w:uiPriority w:val="73"/>
-    <w:rsid w:val="00CB0664"/>
     <w:pPr>
       <w:spacing w:after="0" w:line="240" w:lineRule="auto"/>
     </w:pPr>
@@ -13091,7 +12451,6 @@
     <w:name w:val="Colorful Grid Accent 3"/>
     <w:basedOn w:val="TableNormal"/>
     <w:uiPriority w:val="73"/>
-    <w:rsid w:val="00CB0664"/>
     <w:pPr>
       <w:spacing w:after="0" w:line="240" w:lineRule="auto"/>
     </w:pPr>
@@ -13171,7 +12530,6 @@
     <w:name w:val="Colorful Grid Accent 4"/>
     <w:basedOn w:val="TableNormal"/>
     <w:uiPriority w:val="73"/>
-    <w:rsid w:val="00CB0664"/>
     <w:pPr>
       <w:spacing w:after="0" w:line="240" w:lineRule="auto"/>
     </w:pPr>
@@ -13251,7 +12609,6 @@
     <w:name w:val="Colorful Grid Accent 5"/>
     <w:basedOn w:val="TableNormal"/>
     <w:uiPriority w:val="73"/>
-    <w:rsid w:val="00CB0664"/>
     <w:pPr>
       <w:spacing w:after="0" w:line="240" w:lineRule="auto"/>
     </w:pPr>
@@ -13331,7 +12688,6 @@
     <w:name w:val="Colorful Grid Accent 6"/>
     <w:basedOn w:val="TableNormal"/>
     <w:uiPriority w:val="73"/>
-    <w:rsid w:val="00CB0664"/>
     <w:pPr>
       <w:spacing w:after="0" w:line="240" w:lineRule="auto"/>
     </w:pPr>
@@ -13569,7 +12925,6 @@
   <w:style w:type="paragraph" w:default="1" w:styleId="Normal">
     <w:name w:val="Normal"/>
     <w:qFormat/>
-    <w:rsid w:val="00FC693F"/>
   </w:style>
   <w:style w:type="paragraph" w:styleId="Heading1">
     <w:name w:val="heading 1"/>
@@ -13578,7 +12933,6 @@
     <w:link w:val="Heading1Char"/>
     <w:uiPriority w:val="9"/>
     <w:qFormat/>
-    <w:rsid w:val="00FC693F"/>
     <w:pPr>
       <w:keepNext/>
       <w:keepLines/>
@@ -13602,7 +12956,6 @@
     <w:uiPriority w:val="9"/>
     <w:unhideWhenUsed/>
     <w:qFormat/>
-    <w:rsid w:val="00FC693F"/>
     <w:pPr>
       <w:keepNext/>
       <w:keepLines/>
@@ -13626,7 +12979,6 @@
     <w:uiPriority w:val="9"/>
     <w:unhideWhenUsed/>
     <w:qFormat/>
-    <w:rsid w:val="00FC693F"/>
     <w:pPr>
       <w:keepNext/>
       <w:keepLines/>
@@ -13649,7 +13001,6 @@
     <w:semiHidden/>
     <w:unhideWhenUsed/>
     <w:qFormat/>
-    <w:rsid w:val="00FC693F"/>
     <w:pPr>
       <w:keepNext/>
       <w:keepLines/>
@@ -13674,7 +13025,6 @@
     <w:semiHidden/>
     <w:unhideWhenUsed/>
     <w:qFormat/>
-    <w:rsid w:val="00FC693F"/>
     <w:pPr>
       <w:keepNext/>
       <w:keepLines/>
@@ -13695,7 +13045,6 @@
     <w:semiHidden/>
     <w:unhideWhenUsed/>
     <w:qFormat/>
-    <w:rsid w:val="00FC693F"/>
     <w:pPr>
       <w:keepNext/>
       <w:keepLines/>
@@ -13718,7 +13067,6 @@
     <w:semiHidden/>
     <w:unhideWhenUsed/>
     <w:qFormat/>
-    <w:rsid w:val="00FC693F"/>
     <w:pPr>
       <w:keepNext/>
       <w:keepLines/>
@@ -13741,7 +13089,6 @@
     <w:semiHidden/>
     <w:unhideWhenUsed/>
     <w:qFormat/>
-    <w:rsid w:val="00FC693F"/>
     <w:pPr>
       <w:keepNext/>
       <w:keepLines/>
@@ -13764,7 +13111,6 @@
     <w:semiHidden/>
     <w:unhideWhenUsed/>
     <w:qFormat/>
-    <w:rsid w:val="00FC693F"/>
     <w:pPr>
       <w:keepNext/>
       <w:keepLines/>
@@ -13811,7 +13157,6 @@
     <w:name w:val="No Spacing"/>
     <w:uiPriority w:val="1"/>
     <w:qFormat/>
-    <w:rsid w:val="00FC693F"/>
     <w:pPr>
       <w:spacing w:after="0" w:line="240" w:lineRule="auto"/>
     </w:pPr>
@@ -13821,7 +13166,6 @@
     <w:basedOn w:val="DefaultParagraphFont"/>
     <w:link w:val="Heading1"/>
     <w:uiPriority w:val="9"/>
-    <w:rsid w:val="00FC693F"/>
     <w:rPr>
       <w:rFonts w:asciiTheme="majorHAnsi" w:eastAsiaTheme="majorEastAsia" w:hAnsiTheme="majorHAnsi" w:cstheme="majorBidi"/>
       <w:b/>
@@ -13836,7 +13180,6 @@
     <w:basedOn w:val="DefaultParagraphFont"/>
     <w:link w:val="Heading2"/>
     <w:uiPriority w:val="9"/>
-    <w:rsid w:val="00FC693F"/>
     <w:rPr>
       <w:rFonts w:asciiTheme="majorHAnsi" w:eastAsiaTheme="majorEastAsia" w:hAnsiTheme="majorHAnsi" w:cstheme="majorBidi"/>
       <w:b/>
@@ -13851,7 +13194,6 @@
     <w:basedOn w:val="DefaultParagraphFont"/>
     <w:link w:val="Heading3"/>
     <w:uiPriority w:val="9"/>
-    <w:rsid w:val="00FC693F"/>
     <w:rPr>
       <w:rFonts w:asciiTheme="majorHAnsi" w:eastAsiaTheme="majorEastAsia" w:hAnsiTheme="majorHAnsi" w:cstheme="majorBidi"/>
       <w:b/>
@@ -13866,7 +13208,6 @@
     <w:link w:val="TitleChar"/>
     <w:uiPriority w:val="10"/>
     <w:qFormat/>
-    <w:rsid w:val="00FC693F"/>
     <w:pPr>
       <w:pBdr>
         <w:bottom w:val="single" w:sz="8" w:space="4" w:color="4F81BD" w:themeColor="accent1"/>
@@ -13888,7 +13229,6 @@
     <w:basedOn w:val="DefaultParagraphFont"/>
     <w:link w:val="Title"/>
     <w:uiPriority w:val="10"/>
-    <w:rsid w:val="00FC693F"/>
     <w:rPr>
       <w:rFonts w:asciiTheme="majorHAnsi" w:eastAsiaTheme="majorEastAsia" w:hAnsiTheme="majorHAnsi" w:cstheme="majorBidi"/>
       <w:color w:val="17365D" w:themeColor="text2" w:themeShade="BF"/>
@@ -13905,7 +13245,6 @@
     <w:link w:val="SubtitleChar"/>
     <w:uiPriority w:val="11"/>
     <w:qFormat/>
-    <w:rsid w:val="00FC693F"/>
     <w:pPr>
       <w:numPr>
         <w:ilvl w:val="1"/>
@@ -13926,7 +13265,6 @@
     <w:basedOn w:val="DefaultParagraphFont"/>
     <w:link w:val="Subtitle"/>
     <w:uiPriority w:val="11"/>
-    <w:rsid w:val="00FC693F"/>
     <w:rPr>
       <w:rFonts w:asciiTheme="majorHAnsi" w:eastAsiaTheme="majorEastAsia" w:hAnsiTheme="majorHAnsi" w:cstheme="majorBidi"/>
       <w:i/>
@@ -13942,7 +13280,6 @@
     <w:basedOn w:val="Normal"/>
     <w:uiPriority w:val="34"/>
     <w:qFormat/>
-    <w:rsid w:val="00FC693F"/>
     <w:pPr>
       <w:ind w:left="720"/>
       <w:contextualSpacing/>
@@ -13954,7 +13291,6 @@
     <w:link w:val="BodyTextChar"/>
     <w:uiPriority w:val="99"/>
     <w:unhideWhenUsed/>
-    <w:rsid w:val="00AA1D8D"/>
     <w:pPr>
       <w:spacing w:after="120"/>
     </w:pPr>
@@ -13964,7 +13300,6 @@
     <w:basedOn w:val="DefaultParagraphFont"/>
     <w:link w:val="BodyText"/>
     <w:uiPriority w:val="99"/>
-    <w:rsid w:val="00AA1D8D"/>
   </w:style>
   <w:style w:type="paragraph" w:styleId="BodyText2">
     <w:name w:val="Body Text 2"/>
@@ -13972,7 +13307,6 @@
     <w:link w:val="BodyText2Char"/>
     <w:uiPriority w:val="99"/>
     <w:unhideWhenUsed/>
-    <w:rsid w:val="00AA1D8D"/>
     <w:pPr>
       <w:spacing w:after="120" w:line="480" w:lineRule="auto"/>
     </w:pPr>
@@ -13982,7 +13316,6 @@
     <w:basedOn w:val="DefaultParagraphFont"/>
     <w:link w:val="BodyText2"/>
     <w:uiPriority w:val="99"/>
-    <w:rsid w:val="00AA1D8D"/>
   </w:style>
   <w:style w:type="paragraph" w:styleId="BodyText3">
     <w:name w:val="Body Text 3"/>
@@ -13990,7 +13323,6 @@
     <w:link w:val="BodyText3Char"/>
     <w:uiPriority w:val="99"/>
     <w:unhideWhenUsed/>
-    <w:rsid w:val="00AA1D8D"/>
     <w:pPr>
       <w:spacing w:after="120"/>
     </w:pPr>
@@ -14004,7 +13336,6 @@
     <w:basedOn w:val="DefaultParagraphFont"/>
     <w:link w:val="BodyText3"/>
     <w:uiPriority w:val="99"/>
-    <w:rsid w:val="00AA1D8D"/>
     <w:rPr>
       <w:sz w:val="16"/>
       <w:szCs w:val="16"/>
@@ -14015,7 +13346,6 @@
     <w:basedOn w:val="Normal"/>
     <w:uiPriority w:val="99"/>
     <w:unhideWhenUsed/>
-    <w:rsid w:val="00AA1D8D"/>
     <w:pPr>
       <w:ind w:left="360" w:hanging="360"/>
       <w:contextualSpacing/>
@@ -14026,7 +13356,6 @@
     <w:basedOn w:val="Normal"/>
     <w:uiPriority w:val="99"/>
     <w:unhideWhenUsed/>
-    <w:rsid w:val="00326F90"/>
     <w:pPr>
       <w:ind w:left="720" w:hanging="360"/>
       <w:contextualSpacing/>
@@ -14037,7 +13366,6 @@
     <w:basedOn w:val="Normal"/>
     <w:uiPriority w:val="99"/>
     <w:unhideWhenUsed/>
-    <w:rsid w:val="00326F90"/>
     <w:pPr>
       <w:ind w:left="1080" w:hanging="360"/>
       <w:contextualSpacing/>
@@ -14048,7 +13376,6 @@
     <w:basedOn w:val="Normal"/>
     <w:uiPriority w:val="99"/>
     <w:unhideWhenUsed/>
-    <w:rsid w:val="00326F90"/>
     <w:pPr>
       <w:numPr>
         <w:numId w:val="1"/>
@@ -14061,7 +13388,6 @@
     <w:basedOn w:val="Normal"/>
     <w:uiPriority w:val="99"/>
     <w:unhideWhenUsed/>
-    <w:rsid w:val="00326F90"/>
     <w:pPr>
       <w:numPr>
         <w:numId w:val="2"/>
@@ -14074,7 +13400,6 @@
     <w:basedOn w:val="Normal"/>
     <w:uiPriority w:val="99"/>
     <w:unhideWhenUsed/>
-    <w:rsid w:val="00326F90"/>
     <w:pPr>
       <w:numPr>
         <w:numId w:val="3"/>
@@ -14087,7 +13412,6 @@
     <w:basedOn w:val="Normal"/>
     <w:uiPriority w:val="99"/>
     <w:unhideWhenUsed/>
-    <w:rsid w:val="00326F90"/>
     <w:pPr>
       <w:numPr>
         <w:numId w:val="5"/>
@@ -14100,7 +13424,6 @@
     <w:basedOn w:val="Normal"/>
     <w:uiPriority w:val="99"/>
     <w:unhideWhenUsed/>
-    <w:rsid w:val="0029639D"/>
     <w:pPr>
       <w:numPr>
         <w:numId w:val="6"/>
@@ -14113,7 +13436,6 @@
     <w:basedOn w:val="Normal"/>
     <w:uiPriority w:val="99"/>
     <w:unhideWhenUsed/>
-    <w:rsid w:val="0029639D"/>
     <w:pPr>
       <w:numPr>
         <w:numId w:val="7"/>
@@ -14126,7 +13448,6 @@
     <w:basedOn w:val="Normal"/>
     <w:uiPriority w:val="99"/>
     <w:unhideWhenUsed/>
-    <w:rsid w:val="0029639D"/>
     <w:pPr>
       <w:spacing w:after="120"/>
       <w:ind w:left="360"/>
@@ -14138,7 +13459,6 @@
     <w:basedOn w:val="Normal"/>
     <w:uiPriority w:val="99"/>
     <w:unhideWhenUsed/>
-    <w:rsid w:val="0029639D"/>
     <w:pPr>
       <w:spacing w:after="120"/>
       <w:ind w:left="720"/>
@@ -14150,7 +13470,6 @@
     <w:basedOn w:val="Normal"/>
     <w:uiPriority w:val="99"/>
     <w:unhideWhenUsed/>
-    <w:rsid w:val="0029639D"/>
     <w:pPr>
       <w:spacing w:after="120"/>
       <w:ind w:left="1080"/>
@@ -14162,7 +13481,6 @@
     <w:link w:val="MacroTextChar"/>
     <w:uiPriority w:val="99"/>
     <w:unhideWhenUsed/>
-    <w:rsid w:val="0029639D"/>
     <w:pPr>
       <w:tabs>
         <w:tab w:val="left" w:pos="576"/>
@@ -14185,7 +13503,6 @@
     <w:basedOn w:val="DefaultParagraphFont"/>
     <w:link w:val="MacroText"/>
     <w:uiPriority w:val="99"/>
-    <w:rsid w:val="0029639D"/>
     <w:rPr>
       <w:rFonts w:ascii="Courier" w:hAnsi="Courier"/>
       <w:sz w:val="20"/>
@@ -14199,7 +13516,6 @@
     <w:link w:val="QuoteChar"/>
     <w:uiPriority w:val="29"/>
     <w:qFormat/>
-    <w:rsid w:val="00FC693F"/>
     <w:rPr>
       <w:i/>
       <w:iCs/>
@@ -14211,7 +13527,6 @@
     <w:basedOn w:val="DefaultParagraphFont"/>
     <w:link w:val="Quote"/>
     <w:uiPriority w:val="29"/>
-    <w:rsid w:val="00FC693F"/>
     <w:rPr>
       <w:i/>
       <w:iCs/>
@@ -14224,7 +13539,6 @@
     <w:link w:val="Heading4"/>
     <w:uiPriority w:val="9"/>
     <w:semiHidden/>
-    <w:rsid w:val="00FC693F"/>
     <w:rPr>
       <w:rFonts w:asciiTheme="majorHAnsi" w:eastAsiaTheme="majorEastAsia" w:hAnsiTheme="majorHAnsi" w:cstheme="majorBidi"/>
       <w:b/>
@@ -14240,7 +13554,6 @@
     <w:link w:val="Heading5"/>
     <w:uiPriority w:val="9"/>
     <w:semiHidden/>
-    <w:rsid w:val="00FC693F"/>
     <w:rPr>
       <w:rFonts w:asciiTheme="majorHAnsi" w:eastAsiaTheme="majorEastAsia" w:hAnsiTheme="majorHAnsi" w:cstheme="majorBidi"/>
       <w:color w:val="243F60" w:themeColor="accent1" w:themeShade="7F"/>
@@ -14252,7 +13565,6 @@
     <w:link w:val="Heading6"/>
     <w:uiPriority w:val="9"/>
     <w:semiHidden/>
-    <w:rsid w:val="00FC693F"/>
     <w:rPr>
       <w:rFonts w:asciiTheme="majorHAnsi" w:eastAsiaTheme="majorEastAsia" w:hAnsiTheme="majorHAnsi" w:cstheme="majorBidi"/>
       <w:i/>
@@ -14266,7 +13578,6 @@
     <w:link w:val="Heading7"/>
     <w:uiPriority w:val="9"/>
     <w:semiHidden/>
-    <w:rsid w:val="00FC693F"/>
     <w:rPr>
       <w:rFonts w:asciiTheme="majorHAnsi" w:eastAsiaTheme="majorEastAsia" w:hAnsiTheme="majorHAnsi" w:cstheme="majorBidi"/>
       <w:i/>
@@ -14280,7 +13591,6 @@
     <w:link w:val="Heading8"/>
     <w:uiPriority w:val="9"/>
     <w:semiHidden/>
-    <w:rsid w:val="00FC693F"/>
     <w:rPr>
       <w:rFonts w:asciiTheme="majorHAnsi" w:eastAsiaTheme="majorEastAsia" w:hAnsiTheme="majorHAnsi" w:cstheme="majorBidi"/>
       <w:color w:val="4F81BD" w:themeColor="accent1"/>
@@ -14294,7 +13604,6 @@
     <w:link w:val="Heading9"/>
     <w:uiPriority w:val="9"/>
     <w:semiHidden/>
-    <w:rsid w:val="00FC693F"/>
     <w:rPr>
       <w:rFonts w:asciiTheme="majorHAnsi" w:eastAsiaTheme="majorEastAsia" w:hAnsiTheme="majorHAnsi" w:cstheme="majorBidi"/>
       <w:i/>
@@ -14312,7 +13621,6 @@
     <w:semiHidden/>
     <w:unhideWhenUsed/>
     <w:qFormat/>
-    <w:rsid w:val="00FC693F"/>
     <w:pPr>
       <w:spacing w:line="240" w:lineRule="auto"/>
     </w:pPr>
@@ -14329,7 +13637,6 @@
     <w:basedOn w:val="DefaultParagraphFont"/>
     <w:uiPriority w:val="22"/>
     <w:qFormat/>
-    <w:rsid w:val="00FC693F"/>
     <w:rPr>
       <w:b/>
       <w:bCs/>
@@ -14340,7 +13647,6 @@
     <w:basedOn w:val="DefaultParagraphFont"/>
     <w:uiPriority w:val="20"/>
     <w:qFormat/>
-    <w:rsid w:val="00FC693F"/>
     <w:rPr>
       <w:i/>
       <w:iCs/>
@@ -14353,7 +13659,6 @@
     <w:link w:val="IntenseQuoteChar"/>
     <w:uiPriority w:val="30"/>
     <w:qFormat/>
-    <w:rsid w:val="00FC693F"/>
     <w:pPr>
       <w:pBdr>
         <w:bottom w:val="single" w:sz="4" w:space="4" w:color="4F81BD" w:themeColor="accent1"/>
@@ -14374,7 +13679,6 @@
     <w:basedOn w:val="DefaultParagraphFont"/>
     <w:link w:val="IntenseQuote"/>
     <w:uiPriority w:val="30"/>
-    <w:rsid w:val="00FC693F"/>
     <w:rPr>
       <w:b/>
       <w:bCs/>
@@ -14388,7 +13692,6 @@
     <w:basedOn w:val="DefaultParagraphFont"/>
     <w:uiPriority w:val="19"/>
     <w:qFormat/>
-    <w:rsid w:val="00FC693F"/>
     <w:rPr>
       <w:i/>
       <w:iCs/>
@@ -14400,7 +13703,6 @@
     <w:basedOn w:val="DefaultParagraphFont"/>
     <w:uiPriority w:val="21"/>
     <w:qFormat/>
-    <w:rsid w:val="00FC693F"/>
     <w:rPr>
       <w:b/>
       <w:bCs/>
@@ -14414,7 +13716,6 @@
     <w:basedOn w:val="DefaultParagraphFont"/>
     <w:uiPriority w:val="31"/>
     <w:qFormat/>
-    <w:rsid w:val="00FC693F"/>
     <w:rPr>
       <w:smallCaps/>
       <w:color w:val="C0504D" w:themeColor="accent2"/>
@@ -14426,7 +13727,6 @@
     <w:basedOn w:val="DefaultParagraphFont"/>
     <w:uiPriority w:val="32"/>
     <w:qFormat/>
-    <w:rsid w:val="00FC693F"/>
     <w:rPr>
       <w:b/>
       <w:bCs/>
@@ -14441,7 +13741,6 @@
     <w:basedOn w:val="DefaultParagraphFont"/>
     <w:uiPriority w:val="33"/>
     <w:qFormat/>
-    <w:rsid w:val="00FC693F"/>
     <w:rPr>
       <w:b/>
       <w:bCs/>
@@ -14457,7 +13756,6 @@
     <w:semiHidden/>
     <w:unhideWhenUsed/>
     <w:qFormat/>
-    <w:rsid w:val="00FC693F"/>
     <w:pPr>
       <w:outlineLvl w:val="9"/>
     </w:pPr>
@@ -14466,7 +13764,6 @@
     <w:name w:val="Table Grid"/>
     <w:basedOn w:val="TableNormal"/>
     <w:uiPriority w:val="59"/>
-    <w:rsid w:val="00FC693F"/>
     <w:pPr>
       <w:spacing w:after="0" w:line="240" w:lineRule="auto"/>
     </w:pPr>
@@ -14492,7 +13789,6 @@
     <w:name w:val="Light Shading"/>
     <w:basedOn w:val="TableNormal"/>
     <w:uiPriority w:val="60"/>
-    <w:rsid w:val="00FC693F"/>
     <w:pPr>
       <w:spacing w:after="0" w:line="240" w:lineRule="auto"/>
     </w:pPr>
@@ -14595,7 +13891,6 @@
     <w:name w:val="Light Shading Accent 1"/>
     <w:basedOn w:val="TableNormal"/>
     <w:uiPriority w:val="60"/>
-    <w:rsid w:val="00FC693F"/>
     <w:pPr>
       <w:spacing w:after="0" w:line="240" w:lineRule="auto"/>
     </w:pPr>
@@ -14698,7 +13993,6 @@
     <w:name w:val="Light Shading Accent 2"/>
     <w:basedOn w:val="TableNormal"/>
     <w:uiPriority w:val="60"/>
-    <w:rsid w:val="00FC693F"/>
     <w:pPr>
       <w:spacing w:after="0" w:line="240" w:lineRule="auto"/>
     </w:pPr>
@@ -14801,7 +14095,6 @@
     <w:name w:val="Light Shading Accent 3"/>
     <w:basedOn w:val="TableNormal"/>
     <w:uiPriority w:val="60"/>
-    <w:rsid w:val="00FC693F"/>
     <w:pPr>
       <w:spacing w:after="0" w:line="240" w:lineRule="auto"/>
     </w:pPr>
@@ -14904,7 +14197,6 @@
     <w:name w:val="Light Shading Accent 4"/>
     <w:basedOn w:val="TableNormal"/>
     <w:uiPriority w:val="60"/>
-    <w:rsid w:val="00FC693F"/>
     <w:pPr>
       <w:spacing w:after="0" w:line="240" w:lineRule="auto"/>
     </w:pPr>
@@ -15007,7 +14299,6 @@
     <w:name w:val="Light Shading Accent 5"/>
     <w:basedOn w:val="TableNormal"/>
     <w:uiPriority w:val="60"/>
-    <w:rsid w:val="00FC693F"/>
     <w:pPr>
       <w:spacing w:after="0" w:line="240" w:lineRule="auto"/>
     </w:pPr>
@@ -15110,7 +14401,6 @@
     <w:name w:val="Light Shading Accent 6"/>
     <w:basedOn w:val="TableNormal"/>
     <w:uiPriority w:val="60"/>
-    <w:rsid w:val="00FC693F"/>
     <w:pPr>
       <w:spacing w:after="0" w:line="240" w:lineRule="auto"/>
     </w:pPr>
@@ -15213,7 +14503,6 @@
     <w:name w:val="Light List"/>
     <w:basedOn w:val="TableNormal"/>
     <w:uiPriority w:val="61"/>
-    <w:rsid w:val="00FC693F"/>
     <w:pPr>
       <w:spacing w:after="0" w:line="240" w:lineRule="auto"/>
     </w:pPr>
@@ -15305,7 +14594,6 @@
     <w:name w:val="Light List Accent 1"/>
     <w:basedOn w:val="TableNormal"/>
     <w:uiPriority w:val="61"/>
-    <w:rsid w:val="00FC693F"/>
     <w:pPr>
       <w:spacing w:after="0" w:line="240" w:lineRule="auto"/>
     </w:pPr>
@@ -15397,7 +14685,6 @@
     <w:name w:val="Light List Accent 2"/>
     <w:basedOn w:val="TableNormal"/>
     <w:uiPriority w:val="61"/>
-    <w:rsid w:val="00CB0664"/>
     <w:pPr>
       <w:spacing w:after="0" w:line="240" w:lineRule="auto"/>
     </w:pPr>
@@ -15489,7 +14776,6 @@
     <w:name w:val="Light List Accent 3"/>
     <w:basedOn w:val="TableNormal"/>
     <w:uiPriority w:val="61"/>
-    <w:rsid w:val="00CB0664"/>
     <w:pPr>
       <w:spacing w:after="0" w:line="240" w:lineRule="auto"/>
     </w:pPr>
@@ -15581,7 +14867,6 @@
     <w:name w:val="Light List Accent 4"/>
     <w:basedOn w:val="TableNormal"/>
     <w:uiPriority w:val="61"/>
-    <w:rsid w:val="00CB0664"/>
     <w:pPr>
       <w:spacing w:after="0" w:line="240" w:lineRule="auto"/>
     </w:pPr>
@@ -15673,7 +14958,6 @@
     <w:name w:val="Light List Accent 5"/>
     <w:basedOn w:val="TableNormal"/>
     <w:uiPriority w:val="61"/>
-    <w:rsid w:val="00CB0664"/>
     <w:pPr>
       <w:spacing w:after="0" w:line="240" w:lineRule="auto"/>
     </w:pPr>
@@ -15765,7 +15049,6 @@
     <w:name w:val="Light List Accent 6"/>
     <w:basedOn w:val="TableNormal"/>
     <w:uiPriority w:val="61"/>
-    <w:rsid w:val="00CB0664"/>
     <w:pPr>
       <w:spacing w:after="0" w:line="240" w:lineRule="auto"/>
     </w:pPr>
@@ -15857,7 +15140,6 @@
     <w:name w:val="Light Grid"/>
     <w:basedOn w:val="TableNormal"/>
     <w:uiPriority w:val="62"/>
-    <w:rsid w:val="00CB0664"/>
     <w:pPr>
       <w:spacing w:after="0" w:line="240" w:lineRule="auto"/>
     </w:pPr>
@@ -15987,7 +15269,6 @@
     <w:name w:val="Light Grid Accent 1"/>
     <w:basedOn w:val="TableNormal"/>
     <w:uiPriority w:val="62"/>
-    <w:rsid w:val="00CB0664"/>
     <w:pPr>
       <w:spacing w:after="0" w:line="240" w:lineRule="auto"/>
     </w:pPr>
@@ -16117,7 +15398,6 @@
     <w:name w:val="Light Grid Accent 2"/>
     <w:basedOn w:val="TableNormal"/>
     <w:uiPriority w:val="62"/>
-    <w:rsid w:val="00CB0664"/>
     <w:pPr>
       <w:spacing w:after="0" w:line="240" w:lineRule="auto"/>
     </w:pPr>
@@ -16247,7 +15527,6 @@
     <w:name w:val="Light Grid Accent 3"/>
     <w:basedOn w:val="TableNormal"/>
     <w:uiPriority w:val="62"/>
-    <w:rsid w:val="00CB0664"/>
     <w:pPr>
       <w:spacing w:after="0" w:line="240" w:lineRule="auto"/>
     </w:pPr>
@@ -16377,7 +15656,6 @@
     <w:name w:val="Light Grid Accent 4"/>
     <w:basedOn w:val="TableNormal"/>
     <w:uiPriority w:val="62"/>
-    <w:rsid w:val="00CB0664"/>
     <w:pPr>
       <w:spacing w:after="0" w:line="240" w:lineRule="auto"/>
     </w:pPr>
@@ -16507,7 +15785,6 @@
     <w:name w:val="Light Grid Accent 5"/>
     <w:basedOn w:val="TableNormal"/>
     <w:uiPriority w:val="62"/>
-    <w:rsid w:val="00CB0664"/>
     <w:pPr>
       <w:spacing w:after="0" w:line="240" w:lineRule="auto"/>
     </w:pPr>
@@ -16637,7 +15914,6 @@
     <w:name w:val="Light Grid Accent 6"/>
     <w:basedOn w:val="TableNormal"/>
     <w:uiPriority w:val="62"/>
-    <w:rsid w:val="00CB0664"/>
     <w:pPr>
       <w:spacing w:after="0" w:line="240" w:lineRule="auto"/>
     </w:pPr>
@@ -16767,7 +16043,6 @@
     <w:name w:val="Medium Shading 1"/>
     <w:basedOn w:val="TableNormal"/>
     <w:uiPriority w:val="63"/>
-    <w:rsid w:val="00CB0664"/>
     <w:pPr>
       <w:spacing w:after="0" w:line="240" w:lineRule="auto"/>
     </w:pPr>
@@ -16873,7 +16148,6 @@
     <w:name w:val="Medium Shading 1 Accent 1"/>
     <w:basedOn w:val="TableNormal"/>
     <w:uiPriority w:val="63"/>
-    <w:rsid w:val="00CB0664"/>
     <w:pPr>
       <w:spacing w:after="0" w:line="240" w:lineRule="auto"/>
     </w:pPr>
@@ -16979,7 +16253,6 @@
     <w:name w:val="Medium Shading 1 Accent 2"/>
     <w:basedOn w:val="TableNormal"/>
     <w:uiPriority w:val="63"/>
-    <w:rsid w:val="00CB0664"/>
     <w:pPr>
       <w:spacing w:after="0" w:line="240" w:lineRule="auto"/>
     </w:pPr>
@@ -17085,7 +16358,6 @@
     <w:name w:val="Medium Shading 1 Accent 3"/>
     <w:basedOn w:val="TableNormal"/>
     <w:uiPriority w:val="63"/>
-    <w:rsid w:val="00CB0664"/>
     <w:pPr>
       <w:spacing w:after="0" w:line="240" w:lineRule="auto"/>
     </w:pPr>
@@ -17191,7 +16463,6 @@
     <w:name w:val="Medium Shading 1 Accent 4"/>
     <w:basedOn w:val="TableNormal"/>
     <w:uiPriority w:val="63"/>
-    <w:rsid w:val="00CB0664"/>
     <w:pPr>
       <w:spacing w:after="0" w:line="240" w:lineRule="auto"/>
     </w:pPr>
@@ -17297,7 +16568,6 @@
     <w:name w:val="Medium Shading 1 Accent 5"/>
     <w:basedOn w:val="TableNormal"/>
     <w:uiPriority w:val="63"/>
-    <w:rsid w:val="00CB0664"/>
     <w:pPr>
       <w:spacing w:after="0" w:line="240" w:lineRule="auto"/>
     </w:pPr>
@@ -17403,7 +16673,6 @@
     <w:name w:val="Medium Shading 1 Accent 6"/>
     <w:basedOn w:val="TableNormal"/>
     <w:uiPriority w:val="63"/>
-    <w:rsid w:val="00CB0664"/>
     <w:pPr>
       <w:spacing w:after="0" w:line="240" w:lineRule="auto"/>
     </w:pPr>
@@ -17509,7 +16778,6 @@
     <w:name w:val="Medium Shading 2"/>
     <w:basedOn w:val="TableNormal"/>
     <w:uiPriority w:val="64"/>
-    <w:rsid w:val="00CB0664"/>
     <w:pPr>
       <w:spacing w:after="0" w:line="240" w:lineRule="auto"/>
     </w:pPr>
@@ -17658,7 +16926,6 @@
     <w:name w:val="Medium Shading 2 Accent 1"/>
     <w:basedOn w:val="TableNormal"/>
     <w:uiPriority w:val="64"/>
-    <w:rsid w:val="00CB0664"/>
     <w:pPr>
       <w:spacing w:after="0" w:line="240" w:lineRule="auto"/>
     </w:pPr>
@@ -17807,7 +17074,6 @@
     <w:name w:val="Medium Shading 2 Accent 2"/>
     <w:basedOn w:val="TableNormal"/>
     <w:uiPriority w:val="64"/>
-    <w:rsid w:val="00CB0664"/>
     <w:pPr>
       <w:spacing w:after="0" w:line="240" w:lineRule="auto"/>
     </w:pPr>
@@ -17956,7 +17222,6 @@
     <w:name w:val="Medium Shading 2 Accent 3"/>
     <w:basedOn w:val="TableNormal"/>
     <w:uiPriority w:val="64"/>
-    <w:rsid w:val="00CB0664"/>
     <w:pPr>
       <w:spacing w:after="0" w:line="240" w:lineRule="auto"/>
     </w:pPr>
@@ -18105,7 +17370,6 @@
     <w:name w:val="Medium Shading 2 Accent 4"/>
     <w:basedOn w:val="TableNormal"/>
     <w:uiPriority w:val="64"/>
-    <w:rsid w:val="00CB0664"/>
     <w:pPr>
       <w:spacing w:after="0" w:line="240" w:lineRule="auto"/>
     </w:pPr>
@@ -18254,7 +17518,6 @@
     <w:name w:val="Medium Shading 2 Accent 5"/>
     <w:basedOn w:val="TableNormal"/>
     <w:uiPriority w:val="64"/>
-    <w:rsid w:val="00CB0664"/>
     <w:pPr>
       <w:spacing w:after="0" w:line="240" w:lineRule="auto"/>
     </w:pPr>
@@ -18403,7 +17666,6 @@
     <w:name w:val="Medium Shading 2 Accent 6"/>
     <w:basedOn w:val="TableNormal"/>
     <w:uiPriority w:val="64"/>
-    <w:rsid w:val="00CB0664"/>
     <w:pPr>
       <w:spacing w:after="0" w:line="240" w:lineRule="auto"/>
     </w:pPr>
@@ -18552,7 +17814,6 @@
     <w:name w:val="Medium List 1"/>
     <w:basedOn w:val="TableNormal"/>
     <w:uiPriority w:val="65"/>
-    <w:rsid w:val="00CB0664"/>
     <w:pPr>
       <w:spacing w:after="0" w:line="240" w:lineRule="auto"/>
     </w:pPr>
@@ -18636,7 +17897,6 @@
     <w:name w:val="Medium List 1 Accent 1"/>
     <w:basedOn w:val="TableNormal"/>
     <w:uiPriority w:val="65"/>
-    <w:rsid w:val="00CB0664"/>
     <w:pPr>
       <w:spacing w:after="0" w:line="240" w:lineRule="auto"/>
     </w:pPr>
@@ -18720,7 +17980,6 @@
     <w:name w:val="Medium List 1 Accent 2"/>
     <w:basedOn w:val="TableNormal"/>
     <w:uiPriority w:val="65"/>
-    <w:rsid w:val="00CB0664"/>
     <w:pPr>
       <w:spacing w:after="0" w:line="240" w:lineRule="auto"/>
     </w:pPr>
@@ -18804,7 +18063,6 @@
     <w:name w:val="Medium List 1 Accent 3"/>
     <w:basedOn w:val="TableNormal"/>
     <w:uiPriority w:val="65"/>
-    <w:rsid w:val="00CB0664"/>
     <w:pPr>
       <w:spacing w:after="0" w:line="240" w:lineRule="auto"/>
     </w:pPr>
@@ -18888,7 +18146,6 @@
     <w:name w:val="Medium List 1 Accent 4"/>
     <w:basedOn w:val="TableNormal"/>
     <w:uiPriority w:val="65"/>
-    <w:rsid w:val="00CB0664"/>
     <w:pPr>
       <w:spacing w:after="0" w:line="240" w:lineRule="auto"/>
     </w:pPr>
@@ -18972,7 +18229,6 @@
     <w:name w:val="Medium List 1 Accent 5"/>
     <w:basedOn w:val="TableNormal"/>
     <w:uiPriority w:val="65"/>
-    <w:rsid w:val="00CB0664"/>
     <w:pPr>
       <w:spacing w:after="0" w:line="240" w:lineRule="auto"/>
     </w:pPr>
@@ -19056,7 +18312,6 @@
     <w:name w:val="Medium List 1 Accent 6"/>
     <w:basedOn w:val="TableNormal"/>
     <w:uiPriority w:val="65"/>
-    <w:rsid w:val="00CB0664"/>
     <w:pPr>
       <w:spacing w:after="0" w:line="240" w:lineRule="auto"/>
     </w:pPr>
@@ -19140,7 +18395,6 @@
     <w:name w:val="Medium List 2"/>
     <w:basedOn w:val="TableNormal"/>
     <w:uiPriority w:val="66"/>
-    <w:rsid w:val="00CB0664"/>
     <w:pPr>
       <w:spacing w:after="0" w:line="240" w:lineRule="auto"/>
     </w:pPr>
@@ -19268,7 +18522,6 @@
     <w:name w:val="Medium List 2 Accent 1"/>
     <w:basedOn w:val="TableNormal"/>
     <w:uiPriority w:val="66"/>
-    <w:rsid w:val="00CB0664"/>
     <w:pPr>
       <w:spacing w:after="0" w:line="240" w:lineRule="auto"/>
     </w:pPr>
@@ -19396,7 +18649,6 @@
     <w:name w:val="Medium List 2 Accent 2"/>
     <w:basedOn w:val="TableNormal"/>
     <w:uiPriority w:val="66"/>
-    <w:rsid w:val="00CB0664"/>
     <w:pPr>
       <w:spacing w:after="0" w:line="240" w:lineRule="auto"/>
     </w:pPr>
@@ -19524,7 +18776,6 @@
     <w:name w:val="Medium List 2 Accent 3"/>
     <w:basedOn w:val="TableNormal"/>
     <w:uiPriority w:val="66"/>
-    <w:rsid w:val="00CB0664"/>
     <w:pPr>
       <w:spacing w:after="0" w:line="240" w:lineRule="auto"/>
     </w:pPr>
@@ -19652,7 +18903,6 @@
     <w:name w:val="Medium List 2 Accent 4"/>
     <w:basedOn w:val="TableNormal"/>
     <w:uiPriority w:val="66"/>
-    <w:rsid w:val="00CB0664"/>
     <w:pPr>
       <w:spacing w:after="0" w:line="240" w:lineRule="auto"/>
     </w:pPr>
@@ -19780,7 +19030,6 @@
     <w:name w:val="Medium List 2 Accent 5"/>
     <w:basedOn w:val="TableNormal"/>
     <w:uiPriority w:val="66"/>
-    <w:rsid w:val="00CB0664"/>
     <w:pPr>
       <w:spacing w:after="0" w:line="240" w:lineRule="auto"/>
     </w:pPr>
@@ -19908,7 +19157,6 @@
     <w:name w:val="Medium List 2 Accent 6"/>
     <w:basedOn w:val="TableNormal"/>
     <w:uiPriority w:val="66"/>
-    <w:rsid w:val="00CB0664"/>
     <w:pPr>
       <w:spacing w:after="0" w:line="240" w:lineRule="auto"/>
     </w:pPr>
@@ -20036,7 +19284,6 @@
     <w:name w:val="Medium Grid 1"/>
     <w:basedOn w:val="TableNormal"/>
     <w:uiPriority w:val="67"/>
-    <w:rsid w:val="00CB0664"/>
     <w:pPr>
       <w:spacing w:after="0" w:line="240" w:lineRule="auto"/>
     </w:pPr>
@@ -20109,7 +19356,6 @@
     <w:name w:val="Medium Grid 1 Accent 1"/>
     <w:basedOn w:val="TableNormal"/>
     <w:uiPriority w:val="67"/>
-    <w:rsid w:val="00CB0664"/>
     <w:pPr>
       <w:spacing w:after="0" w:line="240" w:lineRule="auto"/>
     </w:pPr>
@@ -20182,7 +19428,6 @@
     <w:name w:val="Medium Grid 1 Accent 2"/>
     <w:basedOn w:val="TableNormal"/>
     <w:uiPriority w:val="67"/>
-    <w:rsid w:val="00CB0664"/>
     <w:pPr>
       <w:spacing w:after="0" w:line="240" w:lineRule="auto"/>
     </w:pPr>
@@ -20255,7 +19500,6 @@
     <w:name w:val="Medium Grid 1 Accent 3"/>
     <w:basedOn w:val="TableNormal"/>
     <w:uiPriority w:val="67"/>
-    <w:rsid w:val="00CB0664"/>
     <w:pPr>
       <w:spacing w:after="0" w:line="240" w:lineRule="auto"/>
     </w:pPr>
@@ -20328,7 +19572,6 @@
     <w:name w:val="Medium Grid 1 Accent 4"/>
     <w:basedOn w:val="TableNormal"/>
     <w:uiPriority w:val="67"/>
-    <w:rsid w:val="00CB0664"/>
     <w:pPr>
       <w:spacing w:after="0" w:line="240" w:lineRule="auto"/>
     </w:pPr>
@@ -20401,7 +19644,6 @@
     <w:name w:val="Medium Grid 1 Accent 5"/>
     <w:basedOn w:val="TableNormal"/>
     <w:uiPriority w:val="67"/>
-    <w:rsid w:val="00CB0664"/>
     <w:pPr>
       <w:spacing w:after="0" w:line="240" w:lineRule="auto"/>
     </w:pPr>
@@ -20474,7 +19716,6 @@
     <w:name w:val="Medium Grid 1 Accent 6"/>
     <w:basedOn w:val="TableNormal"/>
     <w:uiPriority w:val="67"/>
-    <w:rsid w:val="00CB0664"/>
     <w:pPr>
       <w:spacing w:after="0" w:line="240" w:lineRule="auto"/>
     </w:pPr>
@@ -20547,7 +19788,6 @@
     <w:name w:val="Medium Grid 2"/>
     <w:basedOn w:val="TableNormal"/>
     <w:uiPriority w:val="68"/>
-    <w:rsid w:val="00CB0664"/>
     <w:pPr>
       <w:spacing w:after="0" w:line="240" w:lineRule="auto"/>
     </w:pPr>
@@ -20672,7 +19912,6 @@
     <w:name w:val="Medium Grid 2 Accent 1"/>
     <w:basedOn w:val="TableNormal"/>
     <w:uiPriority w:val="68"/>
-    <w:rsid w:val="00CB0664"/>
     <w:pPr>
       <w:spacing w:after="0" w:line="240" w:lineRule="auto"/>
     </w:pPr>
@@ -20797,7 +20036,6 @@
     <w:name w:val="Medium Grid 2 Accent 2"/>
     <w:basedOn w:val="TableNormal"/>
     <w:uiPriority w:val="68"/>
-    <w:rsid w:val="00CB0664"/>
     <w:pPr>
       <w:spacing w:after="0" w:line="240" w:lineRule="auto"/>
     </w:pPr>
@@ -20922,7 +20160,6 @@
     <w:name w:val="Medium Grid 2 Accent 3"/>
     <w:basedOn w:val="TableNormal"/>
     <w:uiPriority w:val="68"/>
-    <w:rsid w:val="00CB0664"/>
     <w:pPr>
       <w:spacing w:after="0" w:line="240" w:lineRule="auto"/>
     </w:pPr>
@@ -21047,7 +20284,6 @@
     <w:name w:val="Medium Grid 2 Accent 4"/>
     <w:basedOn w:val="TableNormal"/>
     <w:uiPriority w:val="68"/>
-    <w:rsid w:val="00CB0664"/>
     <w:pPr>
       <w:spacing w:after="0" w:line="240" w:lineRule="auto"/>
     </w:pPr>
@@ -21172,7 +20408,6 @@
     <w:name w:val="Medium Grid 2 Accent 5"/>
     <w:basedOn w:val="TableNormal"/>
     <w:uiPriority w:val="68"/>
-    <w:rsid w:val="00CB0664"/>
     <w:pPr>
       <w:spacing w:after="0" w:line="240" w:lineRule="auto"/>
     </w:pPr>
@@ -21297,7 +20532,6 @@
     <w:name w:val="Medium Grid 2 Accent 6"/>
     <w:basedOn w:val="TableNormal"/>
     <w:uiPriority w:val="68"/>
-    <w:rsid w:val="00CB0664"/>
     <w:pPr>
       <w:spacing w:after="0" w:line="240" w:lineRule="auto"/>
     </w:pPr>
@@ -21422,7 +20656,6 @@
     <w:name w:val="Medium Grid 3"/>
     <w:basedOn w:val="TableNormal"/>
     <w:uiPriority w:val="69"/>
-    <w:rsid w:val="00CB0664"/>
     <w:pPr>
       <w:spacing w:after="0" w:line="240" w:lineRule="auto"/>
     </w:pPr>
@@ -21563,7 +20796,6 @@
     <w:name w:val="Medium Grid 3 Accent 1"/>
     <w:basedOn w:val="TableNormal"/>
     <w:uiPriority w:val="69"/>
-    <w:rsid w:val="00CB0664"/>
     <w:pPr>
       <w:spacing w:after="0" w:line="240" w:lineRule="auto"/>
     </w:pPr>
@@ -21704,7 +20936,6 @@
     <w:name w:val="Medium Grid 3 Accent 2"/>
     <w:basedOn w:val="TableNormal"/>
     <w:uiPriority w:val="69"/>
-    <w:rsid w:val="00CB0664"/>
     <w:pPr>
       <w:spacing w:after="0" w:line="240" w:lineRule="auto"/>
     </w:pPr>
@@ -21845,7 +21076,6 @@
     <w:name w:val="Medium Grid 3 Accent 3"/>
     <w:basedOn w:val="TableNormal"/>
     <w:uiPriority w:val="69"/>
-    <w:rsid w:val="00CB0664"/>
     <w:pPr>
       <w:spacing w:after="0" w:line="240" w:lineRule="auto"/>
     </w:pPr>
@@ -21986,7 +21216,6 @@
     <w:name w:val="Medium Grid 3 Accent 4"/>
     <w:basedOn w:val="TableNormal"/>
     <w:uiPriority w:val="69"/>
-    <w:rsid w:val="00CB0664"/>
     <w:pPr>
       <w:spacing w:after="0" w:line="240" w:lineRule="auto"/>
     </w:pPr>
@@ -22127,7 +21356,6 @@
     <w:name w:val="Medium Grid 3 Accent 5"/>
     <w:basedOn w:val="TableNormal"/>
     <w:uiPriority w:val="69"/>
-    <w:rsid w:val="00CB0664"/>
     <w:pPr>
       <w:spacing w:after="0" w:line="240" w:lineRule="auto"/>
     </w:pPr>
@@ -22268,7 +21496,6 @@
     <w:name w:val="Medium Grid 3 Accent 6"/>
     <w:basedOn w:val="TableNormal"/>
     <w:uiPriority w:val="69"/>
-    <w:rsid w:val="00CB0664"/>
     <w:pPr>
       <w:spacing w:after="0" w:line="240" w:lineRule="auto"/>
     </w:pPr>
@@ -22409,7 +21636,6 @@
     <w:name w:val="Dark List"/>
     <w:basedOn w:val="TableNormal"/>
     <w:uiPriority w:val="70"/>
-    <w:rsid w:val="00CB0664"/>
     <w:pPr>
       <w:spacing w:after="0" w:line="240" w:lineRule="auto"/>
     </w:pPr>
@@ -22523,7 +21749,6 @@
     <w:name w:val="Dark List Accent 1"/>
     <w:basedOn w:val="TableNormal"/>
     <w:uiPriority w:val="70"/>
-    <w:rsid w:val="00CB0664"/>
     <w:pPr>
       <w:spacing w:after="0" w:line="240" w:lineRule="auto"/>
     </w:pPr>
@@ -22637,7 +21862,6 @@
     <w:name w:val="Dark List Accent 2"/>
     <w:basedOn w:val="TableNormal"/>
     <w:uiPriority w:val="70"/>
-    <w:rsid w:val="00CB0664"/>
     <w:pPr>
       <w:spacing w:after="0" w:line="240" w:lineRule="auto"/>
     </w:pPr>
@@ -22751,7 +21975,6 @@
     <w:name w:val="Dark List Accent 3"/>
     <w:basedOn w:val="TableNormal"/>
     <w:uiPriority w:val="70"/>
-    <w:rsid w:val="00CB0664"/>
     <w:pPr>
       <w:spacing w:after="0" w:line="240" w:lineRule="auto"/>
     </w:pPr>
@@ -22865,7 +22088,6 @@
     <w:name w:val="Dark List Accent 4"/>
     <w:basedOn w:val="TableNormal"/>
     <w:uiPriority w:val="70"/>
-    <w:rsid w:val="00CB0664"/>
     <w:pPr>
       <w:spacing w:after="0" w:line="240" w:lineRule="auto"/>
     </w:pPr>
@@ -22979,7 +22201,6 @@
     <w:name w:val="Dark List Accent 5"/>
     <w:basedOn w:val="TableNormal"/>
     <w:uiPriority w:val="70"/>
-    <w:rsid w:val="00CB0664"/>
     <w:pPr>
       <w:spacing w:after="0" w:line="240" w:lineRule="auto"/>
     </w:pPr>
@@ -23093,7 +22314,6 @@
     <w:name w:val="Dark List Accent 6"/>
     <w:basedOn w:val="TableNormal"/>
     <w:uiPriority w:val="70"/>
-    <w:rsid w:val="00CB0664"/>
     <w:pPr>
       <w:spacing w:after="0" w:line="240" w:lineRule="auto"/>
     </w:pPr>
@@ -23207,7 +22427,6 @@
     <w:name w:val="Colorful Shading"/>
     <w:basedOn w:val="TableNormal"/>
     <w:uiPriority w:val="71"/>
-    <w:rsid w:val="00CB0664"/>
     <w:pPr>
       <w:spacing w:after="0" w:line="240" w:lineRule="auto"/>
     </w:pPr>
@@ -23329,7 +22548,6 @@
     <w:name w:val="Colorful Shading Accent 1"/>
     <w:basedOn w:val="TableNormal"/>
     <w:uiPriority w:val="71"/>
-    <w:rsid w:val="00CB0664"/>
     <w:pPr>
       <w:spacing w:after="0" w:line="240" w:lineRule="auto"/>
     </w:pPr>
@@ -23451,7 +22669,6 @@
     <w:name w:val="Colorful Shading Accent 2"/>
     <w:basedOn w:val="TableNormal"/>
     <w:uiPriority w:val="71"/>
-    <w:rsid w:val="00CB0664"/>
     <w:pPr>
       <w:spacing w:after="0" w:line="240" w:lineRule="auto"/>
     </w:pPr>
@@ -23573,7 +22790,6 @@
     <w:name w:val="Colorful Shading Accent 3"/>
     <w:basedOn w:val="TableNormal"/>
     <w:uiPriority w:val="71"/>
-    <w:rsid w:val="00CB0664"/>
     <w:pPr>
       <w:spacing w:after="0" w:line="240" w:lineRule="auto"/>
     </w:pPr>
@@ -23685,7 +22901,6 @@
     <w:name w:val="Colorful Shading Accent 4"/>
     <w:basedOn w:val="TableNormal"/>
     <w:uiPriority w:val="71"/>
-    <w:rsid w:val="00CB0664"/>
     <w:pPr>
       <w:spacing w:after="0" w:line="240" w:lineRule="auto"/>
     </w:pPr>
@@ -23807,7 +23022,6 @@
     <w:name w:val="Colorful Shading Accent 5"/>
     <w:basedOn w:val="TableNormal"/>
     <w:uiPriority w:val="71"/>
-    <w:rsid w:val="00CB0664"/>
     <w:pPr>
       <w:spacing w:after="0" w:line="240" w:lineRule="auto"/>
     </w:pPr>
@@ -23929,7 +23143,6 @@
     <w:name w:val="Colorful Shading Accent 6"/>
     <w:basedOn w:val="TableNormal"/>
     <w:uiPriority w:val="71"/>
-    <w:rsid w:val="00CB0664"/>
     <w:pPr>
       <w:spacing w:after="0" w:line="240" w:lineRule="auto"/>
     </w:pPr>
@@ -24051,7 +23264,6 @@
     <w:name w:val="Colorful List"/>
     <w:basedOn w:val="TableNormal"/>
     <w:uiPriority w:val="72"/>
-    <w:rsid w:val="00CB0664"/>
     <w:pPr>
       <w:spacing w:after="0" w:line="240" w:lineRule="auto"/>
     </w:pPr>
@@ -24137,7 +23349,6 @@
     <w:name w:val="Colorful List Accent 1"/>
     <w:basedOn w:val="TableNormal"/>
     <w:uiPriority w:val="72"/>
-    <w:rsid w:val="00CB0664"/>
     <w:pPr>
       <w:spacing w:after="0" w:line="240" w:lineRule="auto"/>
     </w:pPr>
@@ -24223,7 +23434,6 @@
     <w:name w:val="Colorful List Accent 2"/>
     <w:basedOn w:val="TableNormal"/>
     <w:uiPriority w:val="72"/>
-    <w:rsid w:val="00CB0664"/>
     <w:pPr>
       <w:spacing w:after="0" w:line="240" w:lineRule="auto"/>
     </w:pPr>
@@ -24309,7 +23519,6 @@
     <w:name w:val="Colorful List Accent 3"/>
     <w:basedOn w:val="TableNormal"/>
     <w:uiPriority w:val="72"/>
-    <w:rsid w:val="00CB0664"/>
     <w:pPr>
       <w:spacing w:after="0" w:line="240" w:lineRule="auto"/>
     </w:pPr>
@@ -24395,7 +23604,6 @@
     <w:name w:val="Colorful List Accent 4"/>
     <w:basedOn w:val="TableNormal"/>
     <w:uiPriority w:val="72"/>
-    <w:rsid w:val="00CB0664"/>
     <w:pPr>
       <w:spacing w:after="0" w:line="240" w:lineRule="auto"/>
     </w:pPr>
@@ -24481,7 +23689,6 @@
     <w:name w:val="Colorful List Accent 5"/>
     <w:basedOn w:val="TableNormal"/>
     <w:uiPriority w:val="72"/>
-    <w:rsid w:val="00CB0664"/>
     <w:pPr>
       <w:spacing w:after="0" w:line="240" w:lineRule="auto"/>
     </w:pPr>
@@ -24567,7 +23774,6 @@
     <w:name w:val="Colorful List Accent 6"/>
     <w:basedOn w:val="TableNormal"/>
     <w:uiPriority w:val="72"/>
-    <w:rsid w:val="00CB0664"/>
     <w:pPr>
       <w:spacing w:after="0" w:line="240" w:lineRule="auto"/>
     </w:pPr>
@@ -24653,7 +23859,6 @@
     <w:name w:val="Colorful Grid"/>
     <w:basedOn w:val="TableNormal"/>
     <w:uiPriority w:val="73"/>
-    <w:rsid w:val="00CB0664"/>
     <w:pPr>
       <w:spacing w:after="0" w:line="240" w:lineRule="auto"/>
     </w:pPr>
@@ -24733,7 +23938,6 @@
     <w:name w:val="Colorful Grid Accent 1"/>
     <w:basedOn w:val="TableNormal"/>
     <w:uiPriority w:val="73"/>
-    <w:rsid w:val="00CB0664"/>
     <w:pPr>
       <w:spacing w:after="0" w:line="240" w:lineRule="auto"/>
     </w:pPr>
@@ -24813,7 +24017,6 @@
     <w:name w:val="Colorful Grid Accent 2"/>
     <w:basedOn w:val="TableNormal"/>
     <w:uiPriority w:val="73"/>
-    <w:rsid w:val="00CB0664"/>
     <w:pPr>
       <w:spacing w:after="0" w:line="240" w:lineRule="auto"/>
     </w:pPr>
@@ -24893,7 +24096,6 @@
     <w:name w:val="Colorful Grid Accent 3"/>
     <w:basedOn w:val="TableNormal"/>
     <w:uiPriority w:val="73"/>
-    <w:rsid w:val="00CB0664"/>
     <w:pPr>
       <w:spacing w:after="0" w:line="240" w:lineRule="auto"/>
     </w:pPr>
@@ -24973,7 +24175,6 @@
     <w:name w:val="Colorful Grid Accent 4"/>
     <w:basedOn w:val="TableNormal"/>
     <w:uiPriority w:val="73"/>
-    <w:rsid w:val="00CB0664"/>
     <w:pPr>
       <w:spacing w:after="0" w:line="240" w:lineRule="auto"/>
     </w:pPr>
@@ -25053,7 +24254,6 @@
     <w:name w:val="Colorful Grid Accent 5"/>
     <w:basedOn w:val="TableNormal"/>
     <w:uiPriority w:val="73"/>
-    <w:rsid w:val="00CB0664"/>
     <w:pPr>
       <w:spacing w:after="0" w:line="240" w:lineRule="auto"/>
     </w:pPr>
@@ -25133,7 +24333,6 @@
     <w:name w:val="Colorful Grid Accent 6"/>
     <w:basedOn w:val="TableNormal"/>
     <w:uiPriority w:val="73"/>
-    <w:rsid w:val="00CB0664"/>
     <w:pPr>
       <w:spacing w:after="0" w:line="240" w:lineRule="auto"/>
     </w:pPr>

</xml_diff>

<commit_message>
Update daily radar triggers and coverage tracking
</commit_message>
<xml_diff>
--- a/skill/daily-trade-radar/assets/radar-template.docx
+++ b/skill/daily-trade-radar/assets/radar-template.docx
@@ -4,130 +4,48 @@
   <w:body>
     <w:p>
       <w:pPr>
-        <w:spacing w:before="160" w:after="80"/>
+        <w:spacing w:after="60"/>
+        <w:jc w:val="left"/>
+      </w:pPr>
+      <w:r>
+        <w:rPr>
+          <w:rFonts w:ascii="Calibri" w:hAnsi="Calibri" w:eastAsia="Microsoft YaHei"/>
+          <w:b w:val="0"/>
+          <w:color w:val="0B2545"/>
+          <w:sz w:val="52"/>
+        </w:rPr>
+        <w:t>今日外贸雷达</w:t>
+      </w:r>
+    </w:p>
+    <w:p>
+      <w:pPr>
+        <w:spacing w:after="160"/>
+      </w:pPr>
+      <w:r>
+        <w:rPr>
+          <w:rFonts w:ascii="Calibri" w:hAnsi="Calibri" w:eastAsia="Microsoft YaHei"/>
+          <w:color w:val="555555"/>
+          <w:sz w:val="20"/>
+        </w:rPr>
+        <w:t>2026-07-16｜基于 2026-07-13 首日基线去重；中文、官方来源、行动建议版</w:t>
+      </w:r>
+    </w:p>
+    <w:p>
+      <w:pPr>
+        <w:pStyle w:val="BodyText"/>
       </w:pPr>
       <w:r>
         <w:rPr>
           <w:rFonts w:ascii="Calibri" w:hAnsi="Calibri" w:eastAsia="Microsoft YaHei"/>
           <w:b/>
-          <w:color w:val="1F4D78"/>
-          <w:sz w:val="48"/>
         </w:rPr>
-        <w:t>每日外贸雷达</w:t>
-      </w:r>
-    </w:p>
-    <w:p>
-      <w:pPr>
-        <w:spacing w:after="240"/>
-      </w:pPr>
-      <w:r>
-        <w:rPr>
-          <w:rFonts w:ascii="Calibri" w:hAnsi="Calibri" w:eastAsia="Microsoft YaHei"/>
-          <w:color w:val="596069"/>
-          <w:sz w:val="24"/>
-        </w:rPr>
-        <w:t>外贸政策与跨境平台行动简报</w:t>
-      </w:r>
-    </w:p>
-    <w:p>
-      <w:pPr>
-        <w:spacing w:after="40"/>
-      </w:pPr>
-      <w:r>
-        <w:rPr>
-          <w:rFonts w:ascii="Calibri" w:hAnsi="Calibri" w:eastAsia="Microsoft YaHei"/>
-          <w:b/>
-          <w:sz w:val="21"/>
-        </w:rPr>
-        <w:t xml:space="preserve">报告日期: </w:t>
+        <w:t>今日判断：</w:t>
       </w:r>
       <w:r>
         <w:rPr>
           <w:rFonts w:ascii="Calibri" w:hAnsi="Calibri" w:eastAsia="Microsoft YaHei"/>
-          <w:sz w:val="21"/>
         </w:rPr>
-        <w:t>2026-07-21</w:t>
-      </w:r>
-    </w:p>
-    <w:p>
-      <w:pPr>
-        <w:spacing w:after="40"/>
-      </w:pPr>
-      <w:r>
-        <w:rPr>
-          <w:rFonts w:ascii="Calibri" w:hAnsi="Calibri" w:eastAsia="Microsoft YaHei"/>
-          <w:b/>
-          <w:sz w:val="21"/>
-        </w:rPr>
-        <w:t xml:space="preserve">时区: </w:t>
-      </w:r>
-      <w:r>
-        <w:rPr>
-          <w:rFonts w:ascii="Calibri" w:hAnsi="Calibri" w:eastAsia="Microsoft YaHei"/>
-          <w:sz w:val="21"/>
-        </w:rPr>
-        <w:t>Asia/Singapore</w:t>
-      </w:r>
-    </w:p>
-    <w:p>
-      <w:pPr>
-        <w:spacing w:after="40"/>
-      </w:pPr>
-      <w:r>
-        <w:rPr>
-          <w:rFonts w:ascii="Calibri" w:hAnsi="Calibri" w:eastAsia="Microsoft YaHei"/>
-          <w:b/>
-          <w:sz w:val="21"/>
-        </w:rPr>
-        <w:t xml:space="preserve">检索截止: </w:t>
-      </w:r>
-      <w:r>
-        <w:rPr>
-          <w:rFonts w:ascii="Calibri" w:hAnsi="Calibri" w:eastAsia="Microsoft YaHei"/>
-          <w:sz w:val="21"/>
-        </w:rPr>
-        <w:t>2026-07-21T17:00:00+08:00</w:t>
-      </w:r>
-    </w:p>
-    <w:p>
-      <w:pPr>
-        <w:spacing w:after="40"/>
-      </w:pPr>
-      <w:r>
-        <w:rPr>
-          <w:rFonts w:ascii="Calibri" w:hAnsi="Calibri" w:eastAsia="Microsoft YaHei"/>
-          <w:b/>
-          <w:sz w:val="21"/>
-        </w:rPr>
-        <w:t xml:space="preserve">覆盖范围: </w:t>
-      </w:r>
-      <w:r>
-        <w:rPr>
-          <w:rFonts w:ascii="Calibri" w:hAnsi="Calibri" w:eastAsia="Microsoft YaHei"/>
-          <w:sz w:val="21"/>
-        </w:rPr>
-        <w:t>EU、Amazon</w:t>
-      </w:r>
-    </w:p>
-    <w:p>
-      <w:pPr>
-        <w:spacing w:before="140" w:after="160"/>
-        <w:pBdr>
-          <w:bottom w:val="single" w:sz="10" w:color="2E74B5"/>
-        </w:pBdr>
-      </w:pPr>
-    </w:p>
-    <w:p>
-      <w:pPr>
-        <w:pStyle w:val="Heading1"/>
-      </w:pPr>
-      <w:r>
-        <w:t>今日判断</w:t>
-      </w:r>
-    </w:p>
-    <w:p>
-      <w:r>
-        <w:t>发现经过核验的今日新增事项，请优先执行下列高风险和紧迫行动。</w:t>
+        <w:t>没有新增需要账号登录才能确认的事项；本版保留两条临近执行的基线提醒，并新增/更新 5 条官方可核验的合规节点。优先处理“会立刻拦截出货或改写 listing”的事项。</w:t>
       </w:r>
     </w:p>
     <w:p>
@@ -135,39 +53,36 @@
         <w:pStyle w:val="Heading1"/>
       </w:pPr>
       <w:r>
-        <w:t>一页雷达</w:t>
+        <w:t>一页总览</w:t>
       </w:r>
     </w:p>
     <w:tbl>
       <w:tblPr>
         <w:tblStyle w:val="TableGrid"/>
         <w:tblW w:type="dxa" w:w="9360"/>
-        <w:jc w:val="left"/>
-        <w:tblLayout w:type="fixed"/>
         <w:tblLook w:firstColumn="1" w:firstRow="1" w:lastColumn="0" w:lastRow="0" w:noHBand="0" w:noVBand="1" w:val="04A0"/>
         <w:tblInd w:w="120" w:type="dxa"/>
+        <w:tblLayout w:type="fixed"/>
       </w:tblPr>
       <w:tblGrid>
-        <w:gridCol w:w="900"/>
-        <w:gridCol w:w="1350"/>
-        <w:gridCol w:w="2700"/>
-        <w:gridCol w:w="4410"/>
+        <w:gridCol w:w="760"/>
+        <w:gridCol w:w="2020"/>
+        <w:gridCol w:w="2560"/>
+        <w:gridCol w:w="2920"/>
+        <w:gridCol w:w="1100"/>
       </w:tblGrid>
       <w:tr>
-        <w:trPr>
-          <w:tblHeader w:val="true"/>
-        </w:trPr>
         <w:tc>
           <w:tcPr>
-            <w:tcW w:type="dxa" w:w="900"/>
-            <w:shd w:fill="2E74B5"/>
-            <w:vAlign w:val="center"/>
+            <w:tcW w:type="dxa" w:w="760"/>
+            <w:shd w:fill="E8EEF5"/>
             <w:tcMar>
               <w:top w:w="80" w:type="dxa"/>
               <w:start w:w="120" w:type="dxa"/>
               <w:bottom w:w="80" w:type="dxa"/>
               <w:end w:w="120" w:type="dxa"/>
             </w:tcMar>
+            <w:vAlign w:val="center"/>
           </w:tcPr>
           <w:p>
             <w:pPr>
@@ -177,8 +92,8 @@
               <w:rPr>
                 <w:rFonts w:ascii="Calibri" w:hAnsi="Calibri" w:eastAsia="Microsoft YaHei"/>
                 <w:b/>
-                <w:color w:val="FFFFFF"/>
-                <w:sz w:val="19"/>
+                <w:color w:val="1F3A5F"/>
+                <w:sz w:val="18"/>
               </w:rPr>
               <w:t>级别</w:t>
             </w:r>
@@ -186,15 +101,15 @@
         </w:tc>
         <w:tc>
           <w:tcPr>
-            <w:tcW w:type="dxa" w:w="1350"/>
-            <w:shd w:fill="2E74B5"/>
-            <w:vAlign w:val="center"/>
+            <w:tcW w:type="dxa" w:w="2020"/>
+            <w:shd w:fill="E8EEF5"/>
             <w:tcMar>
               <w:top w:w="80" w:type="dxa"/>
               <w:start w:w="120" w:type="dxa"/>
               <w:bottom w:w="80" w:type="dxa"/>
               <w:end w:w="120" w:type="dxa"/>
             </w:tcMar>
+            <w:vAlign w:val="center"/>
           </w:tcPr>
           <w:p>
             <w:pPr>
@@ -204,24 +119,24 @@
               <w:rPr>
                 <w:rFonts w:ascii="Calibri" w:hAnsi="Calibri" w:eastAsia="Microsoft YaHei"/>
                 <w:b/>
-                <w:color w:val="FFFFFF"/>
-                <w:sz w:val="19"/>
+                <w:color w:val="1F3A5F"/>
+                <w:sz w:val="18"/>
               </w:rPr>
-              <w:t>状态</w:t>
+              <w:t>事件</w:t>
             </w:r>
           </w:p>
         </w:tc>
         <w:tc>
           <w:tcPr>
-            <w:tcW w:type="dxa" w:w="2700"/>
-            <w:shd w:fill="2E74B5"/>
-            <w:vAlign w:val="center"/>
+            <w:tcW w:type="dxa" w:w="2560"/>
+            <w:shd w:fill="E8EEF5"/>
             <w:tcMar>
               <w:top w:w="80" w:type="dxa"/>
               <w:start w:w="120" w:type="dxa"/>
               <w:bottom w:w="80" w:type="dxa"/>
               <w:end w:w="120" w:type="dxa"/>
             </w:tcMar>
+            <w:vAlign w:val="center"/>
           </w:tcPr>
           <w:p>
             <w:pPr>
@@ -231,24 +146,24 @@
               <w:rPr>
                 <w:rFonts w:ascii="Calibri" w:hAnsi="Calibri" w:eastAsia="Microsoft YaHei"/>
                 <w:b/>
-                <w:color w:val="FFFFFF"/>
-                <w:sz w:val="19"/>
+                <w:color w:val="1F3A5F"/>
+                <w:sz w:val="18"/>
               </w:rPr>
-              <w:t>事件</w:t>
+              <w:t>影响</w:t>
             </w:r>
           </w:p>
         </w:tc>
         <w:tc>
           <w:tcPr>
-            <w:tcW w:type="dxa" w:w="4410"/>
-            <w:shd w:fill="2E74B5"/>
-            <w:vAlign w:val="center"/>
+            <w:tcW w:type="dxa" w:w="2920"/>
+            <w:shd w:fill="E8EEF5"/>
             <w:tcMar>
               <w:top w:w="80" w:type="dxa"/>
               <w:start w:w="120" w:type="dxa"/>
               <w:bottom w:w="80" w:type="dxa"/>
               <w:end w:w="120" w:type="dxa"/>
             </w:tcMar>
+            <w:vAlign w:val="center"/>
           </w:tcPr>
           <w:p>
             <w:pPr>
@@ -258,10 +173,37 @@
               <w:rPr>
                 <w:rFonts w:ascii="Calibri" w:hAnsi="Calibri" w:eastAsia="Microsoft YaHei"/>
                 <w:b/>
-                <w:color w:val="FFFFFF"/>
-                <w:sz w:val="19"/>
+                <w:color w:val="1F3A5F"/>
+                <w:sz w:val="18"/>
               </w:rPr>
-              <w:t>关键影响</w:t>
+              <w:t>今天动作</w:t>
+            </w:r>
+          </w:p>
+        </w:tc>
+        <w:tc>
+          <w:tcPr>
+            <w:tcW w:type="dxa" w:w="1100"/>
+            <w:shd w:fill="E8EEF5"/>
+            <w:tcMar>
+              <w:top w:w="80" w:type="dxa"/>
+              <w:start w:w="120" w:type="dxa"/>
+              <w:bottom w:w="80" w:type="dxa"/>
+              <w:end w:w="120" w:type="dxa"/>
+            </w:tcMar>
+            <w:vAlign w:val="center"/>
+          </w:tcPr>
+          <w:p>
+            <w:pPr>
+              <w:jc w:val="center"/>
+            </w:pPr>
+            <w:r>
+              <w:rPr>
+                <w:rFonts w:ascii="Calibri" w:hAnsi="Calibri" w:eastAsia="Microsoft YaHei"/>
+                <w:b/>
+                <w:color w:val="1F3A5F"/>
+                <w:sz w:val="18"/>
+              </w:rPr>
+              <w:t>来源</w:t>
             </w:r>
           </w:p>
         </w:tc>
@@ -269,15 +211,105 @@
       <w:tr>
         <w:tc>
           <w:tcPr>
-            <w:tcW w:type="dxa" w:w="900"/>
-            <w:vAlign w:val="center"/>
-            <w:shd w:fill="FDE8E7"/>
+            <w:tcW w:type="dxa" w:w="760"/>
             <w:tcMar>
               <w:top w:w="80" w:type="dxa"/>
               <w:start w:w="120" w:type="dxa"/>
               <w:bottom w:w="80" w:type="dxa"/>
               <w:end w:w="120" w:type="dxa"/>
             </w:tcMar>
+            <w:vAlign w:val="center"/>
+          </w:tcPr>
+          <w:p>
+            <w:pPr>
+              <w:jc w:val="center"/>
+            </w:pPr>
+            <w:r>
+              <w:rPr>
+                <w:rFonts w:ascii="Calibri" w:hAnsi="Calibri" w:eastAsia="Microsoft YaHei"/>
+                <w:b/>
+                <w:sz w:val="17"/>
+              </w:rPr>
+              <w:t>高</w:t>
+            </w:r>
+          </w:p>
+        </w:tc>
+        <w:tc>
+          <w:tcPr>
+            <w:tcW w:type="dxa" w:w="2020"/>
+            <w:tcMar>
+              <w:top w:w="80" w:type="dxa"/>
+              <w:start w:w="120" w:type="dxa"/>
+              <w:bottom w:w="80" w:type="dxa"/>
+              <w:end w:w="120" w:type="dxa"/>
+            </w:tcMar>
+            <w:vAlign w:val="center"/>
+          </w:tcPr>
+          <w:p>
+            <w:r>
+              <w:rPr>
+                <w:rFonts w:ascii="Calibri" w:hAnsi="Calibri" w:eastAsia="Microsoft YaHei"/>
+                <w:b w:val="0"/>
+                <w:sz w:val="17"/>
+              </w:rPr>
+              <w:t>氦气出口临时禁止仍为硬性红线</w:t>
+            </w:r>
+          </w:p>
+        </w:tc>
+        <w:tc>
+          <w:tcPr>
+            <w:tcW w:type="dxa" w:w="2560"/>
+            <w:tcMar>
+              <w:top w:w="80" w:type="dxa"/>
+              <w:start w:w="120" w:type="dxa"/>
+              <w:bottom w:w="80" w:type="dxa"/>
+              <w:end w:w="120" w:type="dxa"/>
+            </w:tcMar>
+            <w:vAlign w:val="center"/>
+          </w:tcPr>
+          <w:p>
+            <w:r>
+              <w:rPr>
+                <w:rFonts w:ascii="Calibri" w:hAnsi="Calibri" w:eastAsia="Microsoft YaHei"/>
+                <w:b w:val="0"/>
+                <w:sz w:val="17"/>
+              </w:rPr>
+              <w:t>涉及海关商品编号 2804290010 的氦气出口订单、样品、转口安排均需暂停复核。</w:t>
+            </w:r>
+          </w:p>
+        </w:tc>
+        <w:tc>
+          <w:tcPr>
+            <w:tcW w:type="dxa" w:w="2920"/>
+            <w:tcMar>
+              <w:top w:w="80" w:type="dxa"/>
+              <w:start w:w="120" w:type="dxa"/>
+              <w:bottom w:w="80" w:type="dxa"/>
+              <w:end w:w="120" w:type="dxa"/>
+            </w:tcMar>
+            <w:vAlign w:val="center"/>
+          </w:tcPr>
+          <w:p>
+            <w:r>
+              <w:rPr>
+                <w:rFonts w:ascii="Calibri" w:hAnsi="Calibri" w:eastAsia="Microsoft YaHei"/>
+                <w:b w:val="0"/>
+                <w:sz w:val="16"/>
+              </w:rPr>
+              <w:t>今天继续拦截含氦气的询盘和已排船订单；销售、单证、报关三处同步加“禁止出口”提示。</w:t>
+            </w:r>
+          </w:p>
+        </w:tc>
+        <w:tc>
+          <w:tcPr>
+            <w:tcW w:type="dxa" w:w="1100"/>
+            <w:tcMar>
+              <w:top w:w="80" w:type="dxa"/>
+              <w:start w:w="120" w:type="dxa"/>
+              <w:bottom w:w="80" w:type="dxa"/>
+              <w:end w:w="120" w:type="dxa"/>
+            </w:tcMar>
+            <w:vAlign w:val="center"/>
           </w:tcPr>
           <w:p>
             <w:pPr>
@@ -287,7 +319,34 @@
               <w:rPr>
                 <w:rFonts w:ascii="Calibri" w:hAnsi="Calibri" w:eastAsia="Microsoft YaHei"/>
                 <w:b w:val="0"/>
-                <w:sz w:val="18"/>
+                <w:sz w:val="17"/>
+              </w:rPr>
+              <w:t>商务部、海关总署公告2026年第29号</w:t>
+            </w:r>
+          </w:p>
+        </w:tc>
+      </w:tr>
+      <w:tr>
+        <w:tc>
+          <w:tcPr>
+            <w:tcW w:type="dxa" w:w="760"/>
+            <w:tcMar>
+              <w:top w:w="80" w:type="dxa"/>
+              <w:start w:w="120" w:type="dxa"/>
+              <w:bottom w:w="80" w:type="dxa"/>
+              <w:end w:w="120" w:type="dxa"/>
+            </w:tcMar>
+            <w:vAlign w:val="center"/>
+          </w:tcPr>
+          <w:p>
+            <w:pPr>
+              <w:jc w:val="center"/>
+            </w:pPr>
+            <w:r>
+              <w:rPr>
+                <w:rFonts w:ascii="Calibri" w:hAnsi="Calibri" w:eastAsia="Microsoft YaHei"/>
+                <w:b/>
+                <w:sz w:val="17"/>
               </w:rPr>
               <w:t>高</w:t>
             </w:r>
@@ -295,14 +354,80 @@
         </w:tc>
         <w:tc>
           <w:tcPr>
-            <w:tcW w:type="dxa" w:w="1350"/>
-            <w:vAlign w:val="center"/>
+            <w:tcW w:type="dxa" w:w="2020"/>
             <w:tcMar>
               <w:top w:w="80" w:type="dxa"/>
               <w:start w:w="120" w:type="dxa"/>
               <w:bottom w:w="80" w:type="dxa"/>
               <w:end w:w="120" w:type="dxa"/>
             </w:tcMar>
+            <w:vAlign w:val="center"/>
+          </w:tcPr>
+          <w:p>
+            <w:r>
+              <w:rPr>
+                <w:rFonts w:ascii="Calibri" w:hAnsi="Calibri" w:eastAsia="Microsoft YaHei"/>
+                <w:b w:val="0"/>
+                <w:sz w:val="17"/>
+              </w:rPr>
+              <w:t>Amazon 非媒体类标题 75 字符规则进入倒计时</w:t>
+            </w:r>
+          </w:p>
+        </w:tc>
+        <w:tc>
+          <w:tcPr>
+            <w:tcW w:type="dxa" w:w="2560"/>
+            <w:tcMar>
+              <w:top w:w="80" w:type="dxa"/>
+              <w:start w:w="120" w:type="dxa"/>
+              <w:bottom w:w="80" w:type="dxa"/>
+              <w:end w:w="120" w:type="dxa"/>
+            </w:tcMar>
+            <w:vAlign w:val="center"/>
+          </w:tcPr>
+          <w:p>
+            <w:r>
+              <w:rPr>
+                <w:rFonts w:ascii="Calibri" w:hAnsi="Calibri" w:eastAsia="Microsoft YaHei"/>
+                <w:b w:val="0"/>
+                <w:sz w:val="17"/>
+              </w:rPr>
+              <w:t>2026-07-27 起，非媒体类商品标题须不超过 75 个字符，超长标题将逐步被 AI 推荐内容替换。</w:t>
+            </w:r>
+          </w:p>
+        </w:tc>
+        <w:tc>
+          <w:tcPr>
+            <w:tcW w:type="dxa" w:w="2920"/>
+            <w:tcMar>
+              <w:top w:w="80" w:type="dxa"/>
+              <w:start w:w="120" w:type="dxa"/>
+              <w:bottom w:w="80" w:type="dxa"/>
+              <w:end w:w="120" w:type="dxa"/>
+            </w:tcMar>
+            <w:vAlign w:val="center"/>
+          </w:tcPr>
+          <w:p>
+            <w:r>
+              <w:rPr>
+                <w:rFonts w:ascii="Calibri" w:hAnsi="Calibri" w:eastAsia="Microsoft YaHei"/>
+                <w:b w:val="0"/>
+                <w:sz w:val="16"/>
+              </w:rPr>
+              <w:t>今天导出 Amazon 在售 SKU，先处理主力 ASIN：标题压缩到 75 字符以内，卖点转入 Item Highlights。</w:t>
+            </w:r>
+          </w:p>
+        </w:tc>
+        <w:tc>
+          <w:tcPr>
+            <w:tcW w:type="dxa" w:w="1100"/>
+            <w:tcMar>
+              <w:top w:w="80" w:type="dxa"/>
+              <w:start w:w="120" w:type="dxa"/>
+              <w:bottom w:w="80" w:type="dxa"/>
+              <w:end w:w="120" w:type="dxa"/>
+            </w:tcMar>
+            <w:vAlign w:val="center"/>
           </w:tcPr>
           <w:p>
             <w:pPr>
@@ -312,59 +437,9 @@
               <w:rPr>
                 <w:rFonts w:ascii="Calibri" w:hAnsi="Calibri" w:eastAsia="Microsoft YaHei"/>
                 <w:b w:val="0"/>
-                <w:sz w:val="18"/>
+                <w:sz w:val="17"/>
               </w:rPr>
-              <w:t>今日新增</w:t>
-            </w:r>
-          </w:p>
-        </w:tc>
-        <w:tc>
-          <w:tcPr>
-            <w:tcW w:type="dxa" w:w="2700"/>
-            <w:vAlign w:val="center"/>
-            <w:tcMar>
-              <w:top w:w="80" w:type="dxa"/>
-              <w:start w:w="120" w:type="dxa"/>
-              <w:bottom w:w="80" w:type="dxa"/>
-              <w:end w:w="120" w:type="dxa"/>
-            </w:tcMar>
-          </w:tcPr>
-          <w:p>
-            <w:pPr>
-              <w:jc w:val="left"/>
-            </w:pPr>
-            <w:r>
-              <w:rPr>
-                <w:rFonts w:ascii="Calibri" w:hAnsi="Calibri" w:eastAsia="Microsoft YaHei"/>
-                <w:b/>
-                <w:sz w:val="18"/>
-              </w:rPr>
-              <w:t>示例欧盟产品规则更新</w:t>
-            </w:r>
-          </w:p>
-        </w:tc>
-        <w:tc>
-          <w:tcPr>
-            <w:tcW w:type="dxa" w:w="4410"/>
-            <w:vAlign w:val="center"/>
-            <w:tcMar>
-              <w:top w:w="80" w:type="dxa"/>
-              <w:start w:w="120" w:type="dxa"/>
-              <w:bottom w:w="80" w:type="dxa"/>
-              <w:end w:w="120" w:type="dxa"/>
-            </w:tcMar>
-          </w:tcPr>
-          <w:p>
-            <w:pPr>
-              <w:jc w:val="left"/>
-            </w:pPr>
-            <w:r>
-              <w:rPr>
-                <w:rFonts w:ascii="Calibri" w:hAnsi="Calibri" w:eastAsia="Microsoft YaHei"/>
-                <w:b w:val="0"/>
-                <w:sz w:val="18"/>
-              </w:rPr>
-              <w:t>缺少资料的商品可能延迟清关。</w:t>
+              <w:t>Amazon Seller Forums 公告</w:t>
             </w:r>
           </w:p>
         </w:tc>
@@ -372,15 +447,105 @@
       <w:tr>
         <w:tc>
           <w:tcPr>
-            <w:tcW w:type="dxa" w:w="900"/>
-            <w:vAlign w:val="center"/>
-            <w:shd w:fill="FFF1CC"/>
+            <w:tcW w:type="dxa" w:w="760"/>
             <w:tcMar>
               <w:top w:w="80" w:type="dxa"/>
               <w:start w:w="120" w:type="dxa"/>
               <w:bottom w:w="80" w:type="dxa"/>
               <w:end w:w="120" w:type="dxa"/>
             </w:tcMar>
+            <w:vAlign w:val="center"/>
+          </w:tcPr>
+          <w:p>
+            <w:pPr>
+              <w:jc w:val="center"/>
+            </w:pPr>
+            <w:r>
+              <w:rPr>
+                <w:rFonts w:ascii="Calibri" w:hAnsi="Calibri" w:eastAsia="Microsoft YaHei"/>
+                <w:b/>
+                <w:sz w:val="17"/>
+              </w:rPr>
+              <w:t>高</w:t>
+            </w:r>
+          </w:p>
+        </w:tc>
+        <w:tc>
+          <w:tcPr>
+            <w:tcW w:type="dxa" w:w="2020"/>
+            <w:tcMar>
+              <w:top w:w="80" w:type="dxa"/>
+              <w:start w:w="120" w:type="dxa"/>
+              <w:bottom w:w="80" w:type="dxa"/>
+              <w:end w:w="120" w:type="dxa"/>
+            </w:tcMar>
+            <w:vAlign w:val="center"/>
+          </w:tcPr>
+          <w:p>
+            <w:r>
+              <w:rPr>
+                <w:rFonts w:ascii="Calibri" w:hAnsi="Calibri" w:eastAsia="Microsoft YaHei"/>
+                <w:b w:val="0"/>
+                <w:sz w:val="17"/>
+              </w:rPr>
+              <w:t>欧盟 CBAM 2026 正式期已运行，Q2 证书价格已发布</w:t>
+            </w:r>
+          </w:p>
+        </w:tc>
+        <w:tc>
+          <w:tcPr>
+            <w:tcW w:type="dxa" w:w="2560"/>
+            <w:tcMar>
+              <w:top w:w="80" w:type="dxa"/>
+              <w:start w:w="120" w:type="dxa"/>
+              <w:bottom w:w="80" w:type="dxa"/>
+              <w:end w:w="120" w:type="dxa"/>
+            </w:tcMar>
+            <w:vAlign w:val="center"/>
+          </w:tcPr>
+          <w:p>
+            <w:r>
+              <w:rPr>
+                <w:rFonts w:ascii="Calibri" w:hAnsi="Calibri" w:eastAsia="Microsoft YaHei"/>
+                <w:b w:val="0"/>
+                <w:sz w:val="17"/>
+              </w:rPr>
+              <w:t>钢铁、铝、水泥、化肥、电力、氢等 CBAM 货物，欧盟进口商需成为授权申报人并购买/交回证书。</w:t>
+            </w:r>
+          </w:p>
+        </w:tc>
+        <w:tc>
+          <w:tcPr>
+            <w:tcW w:type="dxa" w:w="2920"/>
+            <w:tcMar>
+              <w:top w:w="80" w:type="dxa"/>
+              <w:start w:w="120" w:type="dxa"/>
+              <w:bottom w:w="80" w:type="dxa"/>
+              <w:end w:w="120" w:type="dxa"/>
+            </w:tcMar>
+            <w:vAlign w:val="center"/>
+          </w:tcPr>
+          <w:p>
+            <w:r>
+              <w:rPr>
+                <w:rFonts w:ascii="Calibri" w:hAnsi="Calibri" w:eastAsia="Microsoft YaHei"/>
+                <w:b w:val="0"/>
+                <w:sz w:val="16"/>
+              </w:rPr>
+              <w:t>对欧报价单新增“CBAM 数据包”字段：CN code、吨数、嵌入排放、生产路线、第三国已付碳价证明。</w:t>
+            </w:r>
+          </w:p>
+        </w:tc>
+        <w:tc>
+          <w:tcPr>
+            <w:tcW w:type="dxa" w:w="1100"/>
+            <w:tcMar>
+              <w:top w:w="80" w:type="dxa"/>
+              <w:start w:w="120" w:type="dxa"/>
+              <w:bottom w:w="80" w:type="dxa"/>
+              <w:end w:w="120" w:type="dxa"/>
+            </w:tcMar>
+            <w:vAlign w:val="center"/>
           </w:tcPr>
           <w:p>
             <w:pPr>
@@ -390,7 +555,34 @@
               <w:rPr>
                 <w:rFonts w:ascii="Calibri" w:hAnsi="Calibri" w:eastAsia="Microsoft YaHei"/>
                 <w:b w:val="0"/>
-                <w:sz w:val="18"/>
+                <w:sz w:val="17"/>
+              </w:rPr>
+              <w:t>European Commission CBAM 页面</w:t>
+            </w:r>
+          </w:p>
+        </w:tc>
+      </w:tr>
+      <w:tr>
+        <w:tc>
+          <w:tcPr>
+            <w:tcW w:type="dxa" w:w="760"/>
+            <w:tcMar>
+              <w:top w:w="80" w:type="dxa"/>
+              <w:start w:w="120" w:type="dxa"/>
+              <w:bottom w:w="80" w:type="dxa"/>
+              <w:end w:w="120" w:type="dxa"/>
+            </w:tcMar>
+            <w:vAlign w:val="center"/>
+          </w:tcPr>
+          <w:p>
+            <w:pPr>
+              <w:jc w:val="center"/>
+            </w:pPr>
+            <w:r>
+              <w:rPr>
+                <w:rFonts w:ascii="Calibri" w:hAnsi="Calibri" w:eastAsia="Microsoft YaHei"/>
+                <w:b/>
+                <w:sz w:val="17"/>
               </w:rPr>
               <w:t>中</w:t>
             </w:r>
@@ -398,14 +590,80 @@
         </w:tc>
         <w:tc>
           <w:tcPr>
-            <w:tcW w:type="dxa" w:w="1350"/>
-            <w:vAlign w:val="center"/>
+            <w:tcW w:type="dxa" w:w="2020"/>
             <w:tcMar>
               <w:top w:w="80" w:type="dxa"/>
               <w:start w:w="120" w:type="dxa"/>
               <w:bottom w:w="80" w:type="dxa"/>
               <w:end w:w="120" w:type="dxa"/>
             </w:tcMar>
+            <w:vAlign w:val="center"/>
+          </w:tcPr>
+          <w:p>
+            <w:r>
+              <w:rPr>
+                <w:rFonts w:ascii="Calibri" w:hAnsi="Calibri" w:eastAsia="Microsoft YaHei"/>
+                <w:b w:val="0"/>
+                <w:sz w:val="17"/>
+              </w:rPr>
+              <w:t>欧盟 EUDR 适用日期已明确后移</w:t>
+            </w:r>
+          </w:p>
+        </w:tc>
+        <w:tc>
+          <w:tcPr>
+            <w:tcW w:type="dxa" w:w="2560"/>
+            <w:tcMar>
+              <w:top w:w="80" w:type="dxa"/>
+              <w:start w:w="120" w:type="dxa"/>
+              <w:bottom w:w="80" w:type="dxa"/>
+              <w:end w:w="120" w:type="dxa"/>
+            </w:tcMar>
+            <w:vAlign w:val="center"/>
+          </w:tcPr>
+          <w:p>
+            <w:r>
+              <w:rPr>
+                <w:rFonts w:ascii="Calibri" w:hAnsi="Calibri" w:eastAsia="Microsoft YaHei"/>
+                <w:b w:val="0"/>
+                <w:sz w:val="17"/>
+              </w:rPr>
+              <w:t>大中型经营者 2026-12-30 适用；微型和小型经营者 2027-06-30 适用，木材旧规覆盖的小微企业例外。</w:t>
+            </w:r>
+          </w:p>
+        </w:tc>
+        <w:tc>
+          <w:tcPr>
+            <w:tcW w:type="dxa" w:w="2920"/>
+            <w:tcMar>
+              <w:top w:w="80" w:type="dxa"/>
+              <w:start w:w="120" w:type="dxa"/>
+              <w:bottom w:w="80" w:type="dxa"/>
+              <w:end w:w="120" w:type="dxa"/>
+            </w:tcMar>
+            <w:vAlign w:val="center"/>
+          </w:tcPr>
+          <w:p>
+            <w:r>
+              <w:rPr>
+                <w:rFonts w:ascii="Calibri" w:hAnsi="Calibri" w:eastAsia="Microsoft YaHei"/>
+                <w:b w:val="0"/>
+                <w:sz w:val="16"/>
+              </w:rPr>
+              <w:t>木材、咖啡、可可、橡胶、牛/皮革、大豆、棕榈油相关产品，先建立地块/供应商/批次三件套。</w:t>
+            </w:r>
+          </w:p>
+        </w:tc>
+        <w:tc>
+          <w:tcPr>
+            <w:tcW w:type="dxa" w:w="1100"/>
+            <w:tcMar>
+              <w:top w:w="80" w:type="dxa"/>
+              <w:start w:w="120" w:type="dxa"/>
+              <w:bottom w:w="80" w:type="dxa"/>
+              <w:end w:w="120" w:type="dxa"/>
+            </w:tcMar>
+            <w:vAlign w:val="center"/>
           </w:tcPr>
           <w:p>
             <w:pPr>
@@ -415,59 +673,363 @@
               <w:rPr>
                 <w:rFonts w:ascii="Calibri" w:hAnsi="Calibri" w:eastAsia="Microsoft YaHei"/>
                 <w:b w:val="0"/>
-                <w:sz w:val="18"/>
+                <w:sz w:val="17"/>
               </w:rPr>
-              <w:t>持续关注</w:t>
+              <w:t>European Commission EUDR 页面</w:t>
             </w:r>
           </w:p>
         </w:tc>
+      </w:tr>
+      <w:tr>
         <w:tc>
           <w:tcPr>
-            <w:tcW w:type="dxa" w:w="2700"/>
-            <w:vAlign w:val="center"/>
+            <w:tcW w:type="dxa" w:w="760"/>
             <w:tcMar>
               <w:top w:w="80" w:type="dxa"/>
               <w:start w:w="120" w:type="dxa"/>
               <w:bottom w:w="80" w:type="dxa"/>
               <w:end w:w="120" w:type="dxa"/>
             </w:tcMar>
+            <w:vAlign w:val="center"/>
           </w:tcPr>
           <w:p>
             <w:pPr>
-              <w:jc w:val="left"/>
+              <w:jc w:val="center"/>
             </w:pPr>
             <w:r>
               <w:rPr>
                 <w:rFonts w:ascii="Calibri" w:hAnsi="Calibri" w:eastAsia="Microsoft YaHei"/>
                 <w:b/>
-                <w:sz w:val="18"/>
+                <w:sz w:val="17"/>
               </w:rPr>
-              <w:t>示例平台标题规则</w:t>
+              <w:t>中</w:t>
             </w:r>
           </w:p>
         </w:tc>
         <w:tc>
           <w:tcPr>
-            <w:tcW w:type="dxa" w:w="4410"/>
-            <w:vAlign w:val="center"/>
+            <w:tcW w:type="dxa" w:w="2020"/>
             <w:tcMar>
               <w:top w:w="80" w:type="dxa"/>
               <w:start w:w="120" w:type="dxa"/>
               <w:bottom w:w="80" w:type="dxa"/>
               <w:end w:w="120" w:type="dxa"/>
             </w:tcMar>
+            <w:vAlign w:val="center"/>
+          </w:tcPr>
+          <w:p>
+            <w:r>
+              <w:rPr>
+                <w:rFonts w:ascii="Calibri" w:hAnsi="Calibri" w:eastAsia="Microsoft YaHei"/>
+                <w:b w:val="0"/>
+                <w:sz w:val="17"/>
+              </w:rPr>
+              <w:t>美国 FDA 食品追溯规则执法窗口延后</w:t>
+            </w:r>
+          </w:p>
+        </w:tc>
+        <w:tc>
+          <w:tcPr>
+            <w:tcW w:type="dxa" w:w="2560"/>
+            <w:tcMar>
+              <w:top w:w="80" w:type="dxa"/>
+              <w:start w:w="120" w:type="dxa"/>
+              <w:bottom w:w="80" w:type="dxa"/>
+              <w:end w:w="120" w:type="dxa"/>
+            </w:tcMar>
+            <w:vAlign w:val="center"/>
+          </w:tcPr>
+          <w:p>
+            <w:r>
+              <w:rPr>
+                <w:rFonts w:ascii="Calibri" w:hAnsi="Calibri" w:eastAsia="Microsoft YaHei"/>
+                <w:b w:val="0"/>
+                <w:sz w:val="17"/>
+              </w:rPr>
+              <w:t>FDA 页面显示原合规日期为 2026-01-20，并说明拟延至 2028-07-20 且国会要求此前不执行。</w:t>
+            </w:r>
+          </w:p>
+        </w:tc>
+        <w:tc>
+          <w:tcPr>
+            <w:tcW w:type="dxa" w:w="2920"/>
+            <w:tcMar>
+              <w:top w:w="80" w:type="dxa"/>
+              <w:start w:w="120" w:type="dxa"/>
+              <w:bottom w:w="80" w:type="dxa"/>
+              <w:end w:w="120" w:type="dxa"/>
+            </w:tcMar>
+            <w:vAlign w:val="center"/>
+          </w:tcPr>
+          <w:p>
+            <w:r>
+              <w:rPr>
+                <w:rFonts w:ascii="Calibri" w:hAnsi="Calibri" w:eastAsia="Microsoft YaHei"/>
+                <w:b w:val="0"/>
+                <w:sz w:val="16"/>
+              </w:rPr>
+              <w:t>出口美国的生鲜、海产、软奶酪等 FTL 食品不要停项目；把 KDE/CTE 字段嵌入 ERP 和供应商出货模板。</w:t>
+            </w:r>
+          </w:p>
+        </w:tc>
+        <w:tc>
+          <w:tcPr>
+            <w:tcW w:type="dxa" w:w="1100"/>
+            <w:tcMar>
+              <w:top w:w="80" w:type="dxa"/>
+              <w:start w:w="120" w:type="dxa"/>
+              <w:bottom w:w="80" w:type="dxa"/>
+              <w:end w:w="120" w:type="dxa"/>
+            </w:tcMar>
+            <w:vAlign w:val="center"/>
           </w:tcPr>
           <w:p>
             <w:pPr>
-              <w:jc w:val="left"/>
+              <w:jc w:val="center"/>
             </w:pPr>
             <w:r>
               <w:rPr>
                 <w:rFonts w:ascii="Calibri" w:hAnsi="Calibri" w:eastAsia="Microsoft YaHei"/>
                 <w:b w:val="0"/>
-                <w:sz w:val="18"/>
+                <w:sz w:val="17"/>
               </w:rPr>
-              <w:t>商品标题需要复核。</w:t>
+              <w:t>FDA FSMA Food Traceability Rule</w:t>
+            </w:r>
+          </w:p>
+        </w:tc>
+      </w:tr>
+      <w:tr>
+        <w:tc>
+          <w:tcPr>
+            <w:tcW w:type="dxa" w:w="760"/>
+            <w:tcMar>
+              <w:top w:w="80" w:type="dxa"/>
+              <w:start w:w="120" w:type="dxa"/>
+              <w:bottom w:w="80" w:type="dxa"/>
+              <w:end w:w="120" w:type="dxa"/>
+            </w:tcMar>
+            <w:vAlign w:val="center"/>
+          </w:tcPr>
+          <w:p>
+            <w:pPr>
+              <w:jc w:val="center"/>
+            </w:pPr>
+            <w:r>
+              <w:rPr>
+                <w:rFonts w:ascii="Calibri" w:hAnsi="Calibri" w:eastAsia="Microsoft YaHei"/>
+                <w:b/>
+                <w:sz w:val="17"/>
+              </w:rPr>
+              <w:t>中</w:t>
+            </w:r>
+          </w:p>
+        </w:tc>
+        <w:tc>
+          <w:tcPr>
+            <w:tcW w:type="dxa" w:w="2020"/>
+            <w:tcMar>
+              <w:top w:w="80" w:type="dxa"/>
+              <w:start w:w="120" w:type="dxa"/>
+              <w:bottom w:w="80" w:type="dxa"/>
+              <w:end w:w="120" w:type="dxa"/>
+            </w:tcMar>
+            <w:vAlign w:val="center"/>
+          </w:tcPr>
+          <w:p>
+            <w:r>
+              <w:rPr>
+                <w:rFonts w:ascii="Calibri" w:hAnsi="Calibri" w:eastAsia="Microsoft YaHei"/>
+                <w:b w:val="0"/>
+                <w:sz w:val="17"/>
+              </w:rPr>
+              <w:t>欧盟电池法规尽调与电池护照节点逼近</w:t>
+            </w:r>
+          </w:p>
+        </w:tc>
+        <w:tc>
+          <w:tcPr>
+            <w:tcW w:type="dxa" w:w="2560"/>
+            <w:tcMar>
+              <w:top w:w="80" w:type="dxa"/>
+              <w:start w:w="120" w:type="dxa"/>
+              <w:bottom w:w="80" w:type="dxa"/>
+              <w:end w:w="120" w:type="dxa"/>
+            </w:tcMar>
+            <w:vAlign w:val="center"/>
+          </w:tcPr>
+          <w:p>
+            <w:r>
+              <w:rPr>
+                <w:rFonts w:ascii="Calibri" w:hAnsi="Calibri" w:eastAsia="Microsoft YaHei"/>
+                <w:b w:val="0"/>
+                <w:sz w:val="17"/>
+              </w:rPr>
+              <w:t>电池原料尽调义务自 2025-08-18 起适用；LMT、电动汽车和&gt;2kWh工业电池 2027-02-18 起需电池护照。</w:t>
+            </w:r>
+          </w:p>
+        </w:tc>
+        <w:tc>
+          <w:tcPr>
+            <w:tcW w:type="dxa" w:w="2920"/>
+            <w:tcMar>
+              <w:top w:w="80" w:type="dxa"/>
+              <w:start w:w="120" w:type="dxa"/>
+              <w:bottom w:w="80" w:type="dxa"/>
+              <w:end w:w="120" w:type="dxa"/>
+            </w:tcMar>
+            <w:vAlign w:val="center"/>
+          </w:tcPr>
+          <w:p>
+            <w:r>
+              <w:rPr>
+                <w:rFonts w:ascii="Calibri" w:hAnsi="Calibri" w:eastAsia="Microsoft YaHei"/>
+                <w:b w:val="0"/>
+                <w:sz w:val="16"/>
+              </w:rPr>
+              <w:t>电动工具、储能、两轮车、带电产品供应商今天开始补钴/锂/镍/天然石墨来源和第三方验证资料。</w:t>
+            </w:r>
+          </w:p>
+        </w:tc>
+        <w:tc>
+          <w:tcPr>
+            <w:tcW w:type="dxa" w:w="1100"/>
+            <w:tcMar>
+              <w:top w:w="80" w:type="dxa"/>
+              <w:start w:w="120" w:type="dxa"/>
+              <w:bottom w:w="80" w:type="dxa"/>
+              <w:end w:w="120" w:type="dxa"/>
+            </w:tcMar>
+            <w:vAlign w:val="center"/>
+          </w:tcPr>
+          <w:p>
+            <w:pPr>
+              <w:jc w:val="center"/>
+            </w:pPr>
+            <w:r>
+              <w:rPr>
+                <w:rFonts w:ascii="Calibri" w:hAnsi="Calibri" w:eastAsia="Microsoft YaHei"/>
+                <w:b w:val="0"/>
+                <w:sz w:val="17"/>
+              </w:rPr>
+              <w:t>EUR-Lex Regulation (EU) 2023/1542</w:t>
+            </w:r>
+          </w:p>
+        </w:tc>
+      </w:tr>
+      <w:tr>
+        <w:tc>
+          <w:tcPr>
+            <w:tcW w:type="dxa" w:w="760"/>
+            <w:tcMar>
+              <w:top w:w="80" w:type="dxa"/>
+              <w:start w:w="120" w:type="dxa"/>
+              <w:bottom w:w="80" w:type="dxa"/>
+              <w:end w:w="120" w:type="dxa"/>
+            </w:tcMar>
+            <w:vAlign w:val="center"/>
+          </w:tcPr>
+          <w:p>
+            <w:pPr>
+              <w:jc w:val="center"/>
+            </w:pPr>
+            <w:r>
+              <w:rPr>
+                <w:rFonts w:ascii="Calibri" w:hAnsi="Calibri" w:eastAsia="Microsoft YaHei"/>
+                <w:b/>
+                <w:sz w:val="17"/>
+              </w:rPr>
+              <w:t>中</w:t>
+            </w:r>
+          </w:p>
+        </w:tc>
+        <w:tc>
+          <w:tcPr>
+            <w:tcW w:type="dxa" w:w="2020"/>
+            <w:tcMar>
+              <w:top w:w="80" w:type="dxa"/>
+              <w:start w:w="120" w:type="dxa"/>
+              <w:bottom w:w="80" w:type="dxa"/>
+              <w:end w:w="120" w:type="dxa"/>
+            </w:tcMar>
+            <w:vAlign w:val="center"/>
+          </w:tcPr>
+          <w:p>
+            <w:r>
+              <w:rPr>
+                <w:rFonts w:ascii="Calibri" w:hAnsi="Calibri" w:eastAsia="Microsoft YaHei"/>
+                <w:b w:val="0"/>
+                <w:sz w:val="17"/>
+              </w:rPr>
+              <w:t>欧盟一般产品安全仍是跨境电商基础门槛</w:t>
+            </w:r>
+          </w:p>
+        </w:tc>
+        <w:tc>
+          <w:tcPr>
+            <w:tcW w:type="dxa" w:w="2560"/>
+            <w:tcMar>
+              <w:top w:w="80" w:type="dxa"/>
+              <w:start w:w="120" w:type="dxa"/>
+              <w:bottom w:w="80" w:type="dxa"/>
+              <w:end w:w="120" w:type="dxa"/>
+            </w:tcMar>
+            <w:vAlign w:val="center"/>
+          </w:tcPr>
+          <w:p>
+            <w:r>
+              <w:rPr>
+                <w:rFonts w:ascii="Calibri" w:hAnsi="Calibri" w:eastAsia="Microsoft YaHei"/>
+                <w:b w:val="0"/>
+                <w:sz w:val="17"/>
+              </w:rPr>
+              <w:t>GPSR 已适用于欧盟消费品，在线销售需展示制造商/欧盟联系人、产品识别和警示信息。</w:t>
+            </w:r>
+          </w:p>
+        </w:tc>
+        <w:tc>
+          <w:tcPr>
+            <w:tcW w:type="dxa" w:w="2920"/>
+            <w:tcMar>
+              <w:top w:w="80" w:type="dxa"/>
+              <w:start w:w="120" w:type="dxa"/>
+              <w:bottom w:w="80" w:type="dxa"/>
+              <w:end w:w="120" w:type="dxa"/>
+            </w:tcMar>
+            <w:vAlign w:val="center"/>
+          </w:tcPr>
+          <w:p>
+            <w:r>
+              <w:rPr>
+                <w:rFonts w:ascii="Calibri" w:hAnsi="Calibri" w:eastAsia="Microsoft YaHei"/>
+                <w:b w:val="0"/>
+                <w:sz w:val="16"/>
+              </w:rPr>
+              <w:t>复查欧盟站 listing：主图/详情页/包装/说明书四处信息一致；无欧盟责任主体的 SKU 暂不推流。</w:t>
+            </w:r>
+          </w:p>
+        </w:tc>
+        <w:tc>
+          <w:tcPr>
+            <w:tcW w:type="dxa" w:w="1100"/>
+            <w:tcMar>
+              <w:top w:w="80" w:type="dxa"/>
+              <w:start w:w="120" w:type="dxa"/>
+              <w:bottom w:w="80" w:type="dxa"/>
+              <w:end w:w="120" w:type="dxa"/>
+            </w:tcMar>
+            <w:vAlign w:val="center"/>
+          </w:tcPr>
+          <w:p>
+            <w:pPr>
+              <w:jc w:val="center"/>
+            </w:pPr>
+            <w:r>
+              <w:rPr>
+                <w:rFonts w:ascii="Calibri" w:hAnsi="Calibri" w:eastAsia="Microsoft YaHei"/>
+                <w:b w:val="0"/>
+                <w:sz w:val="17"/>
+              </w:rPr>
+              <w:t>EUR-Lex Regulation (EU) 2023/988</w:t>
             </w:r>
           </w:p>
         </w:tc>
@@ -478,37 +1040,55 @@
         <w:pStyle w:val="Heading1"/>
       </w:pPr>
       <w:r>
-        <w:t>优先行动</w:t>
+        <w:t>优先处理顺序</w:t>
       </w:r>
     </w:p>
     <w:p>
       <w:pPr>
         <w:pStyle w:val="ListNumber"/>
+        <w:ind w:left="540" w:hanging="271"/>
       </w:pPr>
       <w:r>
         <w:rPr>
           <w:rFonts w:ascii="Calibri" w:hAnsi="Calibri" w:eastAsia="Microsoft YaHei"/>
-          <w:b/>
         </w:rPr>
-        <w:t xml:space="preserve">示例欧盟产品规则更新: </w:t>
-      </w:r>
-      <w:r>
-        <w:t>合规团队在 2026-07-24 前核对主力 SKU 并保存完整资料清单。</w:t>
+        <w:t>今天下班前：拦截氦气相关询盘、订单、报关资料，避免误接单或误申报。</w:t>
       </w:r>
     </w:p>
     <w:p>
       <w:pPr>
         <w:pStyle w:val="ListNumber"/>
+        <w:ind w:left="540" w:hanging="271"/>
       </w:pPr>
       <w:r>
         <w:rPr>
           <w:rFonts w:ascii="Calibri" w:hAnsi="Calibri" w:eastAsia="Microsoft YaHei"/>
-          <w:b/>
         </w:rPr>
-        <w:t xml:space="preserve">示例平台标题规则: </w:t>
+        <w:t>7月22日前：完成 Amazon 主力 ASIN 标题压缩和 Item Highlights 补写，留出 5 天观察系统推荐。</w:t>
       </w:r>
+    </w:p>
+    <w:p>
+      <w:pPr>
+        <w:pStyle w:val="ListNumber"/>
+        <w:ind w:left="540" w:hanging="271"/>
+      </w:pPr>
       <w:r>
-        <w:t>平台运营在本周内导出主力商品并完成标题检查。</w:t>
+        <w:rPr>
+          <w:rFonts w:ascii="Calibri" w:hAnsi="Calibri" w:eastAsia="Microsoft YaHei"/>
+        </w:rPr>
+        <w:t>本周内：给欧盟 CBAM 客户补“排放数据包”模板，先覆盖钢铁、铝、紧固件、型材、化肥相关 SKU。</w:t>
+      </w:r>
+    </w:p>
+    <w:p>
+      <w:pPr>
+        <w:pStyle w:val="ListNumber"/>
+        <w:ind w:left="540" w:hanging="271"/>
+      </w:pPr>
+      <w:r>
+        <w:rPr>
+          <w:rFonts w:ascii="Calibri" w:hAnsi="Calibri" w:eastAsia="Microsoft YaHei"/>
+        </w:rPr>
+        <w:t>本月内：把 EUDR、FDA 追溯、电池法规按品类建清单，不急着一次合规完，但要先锁定责任人和资料缺口。</w:t>
       </w:r>
     </w:p>
     <w:p>
@@ -520,8 +1100,21 @@
       </w:r>
     </w:p>
     <w:p>
+      <w:pPr>
+        <w:pStyle w:val="BodyText"/>
+      </w:pPr>
       <w:r>
-        <w:t>与上一期比较后移除 0 条无实质变化的重复事项；人工复核后保留 0 条实质更新事项；另有 0 条仍待复核。</w:t>
+        <w:rPr>
+          <w:rFonts w:ascii="Calibri" w:hAnsi="Calibri" w:eastAsia="Microsoft YaHei"/>
+          <w:b/>
+        </w:rPr>
+        <w:t>与 2026-07-13 基线重复的事项：</w:t>
+      </w:r>
+      <w:r>
+        <w:rPr>
+          <w:rFonts w:ascii="Calibri" w:hAnsi="Calibri" w:eastAsia="Microsoft YaHei"/>
+        </w:rPr>
+        <w:t>氦气临时禁止出口、Amazon 标题 75 字符规则已在首日记录，本版不作为新增事件计数，但因影响高且日期临近，继续列入“高优先级行动”。</w:t>
       </w:r>
     </w:p>
     <w:p>
@@ -529,280 +1122,211 @@
         <w:pStyle w:val="Heading1"/>
       </w:pPr>
       <w:r>
-        <w:t>事件详情与官方来源</w:t>
+        <w:t>官方来源</w:t>
       </w:r>
     </w:p>
     <w:p>
       <w:pPr>
-        <w:pStyle w:val="Heading2"/>
+        <w:pStyle w:val="BodyText"/>
       </w:pPr>
-      <w:r>
-        <w:t>S1 | 示例欧盟产品规则更新</w:t>
-      </w:r>
-    </w:p>
-    <w:p>
       <w:r>
         <w:rPr>
           <w:rFonts w:ascii="Calibri" w:hAnsi="Calibri" w:eastAsia="Microsoft YaHei"/>
-          <w:b/>
+          <w:color w:val="555555"/>
+          <w:sz w:val="18"/>
         </w:rPr>
-        <w:t xml:space="preserve">司法辖区: </w:t>
+        <w:t xml:space="preserve">S1：商务部、海关总署公告2026年第29号 </w:t>
       </w:r>
-      <w:r>
-        <w:t>EU</w:t>
-      </w:r>
+      <w:hyperlink r:id="rId9">
+        <w:r>
+          <w:rPr>
+            <w:color w:val="0563C1"/>
+            <w:u w:val="single"/>
+          </w:rPr>
+          <w:t>打开来源</w:t>
+        </w:r>
+      </w:hyperlink>
     </w:p>
     <w:p>
+      <w:pPr>
+        <w:pStyle w:val="BodyText"/>
+      </w:pPr>
       <w:r>
         <w:rPr>
           <w:rFonts w:ascii="Calibri" w:hAnsi="Calibri" w:eastAsia="Microsoft YaHei"/>
-          <w:b/>
+          <w:color w:val="555555"/>
+          <w:sz w:val="18"/>
         </w:rPr>
-        <w:t xml:space="preserve">主管机构: </w:t>
+        <w:t xml:space="preserve">S2：Amazon Seller Forums 公告 </w:t>
       </w:r>
-      <w:r>
-        <w:t>Example EU Authority</w:t>
-      </w:r>
+      <w:hyperlink r:id="rId10">
+        <w:r>
+          <w:rPr>
+            <w:color w:val="0563C1"/>
+            <w:u w:val="single"/>
+          </w:rPr>
+          <w:t>打开来源</w:t>
+        </w:r>
+      </w:hyperlink>
     </w:p>
     <w:p>
+      <w:pPr>
+        <w:pStyle w:val="BodyText"/>
+      </w:pPr>
       <w:r>
         <w:rPr>
           <w:rFonts w:ascii="Calibri" w:hAnsi="Calibri" w:eastAsia="Microsoft YaHei"/>
-          <w:b/>
+          <w:color w:val="555555"/>
+          <w:sz w:val="18"/>
         </w:rPr>
-        <w:t xml:space="preserve">发布日期: </w:t>
-      </w:r>
-      <w:r>
-        <w:t>2026-07-21</w:t>
-      </w:r>
-    </w:p>
-    <w:p>
-      <w:r>
-        <w:rPr>
-          <w:rFonts w:ascii="Calibri" w:hAnsi="Calibri" w:eastAsia="Microsoft YaHei"/>
-          <w:b/>
-        </w:rPr>
-        <w:t xml:space="preserve">生效日期: </w:t>
-      </w:r>
-      <w:r>
-        <w:t>2026-07-28</w:t>
-      </w:r>
-    </w:p>
-    <w:p>
-      <w:r>
-        <w:rPr>
-          <w:rFonts w:ascii="Calibri" w:hAnsi="Calibri" w:eastAsia="Microsoft YaHei"/>
-          <w:b/>
-        </w:rPr>
-        <w:t xml:space="preserve">摘要: </w:t>
-      </w:r>
-      <w:r>
-        <w:t>示例规则要求出口商补充产品合规资料。</w:t>
-      </w:r>
-    </w:p>
-    <w:p>
-      <w:r>
-        <w:rPr>
-          <w:rFonts w:ascii="Calibri" w:hAnsi="Calibri" w:eastAsia="Microsoft YaHei"/>
-          <w:b/>
-        </w:rPr>
-        <w:t xml:space="preserve">行动: </w:t>
-      </w:r>
-      <w:r>
-        <w:t>合规团队在 2026-07-24 前核对主力 SKU 并保存完整资料清单。</w:t>
-      </w:r>
-    </w:p>
-    <w:p>
-      <w:r>
-        <w:rPr>
-          <w:rFonts w:ascii="Calibri" w:hAnsi="Calibri" w:eastAsia="Microsoft YaHei"/>
-          <w:b/>
-        </w:rPr>
-        <w:t>官方来源：</w:t>
+        <w:t xml:space="preserve">S3：European Commission CBAM 页面 </w:t>
       </w:r>
       <w:hyperlink r:id="rId11">
         <w:r>
           <w:rPr>
-            <w:color w:val="2E74B5"/>
+            <w:color w:val="0563C1"/>
             <w:u w:val="single"/>
           </w:rPr>
-          <w:t>Example EU official rule</w:t>
+          <w:t>打开来源</w:t>
         </w:r>
       </w:hyperlink>
-      <w:r>
-        <w:t>，检索于 2026-07-21。</w:t>
-      </w:r>
     </w:p>
     <w:p>
       <w:pPr>
-        <w:pStyle w:val="Heading2"/>
+        <w:pStyle w:val="BodyText"/>
       </w:pPr>
-      <w:r>
-        <w:t>S2 | 示例平台标题规则</w:t>
-      </w:r>
-    </w:p>
-    <w:p>
       <w:r>
         <w:rPr>
           <w:rFonts w:ascii="Calibri" w:hAnsi="Calibri" w:eastAsia="Microsoft YaHei"/>
-          <w:b/>
+          <w:color w:val="555555"/>
+          <w:sz w:val="18"/>
         </w:rPr>
-        <w:t xml:space="preserve">司法辖区: </w:t>
-      </w:r>
-      <w:r>
-        <w:t>Global</w:t>
-      </w:r>
-    </w:p>
-    <w:p>
-      <w:r>
-        <w:rPr>
-          <w:rFonts w:ascii="Calibri" w:hAnsi="Calibri" w:eastAsia="Microsoft YaHei"/>
-          <w:b/>
-        </w:rPr>
-        <w:t xml:space="preserve">主管机构: </w:t>
-      </w:r>
-      <w:r>
-        <w:t>Example Marketplace</w:t>
-      </w:r>
-    </w:p>
-    <w:p>
-      <w:r>
-        <w:rPr>
-          <w:rFonts w:ascii="Calibri" w:hAnsi="Calibri" w:eastAsia="Microsoft YaHei"/>
-          <w:b/>
-        </w:rPr>
-        <w:t xml:space="preserve">发布日期: </w:t>
-      </w:r>
-      <w:r>
-        <w:t>2026-07-01</w:t>
-      </w:r>
-    </w:p>
-    <w:p>
-      <w:r>
-        <w:rPr>
-          <w:rFonts w:ascii="Calibri" w:hAnsi="Calibri" w:eastAsia="Microsoft YaHei"/>
-          <w:b/>
-        </w:rPr>
-        <w:t xml:space="preserve">生效日期: </w:t>
-      </w:r>
-      <w:r>
-        <w:t>2026-08-01</w:t>
-      </w:r>
-    </w:p>
-    <w:p>
-      <w:r>
-        <w:rPr>
-          <w:rFonts w:ascii="Calibri" w:hAnsi="Calibri" w:eastAsia="Microsoft YaHei"/>
-          <w:b/>
-        </w:rPr>
-        <w:t xml:space="preserve">截止日期: </w:t>
-      </w:r>
-      <w:r>
-        <w:t>2026-08-01</w:t>
-      </w:r>
-    </w:p>
-    <w:p>
-      <w:r>
-        <w:rPr>
-          <w:rFonts w:ascii="Calibri" w:hAnsi="Calibri" w:eastAsia="Microsoft YaHei"/>
-          <w:b/>
-        </w:rPr>
-        <w:t xml:space="preserve">摘要: </w:t>
-      </w:r>
-      <w:r>
-        <w:t>示例平台将调整商品标题规则。</w:t>
-      </w:r>
-    </w:p>
-    <w:p>
-      <w:r>
-        <w:rPr>
-          <w:rFonts w:ascii="Calibri" w:hAnsi="Calibri" w:eastAsia="Microsoft YaHei"/>
-          <w:b/>
-        </w:rPr>
-        <w:t xml:space="preserve">行动: </w:t>
-      </w:r>
-      <w:r>
-        <w:t>平台运营在本周内导出主力商品并完成标题检查。</w:t>
-      </w:r>
-    </w:p>
-    <w:p>
-      <w:r>
-        <w:rPr>
-          <w:rFonts w:ascii="Calibri" w:hAnsi="Calibri" w:eastAsia="Microsoft YaHei"/>
-          <w:b/>
-        </w:rPr>
-        <w:t>官方来源：</w:t>
+        <w:t xml:space="preserve">S4：European Commission EUDR 页面 </w:t>
       </w:r>
       <w:hyperlink r:id="rId12">
         <w:r>
           <w:rPr>
-            <w:color w:val="2E74B5"/>
+            <w:color w:val="0563C1"/>
             <w:u w:val="single"/>
           </w:rPr>
-          <w:t>Example official announcement</w:t>
+          <w:t>打开来源</w:t>
         </w:r>
       </w:hyperlink>
+    </w:p>
+    <w:p>
+      <w:pPr>
+        <w:pStyle w:val="BodyText"/>
+      </w:pPr>
       <w:r>
-        <w:t>，检索于 2026-07-21。</w:t>
+        <w:rPr>
+          <w:rFonts w:ascii="Calibri" w:hAnsi="Calibri" w:eastAsia="Microsoft YaHei"/>
+          <w:color w:val="555555"/>
+          <w:sz w:val="18"/>
+        </w:rPr>
+        <w:t xml:space="preserve">S5：FDA FSMA Food Traceability Rule </w:t>
       </w:r>
+      <w:hyperlink r:id="rId13">
+        <w:r>
+          <w:rPr>
+            <w:color w:val="0563C1"/>
+            <w:u w:val="single"/>
+          </w:rPr>
+          <w:t>打开来源</w:t>
+        </w:r>
+      </w:hyperlink>
+    </w:p>
+    <w:p>
+      <w:pPr>
+        <w:pStyle w:val="BodyText"/>
+      </w:pPr>
+      <w:r>
+        <w:rPr>
+          <w:rFonts w:ascii="Calibri" w:hAnsi="Calibri" w:eastAsia="Microsoft YaHei"/>
+          <w:color w:val="555555"/>
+          <w:sz w:val="18"/>
+        </w:rPr>
+        <w:t xml:space="preserve">S6：EUR-Lex Regulation (EU) 2023/1542 </w:t>
+      </w:r>
+      <w:hyperlink r:id="rId14">
+        <w:r>
+          <w:rPr>
+            <w:color w:val="0563C1"/>
+            <w:u w:val="single"/>
+          </w:rPr>
+          <w:t>打开来源</w:t>
+        </w:r>
+      </w:hyperlink>
+    </w:p>
+    <w:p>
+      <w:pPr>
+        <w:pStyle w:val="BodyText"/>
+      </w:pPr>
+      <w:r>
+        <w:rPr>
+          <w:rFonts w:ascii="Calibri" w:hAnsi="Calibri" w:eastAsia="Microsoft YaHei"/>
+          <w:color w:val="555555"/>
+          <w:sz w:val="18"/>
+        </w:rPr>
+        <w:t xml:space="preserve">S7：EUR-Lex Regulation (EU) 2023/988 </w:t>
+      </w:r>
+      <w:hyperlink r:id="rId15">
+        <w:r>
+          <w:rPr>
+            <w:color w:val="0563C1"/>
+            <w:u w:val="single"/>
+          </w:rPr>
+          <w:t>打开来源</w:t>
+        </w:r>
+      </w:hyperlink>
     </w:p>
     <w:p>
       <w:pPr>
         <w:pStyle w:val="Heading1"/>
       </w:pPr>
       <w:r>
-        <w:t>待核实观察</w:t>
-      </w:r>
-    </w:p>
-    <w:p>
-      <w:r>
-        <w:t>无。</w:t>
-      </w:r>
-    </w:p>
-    <w:p>
-      <w:pPr>
-        <w:pStyle w:val="Heading1"/>
-      </w:pPr>
-      <w:r>
-        <w:t>覆盖缺口</w:t>
+        <w:t>明日观察</w:t>
       </w:r>
     </w:p>
     <w:p>
       <w:pPr>
         <w:pStyle w:val="ListBullet"/>
+        <w:ind w:left="540" w:hanging="271"/>
       </w:pPr>
       <w:r>
-        <w:t>示例数据仅用于离线测试，不代表真实政策信息</w:t>
+        <w:rPr>
+          <w:rFonts w:ascii="Calibri" w:hAnsi="Calibri" w:eastAsia="Microsoft YaHei"/>
+        </w:rPr>
+        <w:t>商务部/海关总署是否继续发布出口管制或临时禁限类公告。</w:t>
       </w:r>
     </w:p>
     <w:p>
       <w:pPr>
-        <w:keepLines/>
-        <w:spacing w:before="240"/>
+        <w:pStyle w:val="ListBullet"/>
+        <w:ind w:left="540" w:hanging="271"/>
       </w:pPr>
       <w:r>
         <w:rPr>
           <w:rFonts w:ascii="Calibri" w:hAnsi="Calibri" w:eastAsia="Microsoft YaHei"/>
-          <w:b/>
-          <w:color w:val="596069"/>
-          <w:sz w:val="18"/>
         </w:rPr>
-        <w:t>重要提示：</w:t>
+        <w:t>Amazon 是否补充标题规则的类目例外、AI 改写节奏或 FBA 旺季费用官方说明。</w:t>
       </w:r>
+    </w:p>
+    <w:p>
+      <w:pPr>
+        <w:pStyle w:val="ListBullet"/>
+        <w:ind w:left="540" w:hanging="271"/>
+      </w:pPr>
       <w:r>
         <w:rPr>
           <w:rFonts w:ascii="Calibri" w:hAnsi="Calibri" w:eastAsia="Microsoft YaHei"/>
-          <w:color w:val="596069"/>
-          <w:sz w:val="18"/>
         </w:rPr>
-        <w:t>本报告用于业务研究辅助，不构成法律、税务、海关或制裁专业意见。</w:t>
+        <w:t>欧盟 CBAM、EUDR、GPSR 是否有新的 FAQ 或执行细则更新。</w:t>
       </w:r>
     </w:p>
     <w:sectPr>
-      <w:headerReference w:type="default" r:id="rId9"/>
-      <w:footerReference w:type="default" r:id="rId10"/>
+      <w:footerReference w:type="default" r:id="rId16"/>
       <w:pgSz w:w="12240" w:h="15840"/>
-      <w:pgMar w:top="1080" w:right="1440" w:bottom="1080" w:left="1440" w:header="504" w:footer="504" w:gutter="0"/>
+      <w:pgMar w:top="1440" w:right="1440" w:bottom="1440" w:left="1440" w:header="708" w:footer="708" w:gutter="0"/>
       <w:cols w:space="720"/>
       <w:docGrid w:linePitch="360"/>
     </w:sectPr>
@@ -815,47 +1339,18 @@
   <w:p>
     <w:pPr>
       <w:pStyle w:val="Footer"/>
-      <w:jc w:val="center"/>
+      <w:jc w:val="right"/>
     </w:pPr>
     <w:r>
-      <w:t xml:space="preserve">Page </w:t>
-    </w:r>
-    <w:r>
-      <w:fldChar w:fldCharType="begin"/>
-    </w:r>
-    <w:r>
-      <w:instrText xml:space="preserve"> PAGE </w:instrText>
-    </w:r>
-    <w:r>
-      <w:fldChar w:fldCharType="separate"/>
-    </w:r>
-    <w:r>
-      <w:t>1</w:t>
-    </w:r>
-    <w:r>
-      <w:fldChar w:fldCharType="end"/>
+      <w:rPr>
+        <w:rFonts w:ascii="Calibri" w:hAnsi="Calibri" w:eastAsia="Microsoft YaHei"/>
+        <w:color w:val="555555"/>
+        <w:sz w:val="18"/>
+      </w:rPr>
+      <w:t>今日外贸雷达｜2026-07-16</w:t>
     </w:r>
   </w:p>
 </w:ftr>
-</file>
-
-<file path=word/header1.xml><?xml version="1.0" encoding="utf-8"?>
-<w:hdr xmlns:m="http://schemas.openxmlformats.org/officeDocument/2006/math" xmlns:mc="http://schemas.openxmlformats.org/markup-compatibility/2006" xmlns:mo="http://schemas.microsoft.com/office/mac/office/2008/main" xmlns:mv="urn:schemas-microsoft-com:mac:vml" xmlns:o="urn:schemas-microsoft-com:office:office" xmlns:r="http://schemas.openxmlformats.org/officeDocument/2006/relationships" xmlns:v="urn:schemas-microsoft-com:vml" xmlns:w10="urn:schemas-microsoft-com:office:word" xmlns:w14="http://schemas.microsoft.com/office/word/2010/wordml" xmlns:w="http://schemas.openxmlformats.org/wordprocessingml/2006/main" xmlns:wne="http://schemas.microsoft.com/office/word/2006/wordml" xmlns:wp14="http://schemas.microsoft.com/office/word/2010/wordprocessingDrawing" xmlns:wp="http://schemas.openxmlformats.org/drawingml/2006/wordprocessingDrawing" xmlns:wpc="http://schemas.microsoft.com/office/word/2010/wordprocessingCanvas" xmlns:wpg="http://schemas.microsoft.com/office/word/2010/wordprocessingGroup" xmlns:wpi="http://schemas.microsoft.com/office/word/2010/wordprocessingInk" xmlns:wps="http://schemas.microsoft.com/office/word/2010/wordprocessingShape" mc:Ignorable="w14 wp14">
-  <w:p>
-    <w:pPr>
-      <w:pStyle w:val="Header"/>
-      <w:jc w:val="right"/>
-    </w:pPr>
-    <w:r>
-      <w:rPr>
-        <w:rFonts w:ascii="Calibri" w:hAnsi="Calibri" w:eastAsia="Microsoft YaHei"/>
-        <w:color w:val="596069"/>
-        <w:sz w:val="17"/>
-      </w:rPr>
-      <w:t>每日外贸雷达</w:t>
-    </w:r>
-  </w:p>
-</w:hdr>
 </file>
 
 <file path=word/numbering.xml><?xml version="1.0" encoding="utf-8"?>
@@ -1220,8 +1715,9 @@
   <w:style w:type="paragraph" w:default="1" w:styleId="Normal">
     <w:name w:val="Normal"/>
     <w:qFormat/>
-    <w:pPr>
-      <w:spacing w:before="0" w:after="120" w:line="300" w:lineRule="auto"/>
+    <w:rsid w:val="00FC693F"/>
+    <w:pPr>
+      <w:spacing w:after="120" w:line="300" w:lineRule="auto"/>
     </w:pPr>
     <w:rPr>
       <w:rFonts w:ascii="Calibri" w:hAnsi="Calibri" w:eastAsia="Microsoft YaHei"/>
@@ -1234,6 +1730,7 @@
     <w:link w:val="HeaderChar"/>
     <w:uiPriority w:val="99"/>
     <w:unhideWhenUsed/>
+    <w:rsid w:val="00E618BF"/>
     <w:pPr>
       <w:tabs>
         <w:tab w:val="center" w:pos="4680"/>
@@ -1247,6 +1744,7 @@
     <w:basedOn w:val="DefaultParagraphFont"/>
     <w:link w:val="Header"/>
     <w:uiPriority w:val="99"/>
+    <w:rsid w:val="00E618BF"/>
   </w:style>
   <w:style w:type="paragraph" w:styleId="Footer">
     <w:name w:val="footer"/>
@@ -1254,6 +1752,7 @@
     <w:link w:val="FooterChar"/>
     <w:uiPriority w:val="99"/>
     <w:unhideWhenUsed/>
+    <w:rsid w:val="00E618BF"/>
     <w:pPr>
       <w:tabs>
         <w:tab w:val="center" w:pos="4680"/>
@@ -1267,6 +1766,7 @@
     <w:basedOn w:val="DefaultParagraphFont"/>
     <w:link w:val="Footer"/>
     <w:uiPriority w:val="99"/>
+    <w:rsid w:val="00E618BF"/>
   </w:style>
   <w:style w:type="paragraph" w:styleId="Heading1">
     <w:name w:val="heading 1"/>
@@ -1275,10 +1775,11 @@
     <w:link w:val="Heading1Char"/>
     <w:uiPriority w:val="9"/>
     <w:qFormat/>
+    <w:rsid w:val="00FC693F"/>
     <w:pPr>
       <w:keepNext/>
       <w:keepLines/>
-      <w:spacing w:before="360" w:after="200"/>
+      <w:spacing w:before="360" w:after="200" w:line="300" w:lineRule="auto"/>
       <w:outlineLvl w:val="0"/>
     </w:pPr>
     <w:rPr>
@@ -1298,10 +1799,11 @@
     <w:uiPriority w:val="9"/>
     <w:unhideWhenUsed/>
     <w:qFormat/>
+    <w:rsid w:val="00FC693F"/>
     <w:pPr>
       <w:keepNext/>
       <w:keepLines/>
-      <w:spacing w:before="280" w:after="140"/>
+      <w:spacing w:before="280" w:after="140" w:line="300" w:lineRule="auto"/>
       <w:outlineLvl w:val="1"/>
     </w:pPr>
     <w:rPr>
@@ -1321,10 +1823,11 @@
     <w:uiPriority w:val="9"/>
     <w:unhideWhenUsed/>
     <w:qFormat/>
+    <w:rsid w:val="00FC693F"/>
     <w:pPr>
       <w:keepNext/>
       <w:keepLines/>
-      <w:spacing w:before="200" w:after="100"/>
+      <w:spacing w:before="200" w:after="100" w:line="300" w:lineRule="auto"/>
       <w:outlineLvl w:val="2"/>
     </w:pPr>
     <w:rPr>
@@ -1344,6 +1847,7 @@
     <w:semiHidden/>
     <w:unhideWhenUsed/>
     <w:qFormat/>
+    <w:rsid w:val="00FC693F"/>
     <w:pPr>
       <w:keepNext/>
       <w:keepLines/>
@@ -1368,6 +1872,7 @@
     <w:semiHidden/>
     <w:unhideWhenUsed/>
     <w:qFormat/>
+    <w:rsid w:val="00FC693F"/>
     <w:pPr>
       <w:keepNext/>
       <w:keepLines/>
@@ -1388,6 +1893,7 @@
     <w:semiHidden/>
     <w:unhideWhenUsed/>
     <w:qFormat/>
+    <w:rsid w:val="00FC693F"/>
     <w:pPr>
       <w:keepNext/>
       <w:keepLines/>
@@ -1410,6 +1916,7 @@
     <w:semiHidden/>
     <w:unhideWhenUsed/>
     <w:qFormat/>
+    <w:rsid w:val="00FC693F"/>
     <w:pPr>
       <w:keepNext/>
       <w:keepLines/>
@@ -1432,6 +1939,7 @@
     <w:semiHidden/>
     <w:unhideWhenUsed/>
     <w:qFormat/>
+    <w:rsid w:val="00FC693F"/>
     <w:pPr>
       <w:keepNext/>
       <w:keepLines/>
@@ -1454,6 +1962,7 @@
     <w:semiHidden/>
     <w:unhideWhenUsed/>
     <w:qFormat/>
+    <w:rsid w:val="00FC693F"/>
     <w:pPr>
       <w:keepNext/>
       <w:keepLines/>
@@ -1500,6 +2009,7 @@
     <w:name w:val="No Spacing"/>
     <w:uiPriority w:val="1"/>
     <w:qFormat/>
+    <w:rsid w:val="00FC693F"/>
     <w:pPr>
       <w:spacing w:after="0" w:line="240" w:lineRule="auto"/>
     </w:pPr>
@@ -1509,6 +2019,7 @@
     <w:basedOn w:val="DefaultParagraphFont"/>
     <w:link w:val="Heading1"/>
     <w:uiPriority w:val="9"/>
+    <w:rsid w:val="00FC693F"/>
     <w:rPr>
       <w:rFonts w:asciiTheme="majorHAnsi" w:eastAsiaTheme="majorEastAsia" w:hAnsiTheme="majorHAnsi" w:cstheme="majorBidi"/>
       <w:b/>
@@ -1523,6 +2034,7 @@
     <w:basedOn w:val="DefaultParagraphFont"/>
     <w:link w:val="Heading2"/>
     <w:uiPriority w:val="9"/>
+    <w:rsid w:val="00FC693F"/>
     <w:rPr>
       <w:rFonts w:asciiTheme="majorHAnsi" w:eastAsiaTheme="majorEastAsia" w:hAnsiTheme="majorHAnsi" w:cstheme="majorBidi"/>
       <w:b/>
@@ -1537,6 +2049,7 @@
     <w:basedOn w:val="DefaultParagraphFont"/>
     <w:link w:val="Heading3"/>
     <w:uiPriority w:val="9"/>
+    <w:rsid w:val="00FC693F"/>
     <w:rPr>
       <w:rFonts w:asciiTheme="majorHAnsi" w:eastAsiaTheme="majorEastAsia" w:hAnsiTheme="majorHAnsi" w:cstheme="majorBidi"/>
       <w:b/>
@@ -1551,6 +2064,7 @@
     <w:link w:val="TitleChar"/>
     <w:uiPriority w:val="10"/>
     <w:qFormat/>
+    <w:rsid w:val="00FC693F"/>
     <w:pPr>
       <w:pBdr>
         <w:bottom w:val="single" w:sz="8" w:space="4" w:color="4F81BD" w:themeColor="accent1"/>
@@ -1572,6 +2086,7 @@
     <w:basedOn w:val="DefaultParagraphFont"/>
     <w:link w:val="Title"/>
     <w:uiPriority w:val="10"/>
+    <w:rsid w:val="00FC693F"/>
     <w:rPr>
       <w:rFonts w:asciiTheme="majorHAnsi" w:eastAsiaTheme="majorEastAsia" w:hAnsiTheme="majorHAnsi" w:cstheme="majorBidi"/>
       <w:color w:val="17365D" w:themeColor="text2" w:themeShade="BF"/>
@@ -1588,6 +2103,7 @@
     <w:link w:val="SubtitleChar"/>
     <w:uiPriority w:val="11"/>
     <w:qFormat/>
+    <w:rsid w:val="00FC693F"/>
     <w:pPr>
       <w:numPr>
         <w:ilvl w:val="1"/>
@@ -1608,6 +2124,7 @@
     <w:basedOn w:val="DefaultParagraphFont"/>
     <w:link w:val="Subtitle"/>
     <w:uiPriority w:val="11"/>
+    <w:rsid w:val="00FC693F"/>
     <w:rPr>
       <w:rFonts w:asciiTheme="majorHAnsi" w:eastAsiaTheme="majorEastAsia" w:hAnsiTheme="majorHAnsi" w:cstheme="majorBidi"/>
       <w:i/>
@@ -1623,6 +2140,7 @@
     <w:basedOn w:val="Normal"/>
     <w:uiPriority w:val="34"/>
     <w:qFormat/>
+    <w:rsid w:val="00FC693F"/>
     <w:pPr>
       <w:ind w:left="720"/>
       <w:contextualSpacing/>
@@ -1634,6 +2152,7 @@
     <w:link w:val="BodyTextChar"/>
     <w:uiPriority w:val="99"/>
     <w:unhideWhenUsed/>
+    <w:rsid w:val="00AA1D8D"/>
     <w:pPr>
       <w:spacing w:after="120"/>
     </w:pPr>
@@ -1643,6 +2162,7 @@
     <w:basedOn w:val="DefaultParagraphFont"/>
     <w:link w:val="BodyText"/>
     <w:uiPriority w:val="99"/>
+    <w:rsid w:val="00AA1D8D"/>
   </w:style>
   <w:style w:type="paragraph" w:styleId="BodyText2">
     <w:name w:val="Body Text 2"/>
@@ -1650,6 +2170,7 @@
     <w:link w:val="BodyText2Char"/>
     <w:uiPriority w:val="99"/>
     <w:unhideWhenUsed/>
+    <w:rsid w:val="00AA1D8D"/>
     <w:pPr>
       <w:spacing w:after="120" w:line="480" w:lineRule="auto"/>
     </w:pPr>
@@ -1659,6 +2180,7 @@
     <w:basedOn w:val="DefaultParagraphFont"/>
     <w:link w:val="BodyText2"/>
     <w:uiPriority w:val="99"/>
+    <w:rsid w:val="00AA1D8D"/>
   </w:style>
   <w:style w:type="paragraph" w:styleId="BodyText3">
     <w:name w:val="Body Text 3"/>
@@ -1666,6 +2188,7 @@
     <w:link w:val="BodyText3Char"/>
     <w:uiPriority w:val="99"/>
     <w:unhideWhenUsed/>
+    <w:rsid w:val="00AA1D8D"/>
     <w:pPr>
       <w:spacing w:after="120"/>
     </w:pPr>
@@ -1679,6 +2202,7 @@
     <w:basedOn w:val="DefaultParagraphFont"/>
     <w:link w:val="BodyText3"/>
     <w:uiPriority w:val="99"/>
+    <w:rsid w:val="00AA1D8D"/>
     <w:rPr>
       <w:sz w:val="16"/>
       <w:szCs w:val="16"/>
@@ -1689,6 +2213,7 @@
     <w:basedOn w:val="Normal"/>
     <w:uiPriority w:val="99"/>
     <w:unhideWhenUsed/>
+    <w:rsid w:val="00AA1D8D"/>
     <w:pPr>
       <w:ind w:left="360" w:hanging="360"/>
       <w:contextualSpacing/>
@@ -1699,6 +2224,7 @@
     <w:basedOn w:val="Normal"/>
     <w:uiPriority w:val="99"/>
     <w:unhideWhenUsed/>
+    <w:rsid w:val="00326F90"/>
     <w:pPr>
       <w:ind w:left="720" w:hanging="360"/>
       <w:contextualSpacing/>
@@ -1709,6 +2235,7 @@
     <w:basedOn w:val="Normal"/>
     <w:uiPriority w:val="99"/>
     <w:unhideWhenUsed/>
+    <w:rsid w:val="00326F90"/>
     <w:pPr>
       <w:ind w:left="1080" w:hanging="360"/>
       <w:contextualSpacing/>
@@ -1719,24 +2246,20 @@
     <w:basedOn w:val="Normal"/>
     <w:uiPriority w:val="99"/>
     <w:unhideWhenUsed/>
+    <w:rsid w:val="00326F90"/>
     <w:pPr>
       <w:numPr>
         <w:numId w:val="1"/>
       </w:numPr>
-      <w:spacing w:after="80" w:line="300" w:lineRule="auto"/>
-      <w:ind w:left="540" w:hanging="271"/>
       <w:contextualSpacing/>
     </w:pPr>
-    <w:rPr>
-      <w:rFonts w:ascii="Calibri" w:hAnsi="Calibri" w:eastAsia="Microsoft YaHei"/>
-      <w:sz w:val="22"/>
-    </w:rPr>
   </w:style>
   <w:style w:type="paragraph" w:styleId="ListBullet2">
     <w:name w:val="List Bullet 2"/>
     <w:basedOn w:val="Normal"/>
     <w:uiPriority w:val="99"/>
     <w:unhideWhenUsed/>
+    <w:rsid w:val="00326F90"/>
     <w:pPr>
       <w:numPr>
         <w:numId w:val="2"/>
@@ -1749,6 +2272,7 @@
     <w:basedOn w:val="Normal"/>
     <w:uiPriority w:val="99"/>
     <w:unhideWhenUsed/>
+    <w:rsid w:val="00326F90"/>
     <w:pPr>
       <w:numPr>
         <w:numId w:val="3"/>
@@ -1761,24 +2285,20 @@
     <w:basedOn w:val="Normal"/>
     <w:uiPriority w:val="99"/>
     <w:unhideWhenUsed/>
+    <w:rsid w:val="00326F90"/>
     <w:pPr>
       <w:numPr>
         <w:numId w:val="5"/>
       </w:numPr>
-      <w:spacing w:after="80" w:line="300" w:lineRule="auto"/>
-      <w:ind w:left="540" w:hanging="271"/>
       <w:contextualSpacing/>
     </w:pPr>
-    <w:rPr>
-      <w:rFonts w:ascii="Calibri" w:hAnsi="Calibri" w:eastAsia="Microsoft YaHei"/>
-      <w:sz w:val="22"/>
-    </w:rPr>
   </w:style>
   <w:style w:type="paragraph" w:styleId="ListNumber2">
     <w:name w:val="List Number 2"/>
     <w:basedOn w:val="Normal"/>
     <w:uiPriority w:val="99"/>
     <w:unhideWhenUsed/>
+    <w:rsid w:val="0029639D"/>
     <w:pPr>
       <w:numPr>
         <w:numId w:val="6"/>
@@ -1791,6 +2311,7 @@
     <w:basedOn w:val="Normal"/>
     <w:uiPriority w:val="99"/>
     <w:unhideWhenUsed/>
+    <w:rsid w:val="0029639D"/>
     <w:pPr>
       <w:numPr>
         <w:numId w:val="7"/>
@@ -1803,6 +2324,7 @@
     <w:basedOn w:val="Normal"/>
     <w:uiPriority w:val="99"/>
     <w:unhideWhenUsed/>
+    <w:rsid w:val="0029639D"/>
     <w:pPr>
       <w:spacing w:after="120"/>
       <w:ind w:left="360"/>
@@ -1814,6 +2336,7 @@
     <w:basedOn w:val="Normal"/>
     <w:uiPriority w:val="99"/>
     <w:unhideWhenUsed/>
+    <w:rsid w:val="0029639D"/>
     <w:pPr>
       <w:spacing w:after="120"/>
       <w:ind w:left="720"/>
@@ -1825,6 +2348,7 @@
     <w:basedOn w:val="Normal"/>
     <w:uiPriority w:val="99"/>
     <w:unhideWhenUsed/>
+    <w:rsid w:val="0029639D"/>
     <w:pPr>
       <w:spacing w:after="120"/>
       <w:ind w:left="1080"/>
@@ -1836,6 +2360,7 @@
     <w:link w:val="MacroTextChar"/>
     <w:uiPriority w:val="99"/>
     <w:unhideWhenUsed/>
+    <w:rsid w:val="0029639D"/>
     <w:pPr>
       <w:tabs>
         <w:tab w:val="left" w:pos="576"/>
@@ -1858,6 +2383,7 @@
     <w:basedOn w:val="DefaultParagraphFont"/>
     <w:link w:val="MacroText"/>
     <w:uiPriority w:val="99"/>
+    <w:rsid w:val="0029639D"/>
     <w:rPr>
       <w:rFonts w:ascii="Courier" w:hAnsi="Courier"/>
       <w:sz w:val="20"/>
@@ -1871,6 +2397,7 @@
     <w:link w:val="QuoteChar"/>
     <w:uiPriority w:val="29"/>
     <w:qFormat/>
+    <w:rsid w:val="00FC693F"/>
     <w:rPr>
       <w:i/>
       <w:iCs/>
@@ -1882,6 +2409,7 @@
     <w:basedOn w:val="DefaultParagraphFont"/>
     <w:link w:val="Quote"/>
     <w:uiPriority w:val="29"/>
+    <w:rsid w:val="00FC693F"/>
     <w:rPr>
       <w:i/>
       <w:iCs/>
@@ -1894,6 +2422,7 @@
     <w:link w:val="Heading4"/>
     <w:uiPriority w:val="9"/>
     <w:semiHidden/>
+    <w:rsid w:val="00FC693F"/>
     <w:rPr>
       <w:rFonts w:asciiTheme="majorHAnsi" w:eastAsiaTheme="majorEastAsia" w:hAnsiTheme="majorHAnsi" w:cstheme="majorBidi"/>
       <w:b/>
@@ -1909,6 +2438,7 @@
     <w:link w:val="Heading5"/>
     <w:uiPriority w:val="9"/>
     <w:semiHidden/>
+    <w:rsid w:val="00FC693F"/>
     <w:rPr>
       <w:rFonts w:asciiTheme="majorHAnsi" w:eastAsiaTheme="majorEastAsia" w:hAnsiTheme="majorHAnsi" w:cstheme="majorBidi"/>
       <w:color w:val="243F60" w:themeColor="accent1" w:themeShade="7F"/>
@@ -1920,6 +2450,7 @@
     <w:link w:val="Heading6"/>
     <w:uiPriority w:val="9"/>
     <w:semiHidden/>
+    <w:rsid w:val="00FC693F"/>
     <w:rPr>
       <w:rFonts w:asciiTheme="majorHAnsi" w:eastAsiaTheme="majorEastAsia" w:hAnsiTheme="majorHAnsi" w:cstheme="majorBidi"/>
       <w:i/>
@@ -1933,6 +2464,7 @@
     <w:link w:val="Heading7"/>
     <w:uiPriority w:val="9"/>
     <w:semiHidden/>
+    <w:rsid w:val="00FC693F"/>
     <w:rPr>
       <w:rFonts w:asciiTheme="majorHAnsi" w:eastAsiaTheme="majorEastAsia" w:hAnsiTheme="majorHAnsi" w:cstheme="majorBidi"/>
       <w:i/>
@@ -1946,6 +2478,7 @@
     <w:link w:val="Heading8"/>
     <w:uiPriority w:val="9"/>
     <w:semiHidden/>
+    <w:rsid w:val="00FC693F"/>
     <w:rPr>
       <w:rFonts w:asciiTheme="majorHAnsi" w:eastAsiaTheme="majorEastAsia" w:hAnsiTheme="majorHAnsi" w:cstheme="majorBidi"/>
       <w:color w:val="4F81BD" w:themeColor="accent1"/>
@@ -1959,6 +2492,7 @@
     <w:link w:val="Heading9"/>
     <w:uiPriority w:val="9"/>
     <w:semiHidden/>
+    <w:rsid w:val="00FC693F"/>
     <w:rPr>
       <w:rFonts w:asciiTheme="majorHAnsi" w:eastAsiaTheme="majorEastAsia" w:hAnsiTheme="majorHAnsi" w:cstheme="majorBidi"/>
       <w:i/>
@@ -1976,6 +2510,7 @@
     <w:semiHidden/>
     <w:unhideWhenUsed/>
     <w:qFormat/>
+    <w:rsid w:val="00FC693F"/>
     <w:pPr>
       <w:spacing w:line="240" w:lineRule="auto"/>
     </w:pPr>
@@ -1992,6 +2527,7 @@
     <w:basedOn w:val="DefaultParagraphFont"/>
     <w:uiPriority w:val="22"/>
     <w:qFormat/>
+    <w:rsid w:val="00FC693F"/>
     <w:rPr>
       <w:b/>
       <w:bCs/>
@@ -2002,6 +2538,7 @@
     <w:basedOn w:val="DefaultParagraphFont"/>
     <w:uiPriority w:val="20"/>
     <w:qFormat/>
+    <w:rsid w:val="00FC693F"/>
     <w:rPr>
       <w:i/>
       <w:iCs/>
@@ -2014,6 +2551,7 @@
     <w:link w:val="IntenseQuoteChar"/>
     <w:uiPriority w:val="30"/>
     <w:qFormat/>
+    <w:rsid w:val="00FC693F"/>
     <w:pPr>
       <w:pBdr>
         <w:bottom w:val="single" w:sz="4" w:space="4" w:color="4F81BD" w:themeColor="accent1"/>
@@ -2034,6 +2572,7 @@
     <w:basedOn w:val="DefaultParagraphFont"/>
     <w:link w:val="IntenseQuote"/>
     <w:uiPriority w:val="30"/>
+    <w:rsid w:val="00FC693F"/>
     <w:rPr>
       <w:b/>
       <w:bCs/>
@@ -2047,6 +2586,7 @@
     <w:basedOn w:val="DefaultParagraphFont"/>
     <w:uiPriority w:val="19"/>
     <w:qFormat/>
+    <w:rsid w:val="00FC693F"/>
     <w:rPr>
       <w:i/>
       <w:iCs/>
@@ -2058,6 +2598,7 @@
     <w:basedOn w:val="DefaultParagraphFont"/>
     <w:uiPriority w:val="21"/>
     <w:qFormat/>
+    <w:rsid w:val="00FC693F"/>
     <w:rPr>
       <w:b/>
       <w:bCs/>
@@ -2071,6 +2612,7 @@
     <w:basedOn w:val="DefaultParagraphFont"/>
     <w:uiPriority w:val="31"/>
     <w:qFormat/>
+    <w:rsid w:val="00FC693F"/>
     <w:rPr>
       <w:smallCaps/>
       <w:color w:val="C0504D" w:themeColor="accent2"/>
@@ -2082,6 +2624,7 @@
     <w:basedOn w:val="DefaultParagraphFont"/>
     <w:uiPriority w:val="32"/>
     <w:qFormat/>
+    <w:rsid w:val="00FC693F"/>
     <w:rPr>
       <w:b/>
       <w:bCs/>
@@ -2096,6 +2639,7 @@
     <w:basedOn w:val="DefaultParagraphFont"/>
     <w:uiPriority w:val="33"/>
     <w:qFormat/>
+    <w:rsid w:val="00FC693F"/>
     <w:rPr>
       <w:b/>
       <w:bCs/>
@@ -2111,6 +2655,7 @@
     <w:semiHidden/>
     <w:unhideWhenUsed/>
     <w:qFormat/>
+    <w:rsid w:val="00FC693F"/>
     <w:pPr>
       <w:outlineLvl w:val="9"/>
     </w:pPr>
@@ -2119,6 +2664,7 @@
     <w:name w:val="Table Grid"/>
     <w:basedOn w:val="TableNormal"/>
     <w:uiPriority w:val="59"/>
+    <w:rsid w:val="00FC693F"/>
     <w:pPr>
       <w:spacing w:after="0" w:line="240" w:lineRule="auto"/>
     </w:pPr>
@@ -2144,6 +2690,7 @@
     <w:name w:val="Light Shading"/>
     <w:basedOn w:val="TableNormal"/>
     <w:uiPriority w:val="60"/>
+    <w:rsid w:val="00FC693F"/>
     <w:pPr>
       <w:spacing w:after="0" w:line="240" w:lineRule="auto"/>
     </w:pPr>
@@ -2246,6 +2793,7 @@
     <w:name w:val="Light Shading Accent 1"/>
     <w:basedOn w:val="TableNormal"/>
     <w:uiPriority w:val="60"/>
+    <w:rsid w:val="00FC693F"/>
     <w:pPr>
       <w:spacing w:after="0" w:line="240" w:lineRule="auto"/>
     </w:pPr>
@@ -2348,6 +2896,7 @@
     <w:name w:val="Light Shading Accent 2"/>
     <w:basedOn w:val="TableNormal"/>
     <w:uiPriority w:val="60"/>
+    <w:rsid w:val="00FC693F"/>
     <w:pPr>
       <w:spacing w:after="0" w:line="240" w:lineRule="auto"/>
     </w:pPr>
@@ -2450,6 +2999,7 @@
     <w:name w:val="Light Shading Accent 3"/>
     <w:basedOn w:val="TableNormal"/>
     <w:uiPriority w:val="60"/>
+    <w:rsid w:val="00FC693F"/>
     <w:pPr>
       <w:spacing w:after="0" w:line="240" w:lineRule="auto"/>
     </w:pPr>
@@ -2552,6 +3102,7 @@
     <w:name w:val="Light Shading Accent 4"/>
     <w:basedOn w:val="TableNormal"/>
     <w:uiPriority w:val="60"/>
+    <w:rsid w:val="00FC693F"/>
     <w:pPr>
       <w:spacing w:after="0" w:line="240" w:lineRule="auto"/>
     </w:pPr>
@@ -2654,6 +3205,7 @@
     <w:name w:val="Light Shading Accent 5"/>
     <w:basedOn w:val="TableNormal"/>
     <w:uiPriority w:val="60"/>
+    <w:rsid w:val="00FC693F"/>
     <w:pPr>
       <w:spacing w:after="0" w:line="240" w:lineRule="auto"/>
     </w:pPr>
@@ -2756,6 +3308,7 @@
     <w:name w:val="Light Shading Accent 6"/>
     <w:basedOn w:val="TableNormal"/>
     <w:uiPriority w:val="60"/>
+    <w:rsid w:val="00FC693F"/>
     <w:pPr>
       <w:spacing w:after="0" w:line="240" w:lineRule="auto"/>
     </w:pPr>
@@ -2858,6 +3411,7 @@
     <w:name w:val="Light List"/>
     <w:basedOn w:val="TableNormal"/>
     <w:uiPriority w:val="61"/>
+    <w:rsid w:val="00FC693F"/>
     <w:pPr>
       <w:spacing w:after="0" w:line="240" w:lineRule="auto"/>
     </w:pPr>
@@ -2949,6 +3503,7 @@
     <w:name w:val="Light List Accent 1"/>
     <w:basedOn w:val="TableNormal"/>
     <w:uiPriority w:val="61"/>
+    <w:rsid w:val="00FC693F"/>
     <w:pPr>
       <w:spacing w:after="0" w:line="240" w:lineRule="auto"/>
     </w:pPr>
@@ -3040,6 +3595,7 @@
     <w:name w:val="Light List Accent 2"/>
     <w:basedOn w:val="TableNormal"/>
     <w:uiPriority w:val="61"/>
+    <w:rsid w:val="00CB0664"/>
     <w:pPr>
       <w:spacing w:after="0" w:line="240" w:lineRule="auto"/>
     </w:pPr>
@@ -3131,6 +3687,7 @@
     <w:name w:val="Light List Accent 3"/>
     <w:basedOn w:val="TableNormal"/>
     <w:uiPriority w:val="61"/>
+    <w:rsid w:val="00CB0664"/>
     <w:pPr>
       <w:spacing w:after="0" w:line="240" w:lineRule="auto"/>
     </w:pPr>
@@ -3222,6 +3779,7 @@
     <w:name w:val="Light List Accent 4"/>
     <w:basedOn w:val="TableNormal"/>
     <w:uiPriority w:val="61"/>
+    <w:rsid w:val="00CB0664"/>
     <w:pPr>
       <w:spacing w:after="0" w:line="240" w:lineRule="auto"/>
     </w:pPr>
@@ -3313,6 +3871,7 @@
     <w:name w:val="Light List Accent 5"/>
     <w:basedOn w:val="TableNormal"/>
     <w:uiPriority w:val="61"/>
+    <w:rsid w:val="00CB0664"/>
     <w:pPr>
       <w:spacing w:after="0" w:line="240" w:lineRule="auto"/>
     </w:pPr>
@@ -3404,6 +3963,7 @@
     <w:name w:val="Light List Accent 6"/>
     <w:basedOn w:val="TableNormal"/>
     <w:uiPriority w:val="61"/>
+    <w:rsid w:val="00CB0664"/>
     <w:pPr>
       <w:spacing w:after="0" w:line="240" w:lineRule="auto"/>
     </w:pPr>
@@ -3495,6 +4055,7 @@
     <w:name w:val="Light Grid"/>
     <w:basedOn w:val="TableNormal"/>
     <w:uiPriority w:val="62"/>
+    <w:rsid w:val="00CB0664"/>
     <w:pPr>
       <w:spacing w:after="0" w:line="240" w:lineRule="auto"/>
     </w:pPr>
@@ -3624,6 +4185,7 @@
     <w:name w:val="Light Grid Accent 1"/>
     <w:basedOn w:val="TableNormal"/>
     <w:uiPriority w:val="62"/>
+    <w:rsid w:val="00CB0664"/>
     <w:pPr>
       <w:spacing w:after="0" w:line="240" w:lineRule="auto"/>
     </w:pPr>
@@ -3753,6 +4315,7 @@
     <w:name w:val="Light Grid Accent 2"/>
     <w:basedOn w:val="TableNormal"/>
     <w:uiPriority w:val="62"/>
+    <w:rsid w:val="00CB0664"/>
     <w:pPr>
       <w:spacing w:after="0" w:line="240" w:lineRule="auto"/>
     </w:pPr>
@@ -3882,6 +4445,7 @@
     <w:name w:val="Light Grid Accent 3"/>
     <w:basedOn w:val="TableNormal"/>
     <w:uiPriority w:val="62"/>
+    <w:rsid w:val="00CB0664"/>
     <w:pPr>
       <w:spacing w:after="0" w:line="240" w:lineRule="auto"/>
     </w:pPr>
@@ -4011,6 +4575,7 @@
     <w:name w:val="Light Grid Accent 4"/>
     <w:basedOn w:val="TableNormal"/>
     <w:uiPriority w:val="62"/>
+    <w:rsid w:val="00CB0664"/>
     <w:pPr>
       <w:spacing w:after="0" w:line="240" w:lineRule="auto"/>
     </w:pPr>
@@ -4140,6 +4705,7 @@
     <w:name w:val="Light Grid Accent 5"/>
     <w:basedOn w:val="TableNormal"/>
     <w:uiPriority w:val="62"/>
+    <w:rsid w:val="00CB0664"/>
     <w:pPr>
       <w:spacing w:after="0" w:line="240" w:lineRule="auto"/>
     </w:pPr>
@@ -4269,6 +4835,7 @@
     <w:name w:val="Light Grid Accent 6"/>
     <w:basedOn w:val="TableNormal"/>
     <w:uiPriority w:val="62"/>
+    <w:rsid w:val="00CB0664"/>
     <w:pPr>
       <w:spacing w:after="0" w:line="240" w:lineRule="auto"/>
     </w:pPr>
@@ -4398,6 +4965,7 @@
     <w:name w:val="Medium Shading 1"/>
     <w:basedOn w:val="TableNormal"/>
     <w:uiPriority w:val="63"/>
+    <w:rsid w:val="00CB0664"/>
     <w:pPr>
       <w:spacing w:after="0" w:line="240" w:lineRule="auto"/>
     </w:pPr>
@@ -4503,6 +5071,7 @@
     <w:name w:val="Medium Shading 1 Accent 1"/>
     <w:basedOn w:val="TableNormal"/>
     <w:uiPriority w:val="63"/>
+    <w:rsid w:val="00CB0664"/>
     <w:pPr>
       <w:spacing w:after="0" w:line="240" w:lineRule="auto"/>
     </w:pPr>
@@ -4608,6 +5177,7 @@
     <w:name w:val="Medium Shading 1 Accent 2"/>
     <w:basedOn w:val="TableNormal"/>
     <w:uiPriority w:val="63"/>
+    <w:rsid w:val="00CB0664"/>
     <w:pPr>
       <w:spacing w:after="0" w:line="240" w:lineRule="auto"/>
     </w:pPr>
@@ -4713,6 +5283,7 @@
     <w:name w:val="Medium Shading 1 Accent 3"/>
     <w:basedOn w:val="TableNormal"/>
     <w:uiPriority w:val="63"/>
+    <w:rsid w:val="00CB0664"/>
     <w:pPr>
       <w:spacing w:after="0" w:line="240" w:lineRule="auto"/>
     </w:pPr>
@@ -4818,6 +5389,7 @@
     <w:name w:val="Medium Shading 1 Accent 4"/>
     <w:basedOn w:val="TableNormal"/>
     <w:uiPriority w:val="63"/>
+    <w:rsid w:val="00CB0664"/>
     <w:pPr>
       <w:spacing w:after="0" w:line="240" w:lineRule="auto"/>
     </w:pPr>
@@ -4923,6 +5495,7 @@
     <w:name w:val="Medium Shading 1 Accent 5"/>
     <w:basedOn w:val="TableNormal"/>
     <w:uiPriority w:val="63"/>
+    <w:rsid w:val="00CB0664"/>
     <w:pPr>
       <w:spacing w:after="0" w:line="240" w:lineRule="auto"/>
     </w:pPr>
@@ -5028,6 +5601,7 @@
     <w:name w:val="Medium Shading 1 Accent 6"/>
     <w:basedOn w:val="TableNormal"/>
     <w:uiPriority w:val="63"/>
+    <w:rsid w:val="00CB0664"/>
     <w:pPr>
       <w:spacing w:after="0" w:line="240" w:lineRule="auto"/>
     </w:pPr>
@@ -5133,6 +5707,7 @@
     <w:name w:val="Medium Shading 2"/>
     <w:basedOn w:val="TableNormal"/>
     <w:uiPriority w:val="64"/>
+    <w:rsid w:val="00CB0664"/>
     <w:pPr>
       <w:spacing w:after="0" w:line="240" w:lineRule="auto"/>
     </w:pPr>
@@ -5281,6 +5856,7 @@
     <w:name w:val="Medium Shading 2 Accent 1"/>
     <w:basedOn w:val="TableNormal"/>
     <w:uiPriority w:val="64"/>
+    <w:rsid w:val="00CB0664"/>
     <w:pPr>
       <w:spacing w:after="0" w:line="240" w:lineRule="auto"/>
     </w:pPr>
@@ -5429,6 +6005,7 @@
     <w:name w:val="Medium Shading 2 Accent 2"/>
     <w:basedOn w:val="TableNormal"/>
     <w:uiPriority w:val="64"/>
+    <w:rsid w:val="00CB0664"/>
     <w:pPr>
       <w:spacing w:after="0" w:line="240" w:lineRule="auto"/>
     </w:pPr>
@@ -5577,6 +6154,7 @@
     <w:name w:val="Medium Shading 2 Accent 3"/>
     <w:basedOn w:val="TableNormal"/>
     <w:uiPriority w:val="64"/>
+    <w:rsid w:val="00CB0664"/>
     <w:pPr>
       <w:spacing w:after="0" w:line="240" w:lineRule="auto"/>
     </w:pPr>
@@ -5725,6 +6303,7 @@
     <w:name w:val="Medium Shading 2 Accent 4"/>
     <w:basedOn w:val="TableNormal"/>
     <w:uiPriority w:val="64"/>
+    <w:rsid w:val="00CB0664"/>
     <w:pPr>
       <w:spacing w:after="0" w:line="240" w:lineRule="auto"/>
     </w:pPr>
@@ -5873,6 +6452,7 @@
     <w:name w:val="Medium Shading 2 Accent 5"/>
     <w:basedOn w:val="TableNormal"/>
     <w:uiPriority w:val="64"/>
+    <w:rsid w:val="00CB0664"/>
     <w:pPr>
       <w:spacing w:after="0" w:line="240" w:lineRule="auto"/>
     </w:pPr>
@@ -6021,6 +6601,7 @@
     <w:name w:val="Medium Shading 2 Accent 6"/>
     <w:basedOn w:val="TableNormal"/>
     <w:uiPriority w:val="64"/>
+    <w:rsid w:val="00CB0664"/>
     <w:pPr>
       <w:spacing w:after="0" w:line="240" w:lineRule="auto"/>
     </w:pPr>
@@ -6169,6 +6750,7 @@
     <w:name w:val="Medium List 1"/>
     <w:basedOn w:val="TableNormal"/>
     <w:uiPriority w:val="65"/>
+    <w:rsid w:val="00CB0664"/>
     <w:pPr>
       <w:spacing w:after="0" w:line="240" w:lineRule="auto"/>
     </w:pPr>
@@ -6252,6 +6834,7 @@
     <w:name w:val="Medium List 1 Accent 1"/>
     <w:basedOn w:val="TableNormal"/>
     <w:uiPriority w:val="65"/>
+    <w:rsid w:val="00CB0664"/>
     <w:pPr>
       <w:spacing w:after="0" w:line="240" w:lineRule="auto"/>
     </w:pPr>
@@ -6335,6 +6918,7 @@
     <w:name w:val="Medium List 1 Accent 2"/>
     <w:basedOn w:val="TableNormal"/>
     <w:uiPriority w:val="65"/>
+    <w:rsid w:val="00CB0664"/>
     <w:pPr>
       <w:spacing w:after="0" w:line="240" w:lineRule="auto"/>
     </w:pPr>
@@ -6418,6 +7002,7 @@
     <w:name w:val="Medium List 1 Accent 3"/>
     <w:basedOn w:val="TableNormal"/>
     <w:uiPriority w:val="65"/>
+    <w:rsid w:val="00CB0664"/>
     <w:pPr>
       <w:spacing w:after="0" w:line="240" w:lineRule="auto"/>
     </w:pPr>
@@ -6501,6 +7086,7 @@
     <w:name w:val="Medium List 1 Accent 4"/>
     <w:basedOn w:val="TableNormal"/>
     <w:uiPriority w:val="65"/>
+    <w:rsid w:val="00CB0664"/>
     <w:pPr>
       <w:spacing w:after="0" w:line="240" w:lineRule="auto"/>
     </w:pPr>
@@ -6584,6 +7170,7 @@
     <w:name w:val="Medium List 1 Accent 5"/>
     <w:basedOn w:val="TableNormal"/>
     <w:uiPriority w:val="65"/>
+    <w:rsid w:val="00CB0664"/>
     <w:pPr>
       <w:spacing w:after="0" w:line="240" w:lineRule="auto"/>
     </w:pPr>
@@ -6667,6 +7254,7 @@
     <w:name w:val="Medium List 1 Accent 6"/>
     <w:basedOn w:val="TableNormal"/>
     <w:uiPriority w:val="65"/>
+    <w:rsid w:val="00CB0664"/>
     <w:pPr>
       <w:spacing w:after="0" w:line="240" w:lineRule="auto"/>
     </w:pPr>
@@ -6750,6 +7338,7 @@
     <w:name w:val="Medium List 2"/>
     <w:basedOn w:val="TableNormal"/>
     <w:uiPriority w:val="66"/>
+    <w:rsid w:val="00CB0664"/>
     <w:pPr>
       <w:spacing w:after="0" w:line="240" w:lineRule="auto"/>
     </w:pPr>
@@ -6877,6 +7466,7 @@
     <w:name w:val="Medium List 2 Accent 1"/>
     <w:basedOn w:val="TableNormal"/>
     <w:uiPriority w:val="66"/>
+    <w:rsid w:val="00CB0664"/>
     <w:pPr>
       <w:spacing w:after="0" w:line="240" w:lineRule="auto"/>
     </w:pPr>
@@ -7004,6 +7594,7 @@
     <w:name w:val="Medium List 2 Accent 2"/>
     <w:basedOn w:val="TableNormal"/>
     <w:uiPriority w:val="66"/>
+    <w:rsid w:val="00CB0664"/>
     <w:pPr>
       <w:spacing w:after="0" w:line="240" w:lineRule="auto"/>
     </w:pPr>
@@ -7131,6 +7722,7 @@
     <w:name w:val="Medium List 2 Accent 3"/>
     <w:basedOn w:val="TableNormal"/>
     <w:uiPriority w:val="66"/>
+    <w:rsid w:val="00CB0664"/>
     <w:pPr>
       <w:spacing w:after="0" w:line="240" w:lineRule="auto"/>
     </w:pPr>
@@ -7258,6 +7850,7 @@
     <w:name w:val="Medium List 2 Accent 4"/>
     <w:basedOn w:val="TableNormal"/>
     <w:uiPriority w:val="66"/>
+    <w:rsid w:val="00CB0664"/>
     <w:pPr>
       <w:spacing w:after="0" w:line="240" w:lineRule="auto"/>
     </w:pPr>
@@ -7385,6 +7978,7 @@
     <w:name w:val="Medium List 2 Accent 5"/>
     <w:basedOn w:val="TableNormal"/>
     <w:uiPriority w:val="66"/>
+    <w:rsid w:val="00CB0664"/>
     <w:pPr>
       <w:spacing w:after="0" w:line="240" w:lineRule="auto"/>
     </w:pPr>
@@ -7512,6 +8106,7 @@
     <w:name w:val="Medium List 2 Accent 6"/>
     <w:basedOn w:val="TableNormal"/>
     <w:uiPriority w:val="66"/>
+    <w:rsid w:val="00CB0664"/>
     <w:pPr>
       <w:spacing w:after="0" w:line="240" w:lineRule="auto"/>
     </w:pPr>
@@ -7639,6 +8234,7 @@
     <w:name w:val="Medium Grid 1"/>
     <w:basedOn w:val="TableNormal"/>
     <w:uiPriority w:val="67"/>
+    <w:rsid w:val="00CB0664"/>
     <w:pPr>
       <w:spacing w:after="0" w:line="240" w:lineRule="auto"/>
     </w:pPr>
@@ -7711,6 +8307,7 @@
     <w:name w:val="Medium Grid 1 Accent 1"/>
     <w:basedOn w:val="TableNormal"/>
     <w:uiPriority w:val="67"/>
+    <w:rsid w:val="00CB0664"/>
     <w:pPr>
       <w:spacing w:after="0" w:line="240" w:lineRule="auto"/>
     </w:pPr>
@@ -7783,6 +8380,7 @@
     <w:name w:val="Medium Grid 1 Accent 2"/>
     <w:basedOn w:val="TableNormal"/>
     <w:uiPriority w:val="67"/>
+    <w:rsid w:val="00CB0664"/>
     <w:pPr>
       <w:spacing w:after="0" w:line="240" w:lineRule="auto"/>
     </w:pPr>
@@ -7855,6 +8453,7 @@
     <w:name w:val="Medium Grid 1 Accent 3"/>
     <w:basedOn w:val="TableNormal"/>
     <w:uiPriority w:val="67"/>
+    <w:rsid w:val="00CB0664"/>
     <w:pPr>
       <w:spacing w:after="0" w:line="240" w:lineRule="auto"/>
     </w:pPr>
@@ -7927,6 +8526,7 @@
     <w:name w:val="Medium Grid 1 Accent 4"/>
     <w:basedOn w:val="TableNormal"/>
     <w:uiPriority w:val="67"/>
+    <w:rsid w:val="00CB0664"/>
     <w:pPr>
       <w:spacing w:after="0" w:line="240" w:lineRule="auto"/>
     </w:pPr>
@@ -7999,6 +8599,7 @@
     <w:name w:val="Medium Grid 1 Accent 5"/>
     <w:basedOn w:val="TableNormal"/>
     <w:uiPriority w:val="67"/>
+    <w:rsid w:val="00CB0664"/>
     <w:pPr>
       <w:spacing w:after="0" w:line="240" w:lineRule="auto"/>
     </w:pPr>
@@ -8071,6 +8672,7 @@
     <w:name w:val="Medium Grid 1 Accent 6"/>
     <w:basedOn w:val="TableNormal"/>
     <w:uiPriority w:val="67"/>
+    <w:rsid w:val="00CB0664"/>
     <w:pPr>
       <w:spacing w:after="0" w:line="240" w:lineRule="auto"/>
     </w:pPr>
@@ -8143,6 +8745,7 @@
     <w:name w:val="Medium Grid 2"/>
     <w:basedOn w:val="TableNormal"/>
     <w:uiPriority w:val="68"/>
+    <w:rsid w:val="00CB0664"/>
     <w:pPr>
       <w:spacing w:after="0" w:line="240" w:lineRule="auto"/>
     </w:pPr>
@@ -8267,6 +8870,7 @@
     <w:name w:val="Medium Grid 2 Accent 1"/>
     <w:basedOn w:val="TableNormal"/>
     <w:uiPriority w:val="68"/>
+    <w:rsid w:val="00CB0664"/>
     <w:pPr>
       <w:spacing w:after="0" w:line="240" w:lineRule="auto"/>
     </w:pPr>
@@ -8391,6 +8995,7 @@
     <w:name w:val="Medium Grid 2 Accent 2"/>
     <w:basedOn w:val="TableNormal"/>
     <w:uiPriority w:val="68"/>
+    <w:rsid w:val="00CB0664"/>
     <w:pPr>
       <w:spacing w:after="0" w:line="240" w:lineRule="auto"/>
     </w:pPr>
@@ -8515,6 +9120,7 @@
     <w:name w:val="Medium Grid 2 Accent 3"/>
     <w:basedOn w:val="TableNormal"/>
     <w:uiPriority w:val="68"/>
+    <w:rsid w:val="00CB0664"/>
     <w:pPr>
       <w:spacing w:after="0" w:line="240" w:lineRule="auto"/>
     </w:pPr>
@@ -8639,6 +9245,7 @@
     <w:name w:val="Medium Grid 2 Accent 4"/>
     <w:basedOn w:val="TableNormal"/>
     <w:uiPriority w:val="68"/>
+    <w:rsid w:val="00CB0664"/>
     <w:pPr>
       <w:spacing w:after="0" w:line="240" w:lineRule="auto"/>
     </w:pPr>
@@ -8763,6 +9370,7 @@
     <w:name w:val="Medium Grid 2 Accent 5"/>
     <w:basedOn w:val="TableNormal"/>
     <w:uiPriority w:val="68"/>
+    <w:rsid w:val="00CB0664"/>
     <w:pPr>
       <w:spacing w:after="0" w:line="240" w:lineRule="auto"/>
     </w:pPr>
@@ -8887,6 +9495,7 @@
     <w:name w:val="Medium Grid 2 Accent 6"/>
     <w:basedOn w:val="TableNormal"/>
     <w:uiPriority w:val="68"/>
+    <w:rsid w:val="00CB0664"/>
     <w:pPr>
       <w:spacing w:after="0" w:line="240" w:lineRule="auto"/>
     </w:pPr>
@@ -9011,6 +9620,7 @@
     <w:name w:val="Medium Grid 3"/>
     <w:basedOn w:val="TableNormal"/>
     <w:uiPriority w:val="69"/>
+    <w:rsid w:val="00CB0664"/>
     <w:pPr>
       <w:spacing w:after="0" w:line="240" w:lineRule="auto"/>
     </w:pPr>
@@ -9151,6 +9761,7 @@
     <w:name w:val="Medium Grid 3 Accent 1"/>
     <w:basedOn w:val="TableNormal"/>
     <w:uiPriority w:val="69"/>
+    <w:rsid w:val="00CB0664"/>
     <w:pPr>
       <w:spacing w:after="0" w:line="240" w:lineRule="auto"/>
     </w:pPr>
@@ -9291,6 +9902,7 @@
     <w:name w:val="Medium Grid 3 Accent 2"/>
     <w:basedOn w:val="TableNormal"/>
     <w:uiPriority w:val="69"/>
+    <w:rsid w:val="00CB0664"/>
     <w:pPr>
       <w:spacing w:after="0" w:line="240" w:lineRule="auto"/>
     </w:pPr>
@@ -9431,6 +10043,7 @@
     <w:name w:val="Medium Grid 3 Accent 3"/>
     <w:basedOn w:val="TableNormal"/>
     <w:uiPriority w:val="69"/>
+    <w:rsid w:val="00CB0664"/>
     <w:pPr>
       <w:spacing w:after="0" w:line="240" w:lineRule="auto"/>
     </w:pPr>
@@ -9571,6 +10184,7 @@
     <w:name w:val="Medium Grid 3 Accent 4"/>
     <w:basedOn w:val="TableNormal"/>
     <w:uiPriority w:val="69"/>
+    <w:rsid w:val="00CB0664"/>
     <w:pPr>
       <w:spacing w:after="0" w:line="240" w:lineRule="auto"/>
     </w:pPr>
@@ -9711,6 +10325,7 @@
     <w:name w:val="Medium Grid 3 Accent 5"/>
     <w:basedOn w:val="TableNormal"/>
     <w:uiPriority w:val="69"/>
+    <w:rsid w:val="00CB0664"/>
     <w:pPr>
       <w:spacing w:after="0" w:line="240" w:lineRule="auto"/>
     </w:pPr>
@@ -9851,6 +10466,7 @@
     <w:name w:val="Medium Grid 3 Accent 6"/>
     <w:basedOn w:val="TableNormal"/>
     <w:uiPriority w:val="69"/>
+    <w:rsid w:val="00CB0664"/>
     <w:pPr>
       <w:spacing w:after="0" w:line="240" w:lineRule="auto"/>
     </w:pPr>
@@ -9991,6 +10607,7 @@
     <w:name w:val="Dark List"/>
     <w:basedOn w:val="TableNormal"/>
     <w:uiPriority w:val="70"/>
+    <w:rsid w:val="00CB0664"/>
     <w:pPr>
       <w:spacing w:after="0" w:line="240" w:lineRule="auto"/>
     </w:pPr>
@@ -10104,6 +10721,7 @@
     <w:name w:val="Dark List Accent 1"/>
     <w:basedOn w:val="TableNormal"/>
     <w:uiPriority w:val="70"/>
+    <w:rsid w:val="00CB0664"/>
     <w:pPr>
       <w:spacing w:after="0" w:line="240" w:lineRule="auto"/>
     </w:pPr>
@@ -10217,6 +10835,7 @@
     <w:name w:val="Dark List Accent 2"/>
     <w:basedOn w:val="TableNormal"/>
     <w:uiPriority w:val="70"/>
+    <w:rsid w:val="00CB0664"/>
     <w:pPr>
       <w:spacing w:after="0" w:line="240" w:lineRule="auto"/>
     </w:pPr>
@@ -10330,6 +10949,7 @@
     <w:name w:val="Dark List Accent 3"/>
     <w:basedOn w:val="TableNormal"/>
     <w:uiPriority w:val="70"/>
+    <w:rsid w:val="00CB0664"/>
     <w:pPr>
       <w:spacing w:after="0" w:line="240" w:lineRule="auto"/>
     </w:pPr>
@@ -10443,6 +11063,7 @@
     <w:name w:val="Dark List Accent 4"/>
     <w:basedOn w:val="TableNormal"/>
     <w:uiPriority w:val="70"/>
+    <w:rsid w:val="00CB0664"/>
     <w:pPr>
       <w:spacing w:after="0" w:line="240" w:lineRule="auto"/>
     </w:pPr>
@@ -10556,6 +11177,7 @@
     <w:name w:val="Dark List Accent 5"/>
     <w:basedOn w:val="TableNormal"/>
     <w:uiPriority w:val="70"/>
+    <w:rsid w:val="00CB0664"/>
     <w:pPr>
       <w:spacing w:after="0" w:line="240" w:lineRule="auto"/>
     </w:pPr>
@@ -10669,6 +11291,7 @@
     <w:name w:val="Dark List Accent 6"/>
     <w:basedOn w:val="TableNormal"/>
     <w:uiPriority w:val="70"/>
+    <w:rsid w:val="00CB0664"/>
     <w:pPr>
       <w:spacing w:after="0" w:line="240" w:lineRule="auto"/>
     </w:pPr>
@@ -10782,6 +11405,7 @@
     <w:name w:val="Colorful Shading"/>
     <w:basedOn w:val="TableNormal"/>
     <w:uiPriority w:val="71"/>
+    <w:rsid w:val="00CB0664"/>
     <w:pPr>
       <w:spacing w:after="0" w:line="240" w:lineRule="auto"/>
     </w:pPr>
@@ -10903,6 +11527,7 @@
     <w:name w:val="Colorful Shading Accent 1"/>
     <w:basedOn w:val="TableNormal"/>
     <w:uiPriority w:val="71"/>
+    <w:rsid w:val="00CB0664"/>
     <w:pPr>
       <w:spacing w:after="0" w:line="240" w:lineRule="auto"/>
     </w:pPr>
@@ -11024,6 +11649,7 @@
     <w:name w:val="Colorful Shading Accent 2"/>
     <w:basedOn w:val="TableNormal"/>
     <w:uiPriority w:val="71"/>
+    <w:rsid w:val="00CB0664"/>
     <w:pPr>
       <w:spacing w:after="0" w:line="240" w:lineRule="auto"/>
     </w:pPr>
@@ -11145,6 +11771,7 @@
     <w:name w:val="Colorful Shading Accent 3"/>
     <w:basedOn w:val="TableNormal"/>
     <w:uiPriority w:val="71"/>
+    <w:rsid w:val="00CB0664"/>
     <w:pPr>
       <w:spacing w:after="0" w:line="240" w:lineRule="auto"/>
     </w:pPr>
@@ -11256,6 +11883,7 @@
     <w:name w:val="Colorful Shading Accent 4"/>
     <w:basedOn w:val="TableNormal"/>
     <w:uiPriority w:val="71"/>
+    <w:rsid w:val="00CB0664"/>
     <w:pPr>
       <w:spacing w:after="0" w:line="240" w:lineRule="auto"/>
     </w:pPr>
@@ -11377,6 +12005,7 @@
     <w:name w:val="Colorful Shading Accent 5"/>
     <w:basedOn w:val="TableNormal"/>
     <w:uiPriority w:val="71"/>
+    <w:rsid w:val="00CB0664"/>
     <w:pPr>
       <w:spacing w:after="0" w:line="240" w:lineRule="auto"/>
     </w:pPr>
@@ -11498,6 +12127,7 @@
     <w:name w:val="Colorful Shading Accent 6"/>
     <w:basedOn w:val="TableNormal"/>
     <w:uiPriority w:val="71"/>
+    <w:rsid w:val="00CB0664"/>
     <w:pPr>
       <w:spacing w:after="0" w:line="240" w:lineRule="auto"/>
     </w:pPr>
@@ -11619,6 +12249,7 @@
     <w:name w:val="Colorful List"/>
     <w:basedOn w:val="TableNormal"/>
     <w:uiPriority w:val="72"/>
+    <w:rsid w:val="00CB0664"/>
     <w:pPr>
       <w:spacing w:after="0" w:line="240" w:lineRule="auto"/>
     </w:pPr>
@@ -11704,6 +12335,7 @@
     <w:name w:val="Colorful List Accent 1"/>
     <w:basedOn w:val="TableNormal"/>
     <w:uiPriority w:val="72"/>
+    <w:rsid w:val="00CB0664"/>
     <w:pPr>
       <w:spacing w:after="0" w:line="240" w:lineRule="auto"/>
     </w:pPr>
@@ -11789,6 +12421,7 @@
     <w:name w:val="Colorful List Accent 2"/>
     <w:basedOn w:val="TableNormal"/>
     <w:uiPriority w:val="72"/>
+    <w:rsid w:val="00CB0664"/>
     <w:pPr>
       <w:spacing w:after="0" w:line="240" w:lineRule="auto"/>
     </w:pPr>
@@ -11874,6 +12507,7 @@
     <w:name w:val="Colorful List Accent 3"/>
     <w:basedOn w:val="TableNormal"/>
     <w:uiPriority w:val="72"/>
+    <w:rsid w:val="00CB0664"/>
     <w:pPr>
       <w:spacing w:after="0" w:line="240" w:lineRule="auto"/>
     </w:pPr>
@@ -11959,6 +12593,7 @@
     <w:name w:val="Colorful List Accent 4"/>
     <w:basedOn w:val="TableNormal"/>
     <w:uiPriority w:val="72"/>
+    <w:rsid w:val="00CB0664"/>
     <w:pPr>
       <w:spacing w:after="0" w:line="240" w:lineRule="auto"/>
     </w:pPr>
@@ -12044,6 +12679,7 @@
     <w:name w:val="Colorful List Accent 5"/>
     <w:basedOn w:val="TableNormal"/>
     <w:uiPriority w:val="72"/>
+    <w:rsid w:val="00CB0664"/>
     <w:pPr>
       <w:spacing w:after="0" w:line="240" w:lineRule="auto"/>
     </w:pPr>
@@ -12129,6 +12765,7 @@
     <w:name w:val="Colorful List Accent 6"/>
     <w:basedOn w:val="TableNormal"/>
     <w:uiPriority w:val="72"/>
+    <w:rsid w:val="00CB0664"/>
     <w:pPr>
       <w:spacing w:after="0" w:line="240" w:lineRule="auto"/>
     </w:pPr>
@@ -12214,6 +12851,7 @@
     <w:name w:val="Colorful Grid"/>
     <w:basedOn w:val="TableNormal"/>
     <w:uiPriority w:val="73"/>
+    <w:rsid w:val="00CB0664"/>
     <w:pPr>
       <w:spacing w:after="0" w:line="240" w:lineRule="auto"/>
     </w:pPr>
@@ -12293,6 +12931,7 @@
     <w:name w:val="Colorful Grid Accent 1"/>
     <w:basedOn w:val="TableNormal"/>
     <w:uiPriority w:val="73"/>
+    <w:rsid w:val="00CB0664"/>
     <w:pPr>
       <w:spacing w:after="0" w:line="240" w:lineRule="auto"/>
     </w:pPr>
@@ -12372,6 +13011,7 @@
     <w:name w:val="Colorful Grid Accent 2"/>
     <w:basedOn w:val="TableNormal"/>
     <w:uiPriority w:val="73"/>
+    <w:rsid w:val="00CB0664"/>
     <w:pPr>
       <w:spacing w:after="0" w:line="240" w:lineRule="auto"/>
     </w:pPr>
@@ -12451,6 +13091,7 @@
     <w:name w:val="Colorful Grid Accent 3"/>
     <w:basedOn w:val="TableNormal"/>
     <w:uiPriority w:val="73"/>
+    <w:rsid w:val="00CB0664"/>
     <w:pPr>
       <w:spacing w:after="0" w:line="240" w:lineRule="auto"/>
     </w:pPr>
@@ -12530,6 +13171,7 @@
     <w:name w:val="Colorful Grid Accent 4"/>
     <w:basedOn w:val="TableNormal"/>
     <w:uiPriority w:val="73"/>
+    <w:rsid w:val="00CB0664"/>
     <w:pPr>
       <w:spacing w:after="0" w:line="240" w:lineRule="auto"/>
     </w:pPr>
@@ -12609,6 +13251,7 @@
     <w:name w:val="Colorful Grid Accent 5"/>
     <w:basedOn w:val="TableNormal"/>
     <w:uiPriority w:val="73"/>
+    <w:rsid w:val="00CB0664"/>
     <w:pPr>
       <w:spacing w:after="0" w:line="240" w:lineRule="auto"/>
     </w:pPr>
@@ -12688,6 +13331,7 @@
     <w:name w:val="Colorful Grid Accent 6"/>
     <w:basedOn w:val="TableNormal"/>
     <w:uiPriority w:val="73"/>
+    <w:rsid w:val="00CB0664"/>
     <w:pPr>
       <w:spacing w:after="0" w:line="240" w:lineRule="auto"/>
     </w:pPr>
@@ -12925,6 +13569,7 @@
   <w:style w:type="paragraph" w:default="1" w:styleId="Normal">
     <w:name w:val="Normal"/>
     <w:qFormat/>
+    <w:rsid w:val="00FC693F"/>
   </w:style>
   <w:style w:type="paragraph" w:styleId="Heading1">
     <w:name w:val="heading 1"/>
@@ -12933,6 +13578,7 @@
     <w:link w:val="Heading1Char"/>
     <w:uiPriority w:val="9"/>
     <w:qFormat/>
+    <w:rsid w:val="00FC693F"/>
     <w:pPr>
       <w:keepNext/>
       <w:keepLines/>
@@ -12956,6 +13602,7 @@
     <w:uiPriority w:val="9"/>
     <w:unhideWhenUsed/>
     <w:qFormat/>
+    <w:rsid w:val="00FC693F"/>
     <w:pPr>
       <w:keepNext/>
       <w:keepLines/>
@@ -12979,6 +13626,7 @@
     <w:uiPriority w:val="9"/>
     <w:unhideWhenUsed/>
     <w:qFormat/>
+    <w:rsid w:val="00FC693F"/>
     <w:pPr>
       <w:keepNext/>
       <w:keepLines/>
@@ -13001,6 +13649,7 @@
     <w:semiHidden/>
     <w:unhideWhenUsed/>
     <w:qFormat/>
+    <w:rsid w:val="00FC693F"/>
     <w:pPr>
       <w:keepNext/>
       <w:keepLines/>
@@ -13025,6 +13674,7 @@
     <w:semiHidden/>
     <w:unhideWhenUsed/>
     <w:qFormat/>
+    <w:rsid w:val="00FC693F"/>
     <w:pPr>
       <w:keepNext/>
       <w:keepLines/>
@@ -13045,6 +13695,7 @@
     <w:semiHidden/>
     <w:unhideWhenUsed/>
     <w:qFormat/>
+    <w:rsid w:val="00FC693F"/>
     <w:pPr>
       <w:keepNext/>
       <w:keepLines/>
@@ -13067,6 +13718,7 @@
     <w:semiHidden/>
     <w:unhideWhenUsed/>
     <w:qFormat/>
+    <w:rsid w:val="00FC693F"/>
     <w:pPr>
       <w:keepNext/>
       <w:keepLines/>
@@ -13089,6 +13741,7 @@
     <w:semiHidden/>
     <w:unhideWhenUsed/>
     <w:qFormat/>
+    <w:rsid w:val="00FC693F"/>
     <w:pPr>
       <w:keepNext/>
       <w:keepLines/>
@@ -13111,6 +13764,7 @@
     <w:semiHidden/>
     <w:unhideWhenUsed/>
     <w:qFormat/>
+    <w:rsid w:val="00FC693F"/>
     <w:pPr>
       <w:keepNext/>
       <w:keepLines/>
@@ -13157,6 +13811,7 @@
     <w:name w:val="No Spacing"/>
     <w:uiPriority w:val="1"/>
     <w:qFormat/>
+    <w:rsid w:val="00FC693F"/>
     <w:pPr>
       <w:spacing w:after="0" w:line="240" w:lineRule="auto"/>
     </w:pPr>
@@ -13166,6 +13821,7 @@
     <w:basedOn w:val="DefaultParagraphFont"/>
     <w:link w:val="Heading1"/>
     <w:uiPriority w:val="9"/>
+    <w:rsid w:val="00FC693F"/>
     <w:rPr>
       <w:rFonts w:asciiTheme="majorHAnsi" w:eastAsiaTheme="majorEastAsia" w:hAnsiTheme="majorHAnsi" w:cstheme="majorBidi"/>
       <w:b/>
@@ -13180,6 +13836,7 @@
     <w:basedOn w:val="DefaultParagraphFont"/>
     <w:link w:val="Heading2"/>
     <w:uiPriority w:val="9"/>
+    <w:rsid w:val="00FC693F"/>
     <w:rPr>
       <w:rFonts w:asciiTheme="majorHAnsi" w:eastAsiaTheme="majorEastAsia" w:hAnsiTheme="majorHAnsi" w:cstheme="majorBidi"/>
       <w:b/>
@@ -13194,6 +13851,7 @@
     <w:basedOn w:val="DefaultParagraphFont"/>
     <w:link w:val="Heading3"/>
     <w:uiPriority w:val="9"/>
+    <w:rsid w:val="00FC693F"/>
     <w:rPr>
       <w:rFonts w:asciiTheme="majorHAnsi" w:eastAsiaTheme="majorEastAsia" w:hAnsiTheme="majorHAnsi" w:cstheme="majorBidi"/>
       <w:b/>
@@ -13208,6 +13866,7 @@
     <w:link w:val="TitleChar"/>
     <w:uiPriority w:val="10"/>
     <w:qFormat/>
+    <w:rsid w:val="00FC693F"/>
     <w:pPr>
       <w:pBdr>
         <w:bottom w:val="single" w:sz="8" w:space="4" w:color="4F81BD" w:themeColor="accent1"/>
@@ -13229,6 +13888,7 @@
     <w:basedOn w:val="DefaultParagraphFont"/>
     <w:link w:val="Title"/>
     <w:uiPriority w:val="10"/>
+    <w:rsid w:val="00FC693F"/>
     <w:rPr>
       <w:rFonts w:asciiTheme="majorHAnsi" w:eastAsiaTheme="majorEastAsia" w:hAnsiTheme="majorHAnsi" w:cstheme="majorBidi"/>
       <w:color w:val="17365D" w:themeColor="text2" w:themeShade="BF"/>
@@ -13245,6 +13905,7 @@
     <w:link w:val="SubtitleChar"/>
     <w:uiPriority w:val="11"/>
     <w:qFormat/>
+    <w:rsid w:val="00FC693F"/>
     <w:pPr>
       <w:numPr>
         <w:ilvl w:val="1"/>
@@ -13265,6 +13926,7 @@
     <w:basedOn w:val="DefaultParagraphFont"/>
     <w:link w:val="Subtitle"/>
     <w:uiPriority w:val="11"/>
+    <w:rsid w:val="00FC693F"/>
     <w:rPr>
       <w:rFonts w:asciiTheme="majorHAnsi" w:eastAsiaTheme="majorEastAsia" w:hAnsiTheme="majorHAnsi" w:cstheme="majorBidi"/>
       <w:i/>
@@ -13280,6 +13942,7 @@
     <w:basedOn w:val="Normal"/>
     <w:uiPriority w:val="34"/>
     <w:qFormat/>
+    <w:rsid w:val="00FC693F"/>
     <w:pPr>
       <w:ind w:left="720"/>
       <w:contextualSpacing/>
@@ -13291,6 +13954,7 @@
     <w:link w:val="BodyTextChar"/>
     <w:uiPriority w:val="99"/>
     <w:unhideWhenUsed/>
+    <w:rsid w:val="00AA1D8D"/>
     <w:pPr>
       <w:spacing w:after="120"/>
     </w:pPr>
@@ -13300,6 +13964,7 @@
     <w:basedOn w:val="DefaultParagraphFont"/>
     <w:link w:val="BodyText"/>
     <w:uiPriority w:val="99"/>
+    <w:rsid w:val="00AA1D8D"/>
   </w:style>
   <w:style w:type="paragraph" w:styleId="BodyText2">
     <w:name w:val="Body Text 2"/>
@@ -13307,6 +13972,7 @@
     <w:link w:val="BodyText2Char"/>
     <w:uiPriority w:val="99"/>
     <w:unhideWhenUsed/>
+    <w:rsid w:val="00AA1D8D"/>
     <w:pPr>
       <w:spacing w:after="120" w:line="480" w:lineRule="auto"/>
     </w:pPr>
@@ -13316,6 +13982,7 @@
     <w:basedOn w:val="DefaultParagraphFont"/>
     <w:link w:val="BodyText2"/>
     <w:uiPriority w:val="99"/>
+    <w:rsid w:val="00AA1D8D"/>
   </w:style>
   <w:style w:type="paragraph" w:styleId="BodyText3">
     <w:name w:val="Body Text 3"/>
@@ -13323,6 +13990,7 @@
     <w:link w:val="BodyText3Char"/>
     <w:uiPriority w:val="99"/>
     <w:unhideWhenUsed/>
+    <w:rsid w:val="00AA1D8D"/>
     <w:pPr>
       <w:spacing w:after="120"/>
     </w:pPr>
@@ -13336,6 +14004,7 @@
     <w:basedOn w:val="DefaultParagraphFont"/>
     <w:link w:val="BodyText3"/>
     <w:uiPriority w:val="99"/>
+    <w:rsid w:val="00AA1D8D"/>
     <w:rPr>
       <w:sz w:val="16"/>
       <w:szCs w:val="16"/>
@@ -13346,6 +14015,7 @@
     <w:basedOn w:val="Normal"/>
     <w:uiPriority w:val="99"/>
     <w:unhideWhenUsed/>
+    <w:rsid w:val="00AA1D8D"/>
     <w:pPr>
       <w:ind w:left="360" w:hanging="360"/>
       <w:contextualSpacing/>
@@ -13356,6 +14026,7 @@
     <w:basedOn w:val="Normal"/>
     <w:uiPriority w:val="99"/>
     <w:unhideWhenUsed/>
+    <w:rsid w:val="00326F90"/>
     <w:pPr>
       <w:ind w:left="720" w:hanging="360"/>
       <w:contextualSpacing/>
@@ -13366,6 +14037,7 @@
     <w:basedOn w:val="Normal"/>
     <w:uiPriority w:val="99"/>
     <w:unhideWhenUsed/>
+    <w:rsid w:val="00326F90"/>
     <w:pPr>
       <w:ind w:left="1080" w:hanging="360"/>
       <w:contextualSpacing/>
@@ -13376,6 +14048,7 @@
     <w:basedOn w:val="Normal"/>
     <w:uiPriority w:val="99"/>
     <w:unhideWhenUsed/>
+    <w:rsid w:val="00326F90"/>
     <w:pPr>
       <w:numPr>
         <w:numId w:val="1"/>
@@ -13388,6 +14061,7 @@
     <w:basedOn w:val="Normal"/>
     <w:uiPriority w:val="99"/>
     <w:unhideWhenUsed/>
+    <w:rsid w:val="00326F90"/>
     <w:pPr>
       <w:numPr>
         <w:numId w:val="2"/>
@@ -13400,6 +14074,7 @@
     <w:basedOn w:val="Normal"/>
     <w:uiPriority w:val="99"/>
     <w:unhideWhenUsed/>
+    <w:rsid w:val="00326F90"/>
     <w:pPr>
       <w:numPr>
         <w:numId w:val="3"/>
@@ -13412,6 +14087,7 @@
     <w:basedOn w:val="Normal"/>
     <w:uiPriority w:val="99"/>
     <w:unhideWhenUsed/>
+    <w:rsid w:val="00326F90"/>
     <w:pPr>
       <w:numPr>
         <w:numId w:val="5"/>
@@ -13424,6 +14100,7 @@
     <w:basedOn w:val="Normal"/>
     <w:uiPriority w:val="99"/>
     <w:unhideWhenUsed/>
+    <w:rsid w:val="0029639D"/>
     <w:pPr>
       <w:numPr>
         <w:numId w:val="6"/>
@@ -13436,6 +14113,7 @@
     <w:basedOn w:val="Normal"/>
     <w:uiPriority w:val="99"/>
     <w:unhideWhenUsed/>
+    <w:rsid w:val="0029639D"/>
     <w:pPr>
       <w:numPr>
         <w:numId w:val="7"/>
@@ -13448,6 +14126,7 @@
     <w:basedOn w:val="Normal"/>
     <w:uiPriority w:val="99"/>
     <w:unhideWhenUsed/>
+    <w:rsid w:val="0029639D"/>
     <w:pPr>
       <w:spacing w:after="120"/>
       <w:ind w:left="360"/>
@@ -13459,6 +14138,7 @@
     <w:basedOn w:val="Normal"/>
     <w:uiPriority w:val="99"/>
     <w:unhideWhenUsed/>
+    <w:rsid w:val="0029639D"/>
     <w:pPr>
       <w:spacing w:after="120"/>
       <w:ind w:left="720"/>
@@ -13470,6 +14150,7 @@
     <w:basedOn w:val="Normal"/>
     <w:uiPriority w:val="99"/>
     <w:unhideWhenUsed/>
+    <w:rsid w:val="0029639D"/>
     <w:pPr>
       <w:spacing w:after="120"/>
       <w:ind w:left="1080"/>
@@ -13481,6 +14162,7 @@
     <w:link w:val="MacroTextChar"/>
     <w:uiPriority w:val="99"/>
     <w:unhideWhenUsed/>
+    <w:rsid w:val="0029639D"/>
     <w:pPr>
       <w:tabs>
         <w:tab w:val="left" w:pos="576"/>
@@ -13503,6 +14185,7 @@
     <w:basedOn w:val="DefaultParagraphFont"/>
     <w:link w:val="MacroText"/>
     <w:uiPriority w:val="99"/>
+    <w:rsid w:val="0029639D"/>
     <w:rPr>
       <w:rFonts w:ascii="Courier" w:hAnsi="Courier"/>
       <w:sz w:val="20"/>
@@ -13516,6 +14199,7 @@
     <w:link w:val="QuoteChar"/>
     <w:uiPriority w:val="29"/>
     <w:qFormat/>
+    <w:rsid w:val="00FC693F"/>
     <w:rPr>
       <w:i/>
       <w:iCs/>
@@ -13527,6 +14211,7 @@
     <w:basedOn w:val="DefaultParagraphFont"/>
     <w:link w:val="Quote"/>
     <w:uiPriority w:val="29"/>
+    <w:rsid w:val="00FC693F"/>
     <w:rPr>
       <w:i/>
       <w:iCs/>
@@ -13539,6 +14224,7 @@
     <w:link w:val="Heading4"/>
     <w:uiPriority w:val="9"/>
     <w:semiHidden/>
+    <w:rsid w:val="00FC693F"/>
     <w:rPr>
       <w:rFonts w:asciiTheme="majorHAnsi" w:eastAsiaTheme="majorEastAsia" w:hAnsiTheme="majorHAnsi" w:cstheme="majorBidi"/>
       <w:b/>
@@ -13554,6 +14240,7 @@
     <w:link w:val="Heading5"/>
     <w:uiPriority w:val="9"/>
     <w:semiHidden/>
+    <w:rsid w:val="00FC693F"/>
     <w:rPr>
       <w:rFonts w:asciiTheme="majorHAnsi" w:eastAsiaTheme="majorEastAsia" w:hAnsiTheme="majorHAnsi" w:cstheme="majorBidi"/>
       <w:color w:val="243F60" w:themeColor="accent1" w:themeShade="7F"/>
@@ -13565,6 +14252,7 @@
     <w:link w:val="Heading6"/>
     <w:uiPriority w:val="9"/>
     <w:semiHidden/>
+    <w:rsid w:val="00FC693F"/>
     <w:rPr>
       <w:rFonts w:asciiTheme="majorHAnsi" w:eastAsiaTheme="majorEastAsia" w:hAnsiTheme="majorHAnsi" w:cstheme="majorBidi"/>
       <w:i/>
@@ -13578,6 +14266,7 @@
     <w:link w:val="Heading7"/>
     <w:uiPriority w:val="9"/>
     <w:semiHidden/>
+    <w:rsid w:val="00FC693F"/>
     <w:rPr>
       <w:rFonts w:asciiTheme="majorHAnsi" w:eastAsiaTheme="majorEastAsia" w:hAnsiTheme="majorHAnsi" w:cstheme="majorBidi"/>
       <w:i/>
@@ -13591,6 +14280,7 @@
     <w:link w:val="Heading8"/>
     <w:uiPriority w:val="9"/>
     <w:semiHidden/>
+    <w:rsid w:val="00FC693F"/>
     <w:rPr>
       <w:rFonts w:asciiTheme="majorHAnsi" w:eastAsiaTheme="majorEastAsia" w:hAnsiTheme="majorHAnsi" w:cstheme="majorBidi"/>
       <w:color w:val="4F81BD" w:themeColor="accent1"/>
@@ -13604,6 +14294,7 @@
     <w:link w:val="Heading9"/>
     <w:uiPriority w:val="9"/>
     <w:semiHidden/>
+    <w:rsid w:val="00FC693F"/>
     <w:rPr>
       <w:rFonts w:asciiTheme="majorHAnsi" w:eastAsiaTheme="majorEastAsia" w:hAnsiTheme="majorHAnsi" w:cstheme="majorBidi"/>
       <w:i/>
@@ -13621,6 +14312,7 @@
     <w:semiHidden/>
     <w:unhideWhenUsed/>
     <w:qFormat/>
+    <w:rsid w:val="00FC693F"/>
     <w:pPr>
       <w:spacing w:line="240" w:lineRule="auto"/>
     </w:pPr>
@@ -13637,6 +14329,7 @@
     <w:basedOn w:val="DefaultParagraphFont"/>
     <w:uiPriority w:val="22"/>
     <w:qFormat/>
+    <w:rsid w:val="00FC693F"/>
     <w:rPr>
       <w:b/>
       <w:bCs/>
@@ -13647,6 +14340,7 @@
     <w:basedOn w:val="DefaultParagraphFont"/>
     <w:uiPriority w:val="20"/>
     <w:qFormat/>
+    <w:rsid w:val="00FC693F"/>
     <w:rPr>
       <w:i/>
       <w:iCs/>
@@ -13659,6 +14353,7 @@
     <w:link w:val="IntenseQuoteChar"/>
     <w:uiPriority w:val="30"/>
     <w:qFormat/>
+    <w:rsid w:val="00FC693F"/>
     <w:pPr>
       <w:pBdr>
         <w:bottom w:val="single" w:sz="4" w:space="4" w:color="4F81BD" w:themeColor="accent1"/>
@@ -13679,6 +14374,7 @@
     <w:basedOn w:val="DefaultParagraphFont"/>
     <w:link w:val="IntenseQuote"/>
     <w:uiPriority w:val="30"/>
+    <w:rsid w:val="00FC693F"/>
     <w:rPr>
       <w:b/>
       <w:bCs/>
@@ -13692,6 +14388,7 @@
     <w:basedOn w:val="DefaultParagraphFont"/>
     <w:uiPriority w:val="19"/>
     <w:qFormat/>
+    <w:rsid w:val="00FC693F"/>
     <w:rPr>
       <w:i/>
       <w:iCs/>
@@ -13703,6 +14400,7 @@
     <w:basedOn w:val="DefaultParagraphFont"/>
     <w:uiPriority w:val="21"/>
     <w:qFormat/>
+    <w:rsid w:val="00FC693F"/>
     <w:rPr>
       <w:b/>
       <w:bCs/>
@@ -13716,6 +14414,7 @@
     <w:basedOn w:val="DefaultParagraphFont"/>
     <w:uiPriority w:val="31"/>
     <w:qFormat/>
+    <w:rsid w:val="00FC693F"/>
     <w:rPr>
       <w:smallCaps/>
       <w:color w:val="C0504D" w:themeColor="accent2"/>
@@ -13727,6 +14426,7 @@
     <w:basedOn w:val="DefaultParagraphFont"/>
     <w:uiPriority w:val="32"/>
     <w:qFormat/>
+    <w:rsid w:val="00FC693F"/>
     <w:rPr>
       <w:b/>
       <w:bCs/>
@@ -13741,6 +14441,7 @@
     <w:basedOn w:val="DefaultParagraphFont"/>
     <w:uiPriority w:val="33"/>
     <w:qFormat/>
+    <w:rsid w:val="00FC693F"/>
     <w:rPr>
       <w:b/>
       <w:bCs/>
@@ -13756,6 +14457,7 @@
     <w:semiHidden/>
     <w:unhideWhenUsed/>
     <w:qFormat/>
+    <w:rsid w:val="00FC693F"/>
     <w:pPr>
       <w:outlineLvl w:val="9"/>
     </w:pPr>
@@ -13764,6 +14466,7 @@
     <w:name w:val="Table Grid"/>
     <w:basedOn w:val="TableNormal"/>
     <w:uiPriority w:val="59"/>
+    <w:rsid w:val="00FC693F"/>
     <w:pPr>
       <w:spacing w:after="0" w:line="240" w:lineRule="auto"/>
     </w:pPr>
@@ -13789,6 +14492,7 @@
     <w:name w:val="Light Shading"/>
     <w:basedOn w:val="TableNormal"/>
     <w:uiPriority w:val="60"/>
+    <w:rsid w:val="00FC693F"/>
     <w:pPr>
       <w:spacing w:after="0" w:line="240" w:lineRule="auto"/>
     </w:pPr>
@@ -13891,6 +14595,7 @@
     <w:name w:val="Light Shading Accent 1"/>
     <w:basedOn w:val="TableNormal"/>
     <w:uiPriority w:val="60"/>
+    <w:rsid w:val="00FC693F"/>
     <w:pPr>
       <w:spacing w:after="0" w:line="240" w:lineRule="auto"/>
     </w:pPr>
@@ -13993,6 +14698,7 @@
     <w:name w:val="Light Shading Accent 2"/>
     <w:basedOn w:val="TableNormal"/>
     <w:uiPriority w:val="60"/>
+    <w:rsid w:val="00FC693F"/>
     <w:pPr>
       <w:spacing w:after="0" w:line="240" w:lineRule="auto"/>
     </w:pPr>
@@ -14095,6 +14801,7 @@
     <w:name w:val="Light Shading Accent 3"/>
     <w:basedOn w:val="TableNormal"/>
     <w:uiPriority w:val="60"/>
+    <w:rsid w:val="00FC693F"/>
     <w:pPr>
       <w:spacing w:after="0" w:line="240" w:lineRule="auto"/>
     </w:pPr>
@@ -14197,6 +14904,7 @@
     <w:name w:val="Light Shading Accent 4"/>
     <w:basedOn w:val="TableNormal"/>
     <w:uiPriority w:val="60"/>
+    <w:rsid w:val="00FC693F"/>
     <w:pPr>
       <w:spacing w:after="0" w:line="240" w:lineRule="auto"/>
     </w:pPr>
@@ -14299,6 +15007,7 @@
     <w:name w:val="Light Shading Accent 5"/>
     <w:basedOn w:val="TableNormal"/>
     <w:uiPriority w:val="60"/>
+    <w:rsid w:val="00FC693F"/>
     <w:pPr>
       <w:spacing w:after="0" w:line="240" w:lineRule="auto"/>
     </w:pPr>
@@ -14401,6 +15110,7 @@
     <w:name w:val="Light Shading Accent 6"/>
     <w:basedOn w:val="TableNormal"/>
     <w:uiPriority w:val="60"/>
+    <w:rsid w:val="00FC693F"/>
     <w:pPr>
       <w:spacing w:after="0" w:line="240" w:lineRule="auto"/>
     </w:pPr>
@@ -14503,6 +15213,7 @@
     <w:name w:val="Light List"/>
     <w:basedOn w:val="TableNormal"/>
     <w:uiPriority w:val="61"/>
+    <w:rsid w:val="00FC693F"/>
     <w:pPr>
       <w:spacing w:after="0" w:line="240" w:lineRule="auto"/>
     </w:pPr>
@@ -14594,6 +15305,7 @@
     <w:name w:val="Light List Accent 1"/>
     <w:basedOn w:val="TableNormal"/>
     <w:uiPriority w:val="61"/>
+    <w:rsid w:val="00FC693F"/>
     <w:pPr>
       <w:spacing w:after="0" w:line="240" w:lineRule="auto"/>
     </w:pPr>
@@ -14685,6 +15397,7 @@
     <w:name w:val="Light List Accent 2"/>
     <w:basedOn w:val="TableNormal"/>
     <w:uiPriority w:val="61"/>
+    <w:rsid w:val="00CB0664"/>
     <w:pPr>
       <w:spacing w:after="0" w:line="240" w:lineRule="auto"/>
     </w:pPr>
@@ -14776,6 +15489,7 @@
     <w:name w:val="Light List Accent 3"/>
     <w:basedOn w:val="TableNormal"/>
     <w:uiPriority w:val="61"/>
+    <w:rsid w:val="00CB0664"/>
     <w:pPr>
       <w:spacing w:after="0" w:line="240" w:lineRule="auto"/>
     </w:pPr>
@@ -14867,6 +15581,7 @@
     <w:name w:val="Light List Accent 4"/>
     <w:basedOn w:val="TableNormal"/>
     <w:uiPriority w:val="61"/>
+    <w:rsid w:val="00CB0664"/>
     <w:pPr>
       <w:spacing w:after="0" w:line="240" w:lineRule="auto"/>
     </w:pPr>
@@ -14958,6 +15673,7 @@
     <w:name w:val="Light List Accent 5"/>
     <w:basedOn w:val="TableNormal"/>
     <w:uiPriority w:val="61"/>
+    <w:rsid w:val="00CB0664"/>
     <w:pPr>
       <w:spacing w:after="0" w:line="240" w:lineRule="auto"/>
     </w:pPr>
@@ -15049,6 +15765,7 @@
     <w:name w:val="Light List Accent 6"/>
     <w:basedOn w:val="TableNormal"/>
     <w:uiPriority w:val="61"/>
+    <w:rsid w:val="00CB0664"/>
     <w:pPr>
       <w:spacing w:after="0" w:line="240" w:lineRule="auto"/>
     </w:pPr>
@@ -15140,6 +15857,7 @@
     <w:name w:val="Light Grid"/>
     <w:basedOn w:val="TableNormal"/>
     <w:uiPriority w:val="62"/>
+    <w:rsid w:val="00CB0664"/>
     <w:pPr>
       <w:spacing w:after="0" w:line="240" w:lineRule="auto"/>
     </w:pPr>
@@ -15269,6 +15987,7 @@
     <w:name w:val="Light Grid Accent 1"/>
     <w:basedOn w:val="TableNormal"/>
     <w:uiPriority w:val="62"/>
+    <w:rsid w:val="00CB0664"/>
     <w:pPr>
       <w:spacing w:after="0" w:line="240" w:lineRule="auto"/>
     </w:pPr>
@@ -15398,6 +16117,7 @@
     <w:name w:val="Light Grid Accent 2"/>
     <w:basedOn w:val="TableNormal"/>
     <w:uiPriority w:val="62"/>
+    <w:rsid w:val="00CB0664"/>
     <w:pPr>
       <w:spacing w:after="0" w:line="240" w:lineRule="auto"/>
     </w:pPr>
@@ -15527,6 +16247,7 @@
     <w:name w:val="Light Grid Accent 3"/>
     <w:basedOn w:val="TableNormal"/>
     <w:uiPriority w:val="62"/>
+    <w:rsid w:val="00CB0664"/>
     <w:pPr>
       <w:spacing w:after="0" w:line="240" w:lineRule="auto"/>
     </w:pPr>
@@ -15656,6 +16377,7 @@
     <w:name w:val="Light Grid Accent 4"/>
     <w:basedOn w:val="TableNormal"/>
     <w:uiPriority w:val="62"/>
+    <w:rsid w:val="00CB0664"/>
     <w:pPr>
       <w:spacing w:after="0" w:line="240" w:lineRule="auto"/>
     </w:pPr>
@@ -15785,6 +16507,7 @@
     <w:name w:val="Light Grid Accent 5"/>
     <w:basedOn w:val="TableNormal"/>
     <w:uiPriority w:val="62"/>
+    <w:rsid w:val="00CB0664"/>
     <w:pPr>
       <w:spacing w:after="0" w:line="240" w:lineRule="auto"/>
     </w:pPr>
@@ -15914,6 +16637,7 @@
     <w:name w:val="Light Grid Accent 6"/>
     <w:basedOn w:val="TableNormal"/>
     <w:uiPriority w:val="62"/>
+    <w:rsid w:val="00CB0664"/>
     <w:pPr>
       <w:spacing w:after="0" w:line="240" w:lineRule="auto"/>
     </w:pPr>
@@ -16043,6 +16767,7 @@
     <w:name w:val="Medium Shading 1"/>
     <w:basedOn w:val="TableNormal"/>
     <w:uiPriority w:val="63"/>
+    <w:rsid w:val="00CB0664"/>
     <w:pPr>
       <w:spacing w:after="0" w:line="240" w:lineRule="auto"/>
     </w:pPr>
@@ -16148,6 +16873,7 @@
     <w:name w:val="Medium Shading 1 Accent 1"/>
     <w:basedOn w:val="TableNormal"/>
     <w:uiPriority w:val="63"/>
+    <w:rsid w:val="00CB0664"/>
     <w:pPr>
       <w:spacing w:after="0" w:line="240" w:lineRule="auto"/>
     </w:pPr>
@@ -16253,6 +16979,7 @@
     <w:name w:val="Medium Shading 1 Accent 2"/>
     <w:basedOn w:val="TableNormal"/>
     <w:uiPriority w:val="63"/>
+    <w:rsid w:val="00CB0664"/>
     <w:pPr>
       <w:spacing w:after="0" w:line="240" w:lineRule="auto"/>
     </w:pPr>
@@ -16358,6 +17085,7 @@
     <w:name w:val="Medium Shading 1 Accent 3"/>
     <w:basedOn w:val="TableNormal"/>
     <w:uiPriority w:val="63"/>
+    <w:rsid w:val="00CB0664"/>
     <w:pPr>
       <w:spacing w:after="0" w:line="240" w:lineRule="auto"/>
     </w:pPr>
@@ -16463,6 +17191,7 @@
     <w:name w:val="Medium Shading 1 Accent 4"/>
     <w:basedOn w:val="TableNormal"/>
     <w:uiPriority w:val="63"/>
+    <w:rsid w:val="00CB0664"/>
     <w:pPr>
       <w:spacing w:after="0" w:line="240" w:lineRule="auto"/>
     </w:pPr>
@@ -16568,6 +17297,7 @@
     <w:name w:val="Medium Shading 1 Accent 5"/>
     <w:basedOn w:val="TableNormal"/>
     <w:uiPriority w:val="63"/>
+    <w:rsid w:val="00CB0664"/>
     <w:pPr>
       <w:spacing w:after="0" w:line="240" w:lineRule="auto"/>
     </w:pPr>
@@ -16673,6 +17403,7 @@
     <w:name w:val="Medium Shading 1 Accent 6"/>
     <w:basedOn w:val="TableNormal"/>
     <w:uiPriority w:val="63"/>
+    <w:rsid w:val="00CB0664"/>
     <w:pPr>
       <w:spacing w:after="0" w:line="240" w:lineRule="auto"/>
     </w:pPr>
@@ -16778,6 +17509,7 @@
     <w:name w:val="Medium Shading 2"/>
     <w:basedOn w:val="TableNormal"/>
     <w:uiPriority w:val="64"/>
+    <w:rsid w:val="00CB0664"/>
     <w:pPr>
       <w:spacing w:after="0" w:line="240" w:lineRule="auto"/>
     </w:pPr>
@@ -16926,6 +17658,7 @@
     <w:name w:val="Medium Shading 2 Accent 1"/>
     <w:basedOn w:val="TableNormal"/>
     <w:uiPriority w:val="64"/>
+    <w:rsid w:val="00CB0664"/>
     <w:pPr>
       <w:spacing w:after="0" w:line="240" w:lineRule="auto"/>
     </w:pPr>
@@ -17074,6 +17807,7 @@
     <w:name w:val="Medium Shading 2 Accent 2"/>
     <w:basedOn w:val="TableNormal"/>
     <w:uiPriority w:val="64"/>
+    <w:rsid w:val="00CB0664"/>
     <w:pPr>
       <w:spacing w:after="0" w:line="240" w:lineRule="auto"/>
     </w:pPr>
@@ -17222,6 +17956,7 @@
     <w:name w:val="Medium Shading 2 Accent 3"/>
     <w:basedOn w:val="TableNormal"/>
     <w:uiPriority w:val="64"/>
+    <w:rsid w:val="00CB0664"/>
     <w:pPr>
       <w:spacing w:after="0" w:line="240" w:lineRule="auto"/>
     </w:pPr>
@@ -17370,6 +18105,7 @@
     <w:name w:val="Medium Shading 2 Accent 4"/>
     <w:basedOn w:val="TableNormal"/>
     <w:uiPriority w:val="64"/>
+    <w:rsid w:val="00CB0664"/>
     <w:pPr>
       <w:spacing w:after="0" w:line="240" w:lineRule="auto"/>
     </w:pPr>
@@ -17518,6 +18254,7 @@
     <w:name w:val="Medium Shading 2 Accent 5"/>
     <w:basedOn w:val="TableNormal"/>
     <w:uiPriority w:val="64"/>
+    <w:rsid w:val="00CB0664"/>
     <w:pPr>
       <w:spacing w:after="0" w:line="240" w:lineRule="auto"/>
     </w:pPr>
@@ -17666,6 +18403,7 @@
     <w:name w:val="Medium Shading 2 Accent 6"/>
     <w:basedOn w:val="TableNormal"/>
     <w:uiPriority w:val="64"/>
+    <w:rsid w:val="00CB0664"/>
     <w:pPr>
       <w:spacing w:after="0" w:line="240" w:lineRule="auto"/>
     </w:pPr>
@@ -17814,6 +18552,7 @@
     <w:name w:val="Medium List 1"/>
     <w:basedOn w:val="TableNormal"/>
     <w:uiPriority w:val="65"/>
+    <w:rsid w:val="00CB0664"/>
     <w:pPr>
       <w:spacing w:after="0" w:line="240" w:lineRule="auto"/>
     </w:pPr>
@@ -17897,6 +18636,7 @@
     <w:name w:val="Medium List 1 Accent 1"/>
     <w:basedOn w:val="TableNormal"/>
     <w:uiPriority w:val="65"/>
+    <w:rsid w:val="00CB0664"/>
     <w:pPr>
       <w:spacing w:after="0" w:line="240" w:lineRule="auto"/>
     </w:pPr>
@@ -17980,6 +18720,7 @@
     <w:name w:val="Medium List 1 Accent 2"/>
     <w:basedOn w:val="TableNormal"/>
     <w:uiPriority w:val="65"/>
+    <w:rsid w:val="00CB0664"/>
     <w:pPr>
       <w:spacing w:after="0" w:line="240" w:lineRule="auto"/>
     </w:pPr>
@@ -18063,6 +18804,7 @@
     <w:name w:val="Medium List 1 Accent 3"/>
     <w:basedOn w:val="TableNormal"/>
     <w:uiPriority w:val="65"/>
+    <w:rsid w:val="00CB0664"/>
     <w:pPr>
       <w:spacing w:after="0" w:line="240" w:lineRule="auto"/>
     </w:pPr>
@@ -18146,6 +18888,7 @@
     <w:name w:val="Medium List 1 Accent 4"/>
     <w:basedOn w:val="TableNormal"/>
     <w:uiPriority w:val="65"/>
+    <w:rsid w:val="00CB0664"/>
     <w:pPr>
       <w:spacing w:after="0" w:line="240" w:lineRule="auto"/>
     </w:pPr>
@@ -18229,6 +18972,7 @@
     <w:name w:val="Medium List 1 Accent 5"/>
     <w:basedOn w:val="TableNormal"/>
     <w:uiPriority w:val="65"/>
+    <w:rsid w:val="00CB0664"/>
     <w:pPr>
       <w:spacing w:after="0" w:line="240" w:lineRule="auto"/>
     </w:pPr>
@@ -18312,6 +19056,7 @@
     <w:name w:val="Medium List 1 Accent 6"/>
     <w:basedOn w:val="TableNormal"/>
     <w:uiPriority w:val="65"/>
+    <w:rsid w:val="00CB0664"/>
     <w:pPr>
       <w:spacing w:after="0" w:line="240" w:lineRule="auto"/>
     </w:pPr>
@@ -18395,6 +19140,7 @@
     <w:name w:val="Medium List 2"/>
     <w:basedOn w:val="TableNormal"/>
     <w:uiPriority w:val="66"/>
+    <w:rsid w:val="00CB0664"/>
     <w:pPr>
       <w:spacing w:after="0" w:line="240" w:lineRule="auto"/>
     </w:pPr>
@@ -18522,6 +19268,7 @@
     <w:name w:val="Medium List 2 Accent 1"/>
     <w:basedOn w:val="TableNormal"/>
     <w:uiPriority w:val="66"/>
+    <w:rsid w:val="00CB0664"/>
     <w:pPr>
       <w:spacing w:after="0" w:line="240" w:lineRule="auto"/>
     </w:pPr>
@@ -18649,6 +19396,7 @@
     <w:name w:val="Medium List 2 Accent 2"/>
     <w:basedOn w:val="TableNormal"/>
     <w:uiPriority w:val="66"/>
+    <w:rsid w:val="00CB0664"/>
     <w:pPr>
       <w:spacing w:after="0" w:line="240" w:lineRule="auto"/>
     </w:pPr>
@@ -18776,6 +19524,7 @@
     <w:name w:val="Medium List 2 Accent 3"/>
     <w:basedOn w:val="TableNormal"/>
     <w:uiPriority w:val="66"/>
+    <w:rsid w:val="00CB0664"/>
     <w:pPr>
       <w:spacing w:after="0" w:line="240" w:lineRule="auto"/>
     </w:pPr>
@@ -18903,6 +19652,7 @@
     <w:name w:val="Medium List 2 Accent 4"/>
     <w:basedOn w:val="TableNormal"/>
     <w:uiPriority w:val="66"/>
+    <w:rsid w:val="00CB0664"/>
     <w:pPr>
       <w:spacing w:after="0" w:line="240" w:lineRule="auto"/>
     </w:pPr>
@@ -19030,6 +19780,7 @@
     <w:name w:val="Medium List 2 Accent 5"/>
     <w:basedOn w:val="TableNormal"/>
     <w:uiPriority w:val="66"/>
+    <w:rsid w:val="00CB0664"/>
     <w:pPr>
       <w:spacing w:after="0" w:line="240" w:lineRule="auto"/>
     </w:pPr>
@@ -19157,6 +19908,7 @@
     <w:name w:val="Medium List 2 Accent 6"/>
     <w:basedOn w:val="TableNormal"/>
     <w:uiPriority w:val="66"/>
+    <w:rsid w:val="00CB0664"/>
     <w:pPr>
       <w:spacing w:after="0" w:line="240" w:lineRule="auto"/>
     </w:pPr>
@@ -19284,6 +20036,7 @@
     <w:name w:val="Medium Grid 1"/>
     <w:basedOn w:val="TableNormal"/>
     <w:uiPriority w:val="67"/>
+    <w:rsid w:val="00CB0664"/>
     <w:pPr>
       <w:spacing w:after="0" w:line="240" w:lineRule="auto"/>
     </w:pPr>
@@ -19356,6 +20109,7 @@
     <w:name w:val="Medium Grid 1 Accent 1"/>
     <w:basedOn w:val="TableNormal"/>
     <w:uiPriority w:val="67"/>
+    <w:rsid w:val="00CB0664"/>
     <w:pPr>
       <w:spacing w:after="0" w:line="240" w:lineRule="auto"/>
     </w:pPr>
@@ -19428,6 +20182,7 @@
     <w:name w:val="Medium Grid 1 Accent 2"/>
     <w:basedOn w:val="TableNormal"/>
     <w:uiPriority w:val="67"/>
+    <w:rsid w:val="00CB0664"/>
     <w:pPr>
       <w:spacing w:after="0" w:line="240" w:lineRule="auto"/>
     </w:pPr>
@@ -19500,6 +20255,7 @@
     <w:name w:val="Medium Grid 1 Accent 3"/>
     <w:basedOn w:val="TableNormal"/>
     <w:uiPriority w:val="67"/>
+    <w:rsid w:val="00CB0664"/>
     <w:pPr>
       <w:spacing w:after="0" w:line="240" w:lineRule="auto"/>
     </w:pPr>
@@ -19572,6 +20328,7 @@
     <w:name w:val="Medium Grid 1 Accent 4"/>
     <w:basedOn w:val="TableNormal"/>
     <w:uiPriority w:val="67"/>
+    <w:rsid w:val="00CB0664"/>
     <w:pPr>
       <w:spacing w:after="0" w:line="240" w:lineRule="auto"/>
     </w:pPr>
@@ -19644,6 +20401,7 @@
     <w:name w:val="Medium Grid 1 Accent 5"/>
     <w:basedOn w:val="TableNormal"/>
     <w:uiPriority w:val="67"/>
+    <w:rsid w:val="00CB0664"/>
     <w:pPr>
       <w:spacing w:after="0" w:line="240" w:lineRule="auto"/>
     </w:pPr>
@@ -19716,6 +20474,7 @@
     <w:name w:val="Medium Grid 1 Accent 6"/>
     <w:basedOn w:val="TableNormal"/>
     <w:uiPriority w:val="67"/>
+    <w:rsid w:val="00CB0664"/>
     <w:pPr>
       <w:spacing w:after="0" w:line="240" w:lineRule="auto"/>
     </w:pPr>
@@ -19788,6 +20547,7 @@
     <w:name w:val="Medium Grid 2"/>
     <w:basedOn w:val="TableNormal"/>
     <w:uiPriority w:val="68"/>
+    <w:rsid w:val="00CB0664"/>
     <w:pPr>
       <w:spacing w:after="0" w:line="240" w:lineRule="auto"/>
     </w:pPr>
@@ -19912,6 +20672,7 @@
     <w:name w:val="Medium Grid 2 Accent 1"/>
     <w:basedOn w:val="TableNormal"/>
     <w:uiPriority w:val="68"/>
+    <w:rsid w:val="00CB0664"/>
     <w:pPr>
       <w:spacing w:after="0" w:line="240" w:lineRule="auto"/>
     </w:pPr>
@@ -20036,6 +20797,7 @@
     <w:name w:val="Medium Grid 2 Accent 2"/>
     <w:basedOn w:val="TableNormal"/>
     <w:uiPriority w:val="68"/>
+    <w:rsid w:val="00CB0664"/>
     <w:pPr>
       <w:spacing w:after="0" w:line="240" w:lineRule="auto"/>
     </w:pPr>
@@ -20160,6 +20922,7 @@
     <w:name w:val="Medium Grid 2 Accent 3"/>
     <w:basedOn w:val="TableNormal"/>
     <w:uiPriority w:val="68"/>
+    <w:rsid w:val="00CB0664"/>
     <w:pPr>
       <w:spacing w:after="0" w:line="240" w:lineRule="auto"/>
     </w:pPr>
@@ -20284,6 +21047,7 @@
     <w:name w:val="Medium Grid 2 Accent 4"/>
     <w:basedOn w:val="TableNormal"/>
     <w:uiPriority w:val="68"/>
+    <w:rsid w:val="00CB0664"/>
     <w:pPr>
       <w:spacing w:after="0" w:line="240" w:lineRule="auto"/>
     </w:pPr>
@@ -20408,6 +21172,7 @@
     <w:name w:val="Medium Grid 2 Accent 5"/>
     <w:basedOn w:val="TableNormal"/>
     <w:uiPriority w:val="68"/>
+    <w:rsid w:val="00CB0664"/>
     <w:pPr>
       <w:spacing w:after="0" w:line="240" w:lineRule="auto"/>
     </w:pPr>
@@ -20532,6 +21297,7 @@
     <w:name w:val="Medium Grid 2 Accent 6"/>
     <w:basedOn w:val="TableNormal"/>
     <w:uiPriority w:val="68"/>
+    <w:rsid w:val="00CB0664"/>
     <w:pPr>
       <w:spacing w:after="0" w:line="240" w:lineRule="auto"/>
     </w:pPr>
@@ -20656,6 +21422,7 @@
     <w:name w:val="Medium Grid 3"/>
     <w:basedOn w:val="TableNormal"/>
     <w:uiPriority w:val="69"/>
+    <w:rsid w:val="00CB0664"/>
     <w:pPr>
       <w:spacing w:after="0" w:line="240" w:lineRule="auto"/>
     </w:pPr>
@@ -20796,6 +21563,7 @@
     <w:name w:val="Medium Grid 3 Accent 1"/>
     <w:basedOn w:val="TableNormal"/>
     <w:uiPriority w:val="69"/>
+    <w:rsid w:val="00CB0664"/>
     <w:pPr>
       <w:spacing w:after="0" w:line="240" w:lineRule="auto"/>
     </w:pPr>
@@ -20936,6 +21704,7 @@
     <w:name w:val="Medium Grid 3 Accent 2"/>
     <w:basedOn w:val="TableNormal"/>
     <w:uiPriority w:val="69"/>
+    <w:rsid w:val="00CB0664"/>
     <w:pPr>
       <w:spacing w:after="0" w:line="240" w:lineRule="auto"/>
     </w:pPr>
@@ -21076,6 +21845,7 @@
     <w:name w:val="Medium Grid 3 Accent 3"/>
     <w:basedOn w:val="TableNormal"/>
     <w:uiPriority w:val="69"/>
+    <w:rsid w:val="00CB0664"/>
     <w:pPr>
       <w:spacing w:after="0" w:line="240" w:lineRule="auto"/>
     </w:pPr>
@@ -21216,6 +21986,7 @@
     <w:name w:val="Medium Grid 3 Accent 4"/>
     <w:basedOn w:val="TableNormal"/>
     <w:uiPriority w:val="69"/>
+    <w:rsid w:val="00CB0664"/>
     <w:pPr>
       <w:spacing w:after="0" w:line="240" w:lineRule="auto"/>
     </w:pPr>
@@ -21356,6 +22127,7 @@
     <w:name w:val="Medium Grid 3 Accent 5"/>
     <w:basedOn w:val="TableNormal"/>
     <w:uiPriority w:val="69"/>
+    <w:rsid w:val="00CB0664"/>
     <w:pPr>
       <w:spacing w:after="0" w:line="240" w:lineRule="auto"/>
     </w:pPr>
@@ -21496,6 +22268,7 @@
     <w:name w:val="Medium Grid 3 Accent 6"/>
     <w:basedOn w:val="TableNormal"/>
     <w:uiPriority w:val="69"/>
+    <w:rsid w:val="00CB0664"/>
     <w:pPr>
       <w:spacing w:after="0" w:line="240" w:lineRule="auto"/>
     </w:pPr>
@@ -21636,6 +22409,7 @@
     <w:name w:val="Dark List"/>
     <w:basedOn w:val="TableNormal"/>
     <w:uiPriority w:val="70"/>
+    <w:rsid w:val="00CB0664"/>
     <w:pPr>
       <w:spacing w:after="0" w:line="240" w:lineRule="auto"/>
     </w:pPr>
@@ -21749,6 +22523,7 @@
     <w:name w:val="Dark List Accent 1"/>
     <w:basedOn w:val="TableNormal"/>
     <w:uiPriority w:val="70"/>
+    <w:rsid w:val="00CB0664"/>
     <w:pPr>
       <w:spacing w:after="0" w:line="240" w:lineRule="auto"/>
     </w:pPr>
@@ -21862,6 +22637,7 @@
     <w:name w:val="Dark List Accent 2"/>
     <w:basedOn w:val="TableNormal"/>
     <w:uiPriority w:val="70"/>
+    <w:rsid w:val="00CB0664"/>
     <w:pPr>
       <w:spacing w:after="0" w:line="240" w:lineRule="auto"/>
     </w:pPr>
@@ -21975,6 +22751,7 @@
     <w:name w:val="Dark List Accent 3"/>
     <w:basedOn w:val="TableNormal"/>
     <w:uiPriority w:val="70"/>
+    <w:rsid w:val="00CB0664"/>
     <w:pPr>
       <w:spacing w:after="0" w:line="240" w:lineRule="auto"/>
     </w:pPr>
@@ -22088,6 +22865,7 @@
     <w:name w:val="Dark List Accent 4"/>
     <w:basedOn w:val="TableNormal"/>
     <w:uiPriority w:val="70"/>
+    <w:rsid w:val="00CB0664"/>
     <w:pPr>
       <w:spacing w:after="0" w:line="240" w:lineRule="auto"/>
     </w:pPr>
@@ -22201,6 +22979,7 @@
     <w:name w:val="Dark List Accent 5"/>
     <w:basedOn w:val="TableNormal"/>
     <w:uiPriority w:val="70"/>
+    <w:rsid w:val="00CB0664"/>
     <w:pPr>
       <w:spacing w:after="0" w:line="240" w:lineRule="auto"/>
     </w:pPr>
@@ -22314,6 +23093,7 @@
     <w:name w:val="Dark List Accent 6"/>
     <w:basedOn w:val="TableNormal"/>
     <w:uiPriority w:val="70"/>
+    <w:rsid w:val="00CB0664"/>
     <w:pPr>
       <w:spacing w:after="0" w:line="240" w:lineRule="auto"/>
     </w:pPr>
@@ -22427,6 +23207,7 @@
     <w:name w:val="Colorful Shading"/>
     <w:basedOn w:val="TableNormal"/>
     <w:uiPriority w:val="71"/>
+    <w:rsid w:val="00CB0664"/>
     <w:pPr>
       <w:spacing w:after="0" w:line="240" w:lineRule="auto"/>
     </w:pPr>
@@ -22548,6 +23329,7 @@
     <w:name w:val="Colorful Shading Accent 1"/>
     <w:basedOn w:val="TableNormal"/>
     <w:uiPriority w:val="71"/>
+    <w:rsid w:val="00CB0664"/>
     <w:pPr>
       <w:spacing w:after="0" w:line="240" w:lineRule="auto"/>
     </w:pPr>
@@ -22669,6 +23451,7 @@
     <w:name w:val="Colorful Shading Accent 2"/>
     <w:basedOn w:val="TableNormal"/>
     <w:uiPriority w:val="71"/>
+    <w:rsid w:val="00CB0664"/>
     <w:pPr>
       <w:spacing w:after="0" w:line="240" w:lineRule="auto"/>
     </w:pPr>
@@ -22790,6 +23573,7 @@
     <w:name w:val="Colorful Shading Accent 3"/>
     <w:basedOn w:val="TableNormal"/>
     <w:uiPriority w:val="71"/>
+    <w:rsid w:val="00CB0664"/>
     <w:pPr>
       <w:spacing w:after="0" w:line="240" w:lineRule="auto"/>
     </w:pPr>
@@ -22901,6 +23685,7 @@
     <w:name w:val="Colorful Shading Accent 4"/>
     <w:basedOn w:val="TableNormal"/>
     <w:uiPriority w:val="71"/>
+    <w:rsid w:val="00CB0664"/>
     <w:pPr>
       <w:spacing w:after="0" w:line="240" w:lineRule="auto"/>
     </w:pPr>
@@ -23022,6 +23807,7 @@
     <w:name w:val="Colorful Shading Accent 5"/>
     <w:basedOn w:val="TableNormal"/>
     <w:uiPriority w:val="71"/>
+    <w:rsid w:val="00CB0664"/>
     <w:pPr>
       <w:spacing w:after="0" w:line="240" w:lineRule="auto"/>
     </w:pPr>
@@ -23143,6 +23929,7 @@
     <w:name w:val="Colorful Shading Accent 6"/>
     <w:basedOn w:val="TableNormal"/>
     <w:uiPriority w:val="71"/>
+    <w:rsid w:val="00CB0664"/>
     <w:pPr>
       <w:spacing w:after="0" w:line="240" w:lineRule="auto"/>
     </w:pPr>
@@ -23264,6 +24051,7 @@
     <w:name w:val="Colorful List"/>
     <w:basedOn w:val="TableNormal"/>
     <w:uiPriority w:val="72"/>
+    <w:rsid w:val="00CB0664"/>
     <w:pPr>
       <w:spacing w:after="0" w:line="240" w:lineRule="auto"/>
     </w:pPr>
@@ -23349,6 +24137,7 @@
     <w:name w:val="Colorful List Accent 1"/>
     <w:basedOn w:val="TableNormal"/>
     <w:uiPriority w:val="72"/>
+    <w:rsid w:val="00CB0664"/>
     <w:pPr>
       <w:spacing w:after="0" w:line="240" w:lineRule="auto"/>
     </w:pPr>
@@ -23434,6 +24223,7 @@
     <w:name w:val="Colorful List Accent 2"/>
     <w:basedOn w:val="TableNormal"/>
     <w:uiPriority w:val="72"/>
+    <w:rsid w:val="00CB0664"/>
     <w:pPr>
       <w:spacing w:after="0" w:line="240" w:lineRule="auto"/>
     </w:pPr>
@@ -23519,6 +24309,7 @@
     <w:name w:val="Colorful List Accent 3"/>
     <w:basedOn w:val="TableNormal"/>
     <w:uiPriority w:val="72"/>
+    <w:rsid w:val="00CB0664"/>
     <w:pPr>
       <w:spacing w:after="0" w:line="240" w:lineRule="auto"/>
     </w:pPr>
@@ -23604,6 +24395,7 @@
     <w:name w:val="Colorful List Accent 4"/>
     <w:basedOn w:val="TableNormal"/>
     <w:uiPriority w:val="72"/>
+    <w:rsid w:val="00CB0664"/>
     <w:pPr>
       <w:spacing w:after="0" w:line="240" w:lineRule="auto"/>
     </w:pPr>
@@ -23689,6 +24481,7 @@
     <w:name w:val="Colorful List Accent 5"/>
     <w:basedOn w:val="TableNormal"/>
     <w:uiPriority w:val="72"/>
+    <w:rsid w:val="00CB0664"/>
     <w:pPr>
       <w:spacing w:after="0" w:line="240" w:lineRule="auto"/>
     </w:pPr>
@@ -23774,6 +24567,7 @@
     <w:name w:val="Colorful List Accent 6"/>
     <w:basedOn w:val="TableNormal"/>
     <w:uiPriority w:val="72"/>
+    <w:rsid w:val="00CB0664"/>
     <w:pPr>
       <w:spacing w:after="0" w:line="240" w:lineRule="auto"/>
     </w:pPr>
@@ -23859,6 +24653,7 @@
     <w:name w:val="Colorful Grid"/>
     <w:basedOn w:val="TableNormal"/>
     <w:uiPriority w:val="73"/>
+    <w:rsid w:val="00CB0664"/>
     <w:pPr>
       <w:spacing w:after="0" w:line="240" w:lineRule="auto"/>
     </w:pPr>
@@ -23938,6 +24733,7 @@
     <w:name w:val="Colorful Grid Accent 1"/>
     <w:basedOn w:val="TableNormal"/>
     <w:uiPriority w:val="73"/>
+    <w:rsid w:val="00CB0664"/>
     <w:pPr>
       <w:spacing w:after="0" w:line="240" w:lineRule="auto"/>
     </w:pPr>
@@ -24017,6 +24813,7 @@
     <w:name w:val="Colorful Grid Accent 2"/>
     <w:basedOn w:val="TableNormal"/>
     <w:uiPriority w:val="73"/>
+    <w:rsid w:val="00CB0664"/>
     <w:pPr>
       <w:spacing w:after="0" w:line="240" w:lineRule="auto"/>
     </w:pPr>
@@ -24096,6 +24893,7 @@
     <w:name w:val="Colorful Grid Accent 3"/>
     <w:basedOn w:val="TableNormal"/>
     <w:uiPriority w:val="73"/>
+    <w:rsid w:val="00CB0664"/>
     <w:pPr>
       <w:spacing w:after="0" w:line="240" w:lineRule="auto"/>
     </w:pPr>
@@ -24175,6 +24973,7 @@
     <w:name w:val="Colorful Grid Accent 4"/>
     <w:basedOn w:val="TableNormal"/>
     <w:uiPriority w:val="73"/>
+    <w:rsid w:val="00CB0664"/>
     <w:pPr>
       <w:spacing w:after="0" w:line="240" w:lineRule="auto"/>
     </w:pPr>
@@ -24254,6 +25053,7 @@
     <w:name w:val="Colorful Grid Accent 5"/>
     <w:basedOn w:val="TableNormal"/>
     <w:uiPriority w:val="73"/>
+    <w:rsid w:val="00CB0664"/>
     <w:pPr>
       <w:spacing w:after="0" w:line="240" w:lineRule="auto"/>
     </w:pPr>
@@ -24333,6 +25133,7 @@
     <w:name w:val="Colorful Grid Accent 6"/>
     <w:basedOn w:val="TableNormal"/>
     <w:uiPriority w:val="73"/>
+    <w:rsid w:val="00CB0664"/>
     <w:pPr>
       <w:spacing w:after="0" w:line="240" w:lineRule="auto"/>
     </w:pPr>

</xml_diff>